<commit_message>
docs: CCG 3-AI 점검 결과 DEV_LOG 기록 + docx 변환
Co-Authored-By: Claude Opus 4.6 (1M context) <noreply@anthropic.com>
</commit_message>
<xml_diff>
--- a/docs/exports/DEV_LOG.docx
+++ b/docs/exports/DEV_LOG.docx
@@ -2,7 +2,7 @@
 <file path=word/document.xml><?xml version="1.0" encoding="utf-8"?>
 <w:document xmlns:w="http://schemas.openxmlformats.org/wordprocessingml/2006/main" xmlns:m="http://schemas.openxmlformats.org/officeDocument/2006/math" xmlns:r="http://schemas.openxmlformats.org/officeDocument/2006/relationships" xmlns:o="urn:schemas-microsoft-com:office:office" xmlns:v="urn:schemas-microsoft-com:vml" xmlns:w10="urn:schemas-microsoft-com:office:word" xmlns:a="http://schemas.openxmlformats.org/drawingml/2006/main" xmlns:pic="http://schemas.openxmlformats.org/drawingml/2006/picture" xmlns:wp="http://schemas.openxmlformats.org/drawingml/2006/wordprocessingDrawing">
   <w:body>
-    <w:bookmarkStart w:id="20" w:name="개발-작업-기록-development-log"/>
+    <w:bookmarkStart w:id="21" w:name="개발-작업-기록-development-log"/>
     <w:p>
       <w:pPr>
         <w:pStyle w:val="Heading1"/>
@@ -26,12 +26,158 @@
         </w:pict>
       </w:r>
     </w:p>
+    <w:bookmarkStart w:id="20" w:name="ccg-3-ai-전체-기능-점검-critical-이슈-6건-수정"/>
+    <w:p>
+      <w:pPr>
+        <w:pStyle w:val="Heading3"/>
+      </w:pPr>
+      <w:r>
+        <w:t xml:space="preserve">[2026-04-19 15:00] CCG 3-AI 전체 기능 점검 — Critical 이슈 6건 수정</w:t>
+      </w:r>
+    </w:p>
     <w:p>
       <w:pPr>
         <w:pStyle w:val="FirstParagraph"/>
       </w:pPr>
       <w:r>
-        <w:t xml:space="preserve">[2026-04-16 08:40] 마스터 로그인 시 한국어 모드 안 되던 문제 수정</w:t>
+        <w:t xml:space="preserve">서비스 시작에 맞춰 Claude+Codex+Gemini 3개 AI로 전체 기능을 점검하고, 발견된 Critical 이슈 6건을 수정했습니다.</w:t>
+      </w:r>
+    </w:p>
+    <w:p>
+      <w:pPr>
+        <w:numPr>
+          <w:ilvl w:val="0"/>
+          <w:numId w:val="1001"/>
+        </w:numPr>
+        <w:pStyle w:val="Compact"/>
+      </w:pPr>
+      <w:r>
+        <w:rPr>
+          <w:bCs/>
+          <w:b/>
+        </w:rPr>
+        <w:t xml:space="preserve">회원가입 작동 안 됨 수정</w:t>
+      </w:r>
+      <w:r>
+        <w:t xml:space="preserve">: 가입 버튼을 눌러도 실제 계정이 안 만들어지던 문제를 고침</w:t>
+      </w:r>
+    </w:p>
+    <w:p>
+      <w:pPr>
+        <w:numPr>
+          <w:ilvl w:val="0"/>
+          <w:numId w:val="1001"/>
+        </w:numPr>
+        <w:pStyle w:val="Compact"/>
+      </w:pPr>
+      <w:r>
+        <w:rPr>
+          <w:bCs/>
+          <w:b/>
+        </w:rPr>
+        <w:t xml:space="preserve">댓글 삭제 보안 강화</w:t>
+      </w:r>
+      <w:r>
+        <w:t xml:space="preserve">: 다른 사람 댓글을 삭제할 수 있던 보안 구멍을 막음</w:t>
+      </w:r>
+    </w:p>
+    <w:p>
+      <w:pPr>
+        <w:numPr>
+          <w:ilvl w:val="0"/>
+          <w:numId w:val="1001"/>
+        </w:numPr>
+        <w:pStyle w:val="Compact"/>
+      </w:pPr>
+      <w:r>
+        <w:rPr>
+          <w:bCs/>
+          <w:b/>
+        </w:rPr>
+        <w:t xml:space="preserve">관리자 페이지 보안</w:t>
+      </w:r>
+      <w:r>
+        <w:t xml:space="preserve">: /admin 주소로 직접 접근하면 차단되도록 수정</w:t>
+      </w:r>
+    </w:p>
+    <w:p>
+      <w:pPr>
+        <w:numPr>
+          <w:ilvl w:val="0"/>
+          <w:numId w:val="1001"/>
+        </w:numPr>
+        <w:pStyle w:val="Compact"/>
+      </w:pPr>
+      <w:r>
+        <w:rPr>
+          <w:bCs/>
+          <w:b/>
+        </w:rPr>
+        <w:t xml:space="preserve">구글 로그인 후 언어 유지</w:t>
+      </w:r>
+      <w:r>
+        <w:t xml:space="preserve">: 구글 로그인 후 항상 영어 페이지로 가던 문제를 고침 (사용자가 보던 언어로 돌아감)</w:t>
+      </w:r>
+    </w:p>
+    <w:p>
+      <w:pPr>
+        <w:numPr>
+          <w:ilvl w:val="0"/>
+          <w:numId w:val="1001"/>
+        </w:numPr>
+        <w:pStyle w:val="Compact"/>
+      </w:pPr>
+      <w:r>
+        <w:rPr>
+          <w:bCs/>
+          <w:b/>
+        </w:rPr>
+        <w:t xml:space="preserve">사이트맵 확장</w:t>
+      </w:r>
+      <w:r>
+        <w:t xml:space="preserve">: 검색엔진에 노출되는 페이지를 5개에서 21개로 늘림, 한국어 페이지도 추가</w:t>
+      </w:r>
+    </w:p>
+    <w:p>
+      <w:pPr>
+        <w:numPr>
+          <w:ilvl w:val="0"/>
+          <w:numId w:val="1001"/>
+        </w:numPr>
+        <w:pStyle w:val="Compact"/>
+      </w:pPr>
+      <w:r>
+        <w:rPr>
+          <w:bCs/>
+          <w:b/>
+        </w:rPr>
+        <w:t xml:space="preserve">8개 언어 번역 보완</w:t>
+      </w:r>
+      <w:r>
+        <w:t xml:space="preserve">: 알림, FAQ, 홈페이지 배너 등의 번역이 빠져있던 부분을 모두 채움</w:t>
+      </w:r>
+    </w:p>
+    <w:p>
+      <w:pPr>
+        <w:pStyle w:val="FirstParagraph"/>
+      </w:pPr>
+      <w:r>
+        <w:t xml:space="preserve">상태: [완료]</w:t>
+      </w:r>
+    </w:p>
+    <w:p>
+      <w:r>
+        <w:pict>
+          <v:rect style="width:0;height:1.5pt" o:hralign="center" o:hrstd="t" o:hr="t"/>
+        </w:pict>
+      </w:r>
+    </w:p>
+    <w:p>
+      <w:pPr>
+        <w:pStyle w:val="FirstParagraph"/>
+      </w:pPr>
+      <w:r>
+        <w:t xml:space="preserve">[2026-04-16 08:40] 마스터 로그인 시 한국어 모드 안 되던 문��� 수정</w:t>
       </w:r>
     </w:p>
     <w:p>
@@ -2054,6 +2200,7 @@
       </w:r>
     </w:p>
     <w:bookmarkEnd w:id="20"/>
+    <w:bookmarkEnd w:id="21"/>
     <w:sectPr/>
   </w:body>
 </w:document>
@@ -2160,8 +2307,87 @@
       </w:pPr>
     </w:lvl>
   </w:abstractNum>
+  <w:abstractNum w:abstractNumId="991">
+    <w:nsid w:val="A991"/>
+    <w:multiLevelType w:val="multilevel"/>
+    <w:lvl w:ilvl="0">
+      <w:numFmt w:val="bullet"/>
+      <w:lvlText w:val="•"/>
+      <w:lvlJc w:val="left"/>
+      <w:pPr>
+        <w:ind w:left="720" w:hanging="480"/>
+      </w:pPr>
+    </w:lvl>
+    <w:lvl w:ilvl="1">
+      <w:numFmt w:val="bullet"/>
+      <w:lvlText w:val="–"/>
+      <w:lvlJc w:val="left"/>
+      <w:pPr>
+        <w:ind w:left="1440" w:hanging="480"/>
+      </w:pPr>
+    </w:lvl>
+    <w:lvl w:ilvl="2">
+      <w:numFmt w:val="bullet"/>
+      <w:lvlText w:val="•"/>
+      <w:lvlJc w:val="left"/>
+      <w:pPr>
+        <w:ind w:left="2160" w:hanging="480"/>
+      </w:pPr>
+    </w:lvl>
+    <w:lvl w:ilvl="3">
+      <w:numFmt w:val="bullet"/>
+      <w:lvlText w:val="–"/>
+      <w:lvlJc w:val="left"/>
+      <w:pPr>
+        <w:ind w:left="2880" w:hanging="480"/>
+      </w:pPr>
+    </w:lvl>
+    <w:lvl w:ilvl="4">
+      <w:numFmt w:val="bullet"/>
+      <w:lvlText w:val="•"/>
+      <w:lvlJc w:val="left"/>
+      <w:pPr>
+        <w:ind w:left="3600" w:hanging="480"/>
+      </w:pPr>
+    </w:lvl>
+    <w:lvl w:ilvl="5">
+      <w:numFmt w:val="bullet"/>
+      <w:lvlText w:val="–"/>
+      <w:lvlJc w:val="left"/>
+      <w:pPr>
+        <w:ind w:left="4320" w:hanging="480"/>
+      </w:pPr>
+    </w:lvl>
+    <w:lvl w:ilvl="6">
+      <w:numFmt w:val="bullet"/>
+      <w:lvlText w:val="•"/>
+      <w:lvlJc w:val="left"/>
+      <w:pPr>
+        <w:ind w:left="5040" w:hanging="480"/>
+      </w:pPr>
+    </w:lvl>
+    <w:lvl w:ilvl="7">
+      <w:numFmt w:val="bullet"/>
+      <w:lvlText w:val="–"/>
+      <w:lvlJc w:val="left"/>
+      <w:pPr>
+        <w:ind w:left="5760" w:hanging="480"/>
+      </w:pPr>
+    </w:lvl>
+    <w:lvl w:ilvl="8">
+      <w:numFmt w:val="bullet"/>
+      <w:lvlText w:val="•"/>
+      <w:lvlJc w:val="left"/>
+      <w:pPr>
+        <w:ind w:left="6480" w:hanging="480"/>
+      </w:pPr>
+    </w:lvl>
+  </w:abstractNum>
   <w:num w:numId="1000">
     <w:abstractNumId w:val="990"/>
+  </w:num>
+  <w:num w:numId="1001">
+    <w:abstractNumId w:val="991"/>
   </w:num>
 </w:numbering>
 </file>

</xml_diff>

<commit_message>
docs: High/Medium 수정 DEV_LOG 기록 + docx 변환
Co-Authored-By: Claude Opus 4.6 (1M context) <noreply@anthropic.com>
</commit_message>
<xml_diff>
--- a/docs/exports/DEV_LOG.docx
+++ b/docs/exports/DEV_LOG.docx
@@ -2,7 +2,7 @@
 <file path=word/document.xml><?xml version="1.0" encoding="utf-8"?>
 <w:document xmlns:w="http://schemas.openxmlformats.org/wordprocessingml/2006/main" xmlns:m="http://schemas.openxmlformats.org/officeDocument/2006/math" xmlns:r="http://schemas.openxmlformats.org/officeDocument/2006/relationships" xmlns:o="urn:schemas-microsoft-com:office:office" xmlns:v="urn:schemas-microsoft-com:vml" xmlns:w10="urn:schemas-microsoft-com:office:word" xmlns:a="http://schemas.openxmlformats.org/drawingml/2006/main" xmlns:pic="http://schemas.openxmlformats.org/drawingml/2006/picture" xmlns:wp="http://schemas.openxmlformats.org/drawingml/2006/wordprocessingDrawing">
   <w:body>
-    <w:bookmarkStart w:id="21" w:name="개발-작업-기록-development-log"/>
+    <w:bookmarkStart w:id="22" w:name="개발-작업-기록-development-log"/>
     <w:p>
       <w:pPr>
         <w:pStyle w:val="Heading1"/>
@@ -26,13 +26,13 @@
         </w:pict>
       </w:r>
     </w:p>
-    <w:bookmarkStart w:id="20" w:name="ccg-3-ai-전체-기능-점검-critical-이슈-6건-수정"/>
+    <w:bookmarkStart w:id="20" w:name="highmedium-이슈-22건-일괄-수정"/>
     <w:p>
       <w:pPr>
         <w:pStyle w:val="Heading3"/>
       </w:pPr>
       <w:r>
-        <w:t xml:space="preserve">[2026-04-19 15:00] CCG 3-AI 전체 기능 점검 — Critical 이슈 6건 수정</w:t>
+        <w:t xml:space="preserve">[2026-04-19 16:00] High/Medium 이슈 22건 일괄 수정</w:t>
       </w:r>
     </w:p>
     <w:p>
@@ -40,7 +40,7 @@
         <w:pStyle w:val="FirstParagraph"/>
       </w:pPr>
       <w:r>
-        <w:t xml:space="preserve">서비스 시작에 맞춰 Claude+Codex+Gemini 3개 AI로 전체 기능을 점검하고, 발견된 Critical 이슈 6건을 수정했습니다.</w:t>
+        <w:t xml:space="preserve">CCG 3-AI 점검에서 발견된 나머지 이슈를 모두 수정했습니다.</w:t>
       </w:r>
     </w:p>
     <w:p>
@@ -56,10 +56,10 @@
           <w:bCs/>
           <w:b/>
         </w:rPr>
-        <w:t xml:space="preserve">회원가입 작동 안 됨 수정</w:t>
-      </w:r>
-      <w:r>
-        <w:t xml:space="preserve">: 가입 버튼을 눌러도 실제 계정이 안 만들어지던 문제를 고침</w:t>
+        <w:t xml:space="preserve">보안 강화 7건</w:t>
+      </w:r>
+      <w:r>
+        <w:t xml:space="preserve">: 얼굴분석 이미지 크기 제한, AI검색/번역 글자수 제한, 방문자 카운터 보안, 신고 입력 검증, reCAPTCHA 기준 강화, 관리자 에러 정보 숨김</w:t>
       </w:r>
     </w:p>
     <w:p>
@@ -75,10 +75,10 @@
           <w:bCs/>
           <w:b/>
         </w:rPr>
-        <w:t xml:space="preserve">댓글 삭제 보안 강화</w:t>
-      </w:r>
-      <w:r>
-        <w:t xml:space="preserve">: 다른 사람 댓글을 삭제할 수 있던 보안 구멍을 막음</w:t>
+        <w:t xml:space="preserve">프론트엔드 8건</w:t>
+      </w:r>
+      <w:r>
+        <w:t xml:space="preserve">: 문의폼 중복제출 방지, 상담폼 에러처리, 에러페이지/404페이지 다국어화, 마이페이지 한국어 하드코딩 제거</w:t>
       </w:r>
     </w:p>
     <w:p>
@@ -94,17 +94,107 @@
           <w:bCs/>
           <w:b/>
         </w:rPr>
-        <w:t xml:space="preserve">관리자 페이지 보안</w:t>
-      </w:r>
-      <w:r>
-        <w:t xml:space="preserve">: /admin 주소로 직접 접근하면 차단되도록 수정</w:t>
+        <w:t xml:space="preserve">기타</w:t>
+      </w:r>
+      <w:r>
+        <w:t xml:space="preserve">: PWA 매니페스트 영문화, Supabase 서비스 클라이언트 수정</w:t>
+      </w:r>
+    </w:p>
+    <w:p>
+      <w:pPr>
+        <w:pStyle w:val="FirstParagraph"/>
+      </w:pPr>
+      <w:r>
+        <w:t xml:space="preserve">상태: [완료]</w:t>
+      </w:r>
+    </w:p>
+    <w:p>
+      <w:r>
+        <w:pict>
+          <v:rect style="width:0;height:1.5pt" o:hralign="center" o:hrstd="t" o:hr="t"/>
+        </w:pict>
+      </w:r>
+    </w:p>
+    <w:bookmarkEnd w:id="20"/>
+    <w:bookmarkStart w:id="21" w:name="ccg-3-ai-전체-기능-점검-critical-이슈-6건-수정"/>
+    <w:p>
+      <w:pPr>
+        <w:pStyle w:val="Heading3"/>
+      </w:pPr>
+      <w:r>
+        <w:t xml:space="preserve">[2026-04-19 15:00] CCG 3-AI 전체 기능 점검 — Critical 이슈 6건 수정</w:t>
+      </w:r>
+    </w:p>
+    <w:p>
+      <w:pPr>
+        <w:pStyle w:val="FirstParagraph"/>
+      </w:pPr>
+      <w:r>
+        <w:t xml:space="preserve">서비스 시작에 맞춰 Claude+Codex+Gemini 3개 AI로 전체 기능을 점검하고, 발견된 Critical 이슈 6건을 수정했습니다.</w:t>
       </w:r>
     </w:p>
     <w:p>
       <w:pPr>
         <w:numPr>
           <w:ilvl w:val="0"/>
-          <w:numId w:val="1001"/>
+          <w:numId w:val="1002"/>
+        </w:numPr>
+        <w:pStyle w:val="Compact"/>
+      </w:pPr>
+      <w:r>
+        <w:rPr>
+          <w:bCs/>
+          <w:b/>
+        </w:rPr>
+        <w:t xml:space="preserve">회원가입 작동 안 됨 수정</w:t>
+      </w:r>
+      <w:r>
+        <w:t xml:space="preserve">: 가입 버튼을 눌러도 실제 계정이 안 만들어지던 문제를 고침</w:t>
+      </w:r>
+    </w:p>
+    <w:p>
+      <w:pPr>
+        <w:numPr>
+          <w:ilvl w:val="0"/>
+          <w:numId w:val="1002"/>
+        </w:numPr>
+        <w:pStyle w:val="Compact"/>
+      </w:pPr>
+      <w:r>
+        <w:rPr>
+          <w:bCs/>
+          <w:b/>
+        </w:rPr>
+        <w:t xml:space="preserve">댓글 삭제 보안 강화</w:t>
+      </w:r>
+      <w:r>
+        <w:t xml:space="preserve">: 다른 사람 댓글을 삭제할 수 있던 보안 구멍을 막음</w:t>
+      </w:r>
+    </w:p>
+    <w:p>
+      <w:pPr>
+        <w:numPr>
+          <w:ilvl w:val="0"/>
+          <w:numId w:val="1002"/>
+        </w:numPr>
+        <w:pStyle w:val="Compact"/>
+      </w:pPr>
+      <w:r>
+        <w:rPr>
+          <w:bCs/>
+          <w:b/>
+        </w:rPr>
+        <w:t xml:space="preserve">관리자 페이지 보안</w:t>
+      </w:r>
+      <w:r>
+        <w:t xml:space="preserve">: /admin 주소로 직접 접근하면 차단되도록 수정</w:t>
+      </w:r>
+    </w:p>
+    <w:p>
+      <w:pPr>
+        <w:numPr>
+          <w:ilvl w:val="0"/>
+          <w:numId w:val="1002"/>
         </w:numPr>
         <w:pStyle w:val="Compact"/>
       </w:pPr>
@@ -123,7 +213,7 @@
       <w:pPr>
         <w:numPr>
           <w:ilvl w:val="0"/>
-          <w:numId w:val="1001"/>
+          <w:numId w:val="1002"/>
         </w:numPr>
         <w:pStyle w:val="Compact"/>
       </w:pPr>
@@ -142,7 +232,7 @@
       <w:pPr>
         <w:numPr>
           <w:ilvl w:val="0"/>
-          <w:numId w:val="1001"/>
+          <w:numId w:val="1002"/>
         </w:numPr>
         <w:pStyle w:val="Compact"/>
       </w:pPr>
@@ -2199,8 +2289,8 @@
         <w:t xml:space="preserve">- README.md 8개국 언어, 프로젝트 구조 현행화</w:t>
       </w:r>
     </w:p>
-    <w:bookmarkEnd w:id="20"/>
     <w:bookmarkEnd w:id="21"/>
+    <w:bookmarkEnd w:id="22"/>
     <w:sectPr/>
   </w:body>
 </w:document>
@@ -2387,6 +2477,9 @@
     <w:abstractNumId w:val="990"/>
   </w:num>
   <w:num w:numId="1001">
+    <w:abstractNumId w:val="991"/>
+  </w:num>
+  <w:num w:numId="1002">
     <w:abstractNumId w:val="991"/>
   </w:num>
 </w:numbering>

</xml_diff>

<commit_message>
docs: 관리자 패널 개편 + AEO DEV_LOG 기록
Co-Authored-By: Claude Opus 4.6 (1M context) <noreply@anthropic.com>
</commit_message>
<xml_diff>
--- a/docs/exports/DEV_LOG.docx
+++ b/docs/exports/DEV_LOG.docx
@@ -2,7 +2,7 @@
 <file path=word/document.xml><?xml version="1.0" encoding="utf-8"?>
 <w:document xmlns:w="http://schemas.openxmlformats.org/wordprocessingml/2006/main" xmlns:m="http://schemas.openxmlformats.org/officeDocument/2006/math" xmlns:r="http://schemas.openxmlformats.org/officeDocument/2006/relationships" xmlns:o="urn:schemas-microsoft-com:office:office" xmlns:v="urn:schemas-microsoft-com:vml" xmlns:w10="urn:schemas-microsoft-com:office:word" xmlns:a="http://schemas.openxmlformats.org/drawingml/2006/main" xmlns:pic="http://schemas.openxmlformats.org/drawingml/2006/picture" xmlns:wp="http://schemas.openxmlformats.org/drawingml/2006/wordprocessingDrawing">
   <w:body>
-    <w:bookmarkStart w:id="23" w:name="개발-작업-기록-development-log"/>
+    <w:bookmarkStart w:id="24" w:name="개발-작업-기록-development-log"/>
     <w:p>
       <w:pPr>
         <w:pStyle w:val="Heading1"/>
@@ -26,7 +26,178 @@
         </w:pict>
       </w:r>
     </w:p>
-    <w:bookmarkStart w:id="20" w:name="화장품-순위-자동-수집-cron-구축"/>
+    <w:bookmarkStart w:id="20" w:name="관리자-패널-전면-개편-13단계-ai-검색-최적화"/>
+    <w:p>
+      <w:pPr>
+        <w:pStyle w:val="Heading3"/>
+      </w:pPr>
+      <w:r>
+        <w:t xml:space="preserve">[2026-04-19 20:00] 관리자 패널 전면 개편 (1~3단계) + AI 검색 최적화</w:t>
+      </w:r>
+    </w:p>
+    <w:p>
+      <w:pPr>
+        <w:pStyle w:val="FirstParagraph"/>
+      </w:pPr>
+      <w:r>
+        <w:t xml:space="preserve">관리자 모드를 3개 AI(Claude+Codex+Gemini)로 점검하고 전면 개편했습니다.</w:t>
+      </w:r>
+    </w:p>
+    <w:p>
+      <w:pPr>
+        <w:pStyle w:val="BodyText"/>
+      </w:pPr>
+      <w:r>
+        <w:rPr>
+          <w:bCs/>
+          <w:b/>
+        </w:rPr>
+        <w:t xml:space="preserve">1단계 — DB 연동 (더미→실제)</w:t>
+      </w:r>
+      <w:r>
+        <w:t xml:space="preserve"> </w:t>
+      </w:r>
+      <w:r>
+        <w:t xml:space="preserve">- 회원관리: 정지/차단/해제/삭제가 실제로 작동 (이전에는 alert만 뜸)</w:t>
+      </w:r>
+      <w:r>
+        <w:t xml:space="preserve"> </w:t>
+      </w:r>
+      <w:r>
+        <w:t xml:space="preserve">- 게시글/병원/문의: 하드코딩 데이터 → Supabase 실시간 조회</w:t>
+      </w:r>
+      <w:r>
+        <w:t xml:space="preserve"> </w:t>
+      </w:r>
+      <w:r>
+        <w:t xml:space="preserve">- 광고: 파일 저장 → Supabase 테이블로 이전 (배포 시 유실 방지)</w:t>
+      </w:r>
+      <w:r>
+        <w:t xml:space="preserve"> </w:t>
+      </w:r>
+      <w:r>
+        <w:t xml:space="preserve">- 대시보드: 실시간 통계 카드 (회원/게시글/병원/방문자/신고)</w:t>
+      </w:r>
+    </w:p>
+    <w:p>
+      <w:pPr>
+        <w:pStyle w:val="BodyText"/>
+      </w:pPr>
+      <w:r>
+        <w:rPr>
+          <w:bCs/>
+          <w:b/>
+        </w:rPr>
+        <w:t xml:space="preserve">2단계 — 편의성</w:t>
+      </w:r>
+      <w:r>
+        <w:t xml:space="preserve"> </w:t>
+      </w:r>
+      <w:r>
+        <w:t xml:space="preserve">- 회원 검색/필터 (이메일, 상태, 로그인방식)</w:t>
+      </w:r>
+      <w:r>
+        <w:t xml:space="preserve"> </w:t>
+      </w:r>
+      <w:r>
+        <w:t xml:space="preserve">- 광고가 실제 사이트에 표시되도록 연결</w:t>
+      </w:r>
+      <w:r>
+        <w:t xml:space="preserve"> </w:t>
+      </w:r>
+      <w:r>
+        <w:t xml:space="preserve">- 사이드바 현재 페이지 강조</w:t>
+      </w:r>
+      <w:r>
+        <w:t xml:space="preserve"> </w:t>
+      </w:r>
+      <w:r>
+        <w:t xml:space="preserve">- /admin 더미 라우트 리다이렉트로 보안 해결</w:t>
+      </w:r>
+    </w:p>
+    <w:p>
+      <w:pPr>
+        <w:pStyle w:val="BodyText"/>
+      </w:pPr>
+      <w:r>
+        <w:rPr>
+          <w:bCs/>
+          <w:b/>
+        </w:rPr>
+        <w:t xml:space="preserve">3단계 — 고급 기능</w:t>
+      </w:r>
+      <w:r>
+        <w:t xml:space="preserve"> </w:t>
+      </w:r>
+      <w:r>
+        <w:t xml:space="preserve">- 광고 노출/클릭 추적 + CTR 표시</w:t>
+      </w:r>
+      <w:r>
+        <w:t xml:space="preserve"> </w:t>
+      </w:r>
+      <w:r>
+        <w:t xml:space="preserve">- 회원/게시글 CSV 다운로드</w:t>
+      </w:r>
+      <w:r>
+        <w:t xml:space="preserve"> </w:t>
+      </w:r>
+      <w:r>
+        <w:t xml:space="preserve">- 감사 로그 + 대시보드 최근 활동</w:t>
+      </w:r>
+      <w:r>
+        <w:t xml:space="preserve"> </w:t>
+      </w:r>
+      <w:r>
+        <w:t xml:space="preserve">- 댓글 관리 페이지 신규</w:t>
+      </w:r>
+    </w:p>
+    <w:p>
+      <w:pPr>
+        <w:pStyle w:val="BodyText"/>
+      </w:pPr>
+      <w:r>
+        <w:rPr>
+          <w:bCs/>
+          <w:b/>
+        </w:rPr>
+        <w:t xml:space="preserve">AI 검색 최적화 (AEO)</w:t>
+      </w:r>
+      <w:r>
+        <w:t xml:space="preserve"> </w:t>
+      </w:r>
+      <w:r>
+        <w:t xml:space="preserve">- llms.txt / llms-full.txt 생성 (ChatGPT, Perplexity 등 AI가 읽는 파일)</w:t>
+      </w:r>
+      <w:r>
+        <w:t xml:space="preserve"> </w:t>
+      </w:r>
+      <w:r>
+        <w:t xml:space="preserve">- JSON-LD 구조화 데이터 강화 (FAQ, 검색 등)</w:t>
+      </w:r>
+      <w:r>
+        <w:t xml:space="preserve"> </w:t>
+      </w:r>
+      <w:r>
+        <w:t xml:space="preserve">- AI 크롤러 명시 허용 (GPTBot, ClaudeBot 등)</w:t>
+      </w:r>
+    </w:p>
+    <w:p>
+      <w:pPr>
+        <w:pStyle w:val="BodyText"/>
+      </w:pPr>
+      <w:r>
+        <w:t xml:space="preserve">상태: [완료]</w:t>
+      </w:r>
+    </w:p>
+    <w:p>
+      <w:r>
+        <w:pict>
+          <v:rect style="width:0;height:1.5pt" o:hralign="center" o:hrstd="t" o:hr="t"/>
+        </w:pict>
+      </w:r>
+    </w:p>
+    <w:bookmarkEnd w:id="20"/>
+    <w:bookmarkStart w:id="21" w:name="화장품-순위-자동-수집-cron-구축"/>
     <w:p>
       <w:pPr>
         <w:pStyle w:val="Heading3"/>
@@ -106,8 +277,8 @@
         </w:pict>
       </w:r>
     </w:p>
-    <w:bookmarkEnd w:id="20"/>
-    <w:bookmarkStart w:id="21" w:name="highmedium-이슈-22건-일괄-수정"/>
+    <w:bookmarkEnd w:id="21"/>
+    <w:bookmarkStart w:id="22" w:name="highmedium-이슈-22건-일괄-수정"/>
     <w:p>
       <w:pPr>
         <w:pStyle w:val="Heading3"/>
@@ -196,8 +367,8 @@
         </w:pict>
       </w:r>
     </w:p>
-    <w:bookmarkEnd w:id="21"/>
-    <w:bookmarkStart w:id="22" w:name="ccg-3-ai-전체-기능-점검-critical-이슈-6건-수정"/>
+    <w:bookmarkEnd w:id="22"/>
+    <w:bookmarkStart w:id="23" w:name="ccg-3-ai-전체-기능-점검-critical-이슈-6건-수정"/>
     <w:p>
       <w:pPr>
         <w:pStyle w:val="Heading3"/>
@@ -2370,8 +2541,8 @@
         <w:t xml:space="preserve">- README.md 8개국 언어, 프로젝트 구조 현행화</w:t>
       </w:r>
     </w:p>
-    <w:bookmarkEnd w:id="22"/>
     <w:bookmarkEnd w:id="23"/>
+    <w:bookmarkEnd w:id="24"/>
     <w:sectPr/>
   </w:body>
 </w:document>

</xml_diff>

<commit_message>
docs: 2026-04-20 작업 기록 업데이트
검색 버그 수정, 사이트 점검 기능, 관리자 구글 로그인 작업 기록

Co-Authored-By: Claude Opus 4.6 (1M context) <noreply@anthropic.com>
</commit_message>
<xml_diff>
--- a/docs/exports/DEV_LOG.docx
+++ b/docs/exports/DEV_LOG.docx
@@ -2,7 +2,7 @@
 <file path=word/document.xml><?xml version="1.0" encoding="utf-8"?>
 <w:document xmlns:w="http://schemas.openxmlformats.org/wordprocessingml/2006/main" xmlns:m="http://schemas.openxmlformats.org/officeDocument/2006/math" xmlns:r="http://schemas.openxmlformats.org/officeDocument/2006/relationships" xmlns:o="urn:schemas-microsoft-com:office:office" xmlns:v="urn:schemas-microsoft-com:vml" xmlns:w10="urn:schemas-microsoft-com:office:word" xmlns:a="http://schemas.openxmlformats.org/drawingml/2006/main" xmlns:pic="http://schemas.openxmlformats.org/drawingml/2006/picture" xmlns:wp="http://schemas.openxmlformats.org/drawingml/2006/wordprocessingDrawing">
   <w:body>
-    <w:bookmarkStart w:id="24" w:name="개발-작업-기록-development-log"/>
+    <w:bookmarkStart w:id="26" w:name="개발-작업-기록-development-log"/>
     <w:p>
       <w:pPr>
         <w:pStyle w:val="Heading1"/>
@@ -26,7 +26,301 @@
         </w:pict>
       </w:r>
     </w:p>
-    <w:bookmarkStart w:id="20" w:name="관리자-패널-전면-개편-13단계-ai-검색-최적화"/>
+    <w:bookmarkStart w:id="20" w:name="검색-연결-버그-수정-사이트-점검-기능-관리자-구글-로그인"/>
+    <w:p>
+      <w:pPr>
+        <w:pStyle w:val="Heading3"/>
+      </w:pPr>
+      <w:r>
+        <w:t xml:space="preserve">[2026-04-20 20:00] 검색 연결 버그 수정 + 사이트 점검 기능 + 관리자 구글 로그인</w:t>
+      </w:r>
+    </w:p>
+    <w:p>
+      <w:pPr>
+        <w:pStyle w:val="FirstParagraph"/>
+      </w:pPr>
+      <w:r>
+        <w:t xml:space="preserve">검색 결과가 사용자 기대와 맞지 않던 문제를 전면 수정했습니다.</w:t>
+      </w:r>
+    </w:p>
+    <w:p>
+      <w:pPr>
+        <w:pStyle w:val="BodyText"/>
+      </w:pPr>
+      <w:r>
+        <w:rPr>
+          <w:bCs/>
+          <w:b/>
+        </w:rPr>
+        <w:t xml:space="preserve">검색 버그 수정</w:t>
+      </w:r>
+      <w:r>
+        <w:t xml:space="preserve"> </w:t>
+      </w:r>
+      <w:r>
+        <w:t xml:space="preserve">- AI 검색에서</w:t>
+      </w:r>
+      <w:r>
+        <w:t xml:space="preserve"> </w:t>
+      </w:r>
+      <w:r>
+        <w:t xml:space="preserve">“</w:t>
+      </w:r>
+      <w:r>
+        <w:t xml:space="preserve">58개 병원 더 보기</w:t>
+      </w:r>
+      <w:r>
+        <w:t xml:space="preserve">”</w:t>
+      </w:r>
+      <w:r>
+        <w:t xml:space="preserve"> </w:t>
+      </w:r>
+      <w:r>
+        <w:t xml:space="preserve">클릭 시 4,827개가 뜨던 문제 해결</w:t>
+      </w:r>
+      <w:r>
+        <w:t xml:space="preserve"> </w:t>
+      </w:r>
+      <w:r>
+        <w:t xml:space="preserve">- 원인: 지역 파라미터가 잘못 전달 + 다른 데이터 소스(심평원 전체)를 보여줌</w:t>
+      </w:r>
+      <w:r>
+        <w:t xml:space="preserve"> </w:t>
+      </w:r>
+      <w:r>
+        <w:t xml:space="preserve">- 해결: 같은 DB에서 나머지 결과를 같은 페이지에 표시 (숫자 정확 일치)</w:t>
+      </w:r>
+    </w:p>
+    <w:p>
+      <w:pPr>
+        <w:pStyle w:val="BodyText"/>
+      </w:pPr>
+      <w:r>
+        <w:rPr>
+          <w:bCs/>
+          <w:b/>
+        </w:rPr>
+        <w:t xml:space="preserve">피부과 검색 의원 우선 표시</w:t>
+      </w:r>
+      <w:r>
+        <w:t xml:space="preserve"> </w:t>
+      </w:r>
+      <w:r>
+        <w:t xml:space="preserve">- 피부과 검색 시 상급종합병원(분당서울대 등)이 먼저 나오던 문제 해결</w:t>
+      </w:r>
+      <w:r>
+        <w:t xml:space="preserve"> </w:t>
+      </w:r>
+      <w:r>
+        <w:t xml:space="preserve">- 기본적으로 의원(클리닉)만 표시, 전체/병원/종합 필터 칩 추가</w:t>
+      </w:r>
+    </w:p>
+    <w:p>
+      <w:pPr>
+        <w:pStyle w:val="BodyText"/>
+      </w:pPr>
+      <w:r>
+        <w:rPr>
+          <w:bCs/>
+          <w:b/>
+        </w:rPr>
+        <w:t xml:space="preserve">관리자 대시보드 사이트 점검 기능</w:t>
+      </w:r>
+      <w:r>
+        <w:t xml:space="preserve"> </w:t>
+      </w:r>
+      <w:r>
+        <w:t xml:space="preserve">-</w:t>
+      </w:r>
+      <w:r>
+        <w:t xml:space="preserve"> </w:t>
+      </w:r>
+      <w:r>
+        <w:t xml:space="preserve">“</w:t>
+      </w:r>
+      <w:r>
+        <w:t xml:space="preserve">전체 점검 실행</w:t>
+      </w:r>
+      <w:r>
+        <w:t xml:space="preserve">”</w:t>
+      </w:r>
+      <w:r>
+        <w:t xml:space="preserve"> </w:t>
+      </w:r>
+      <w:r>
+        <w:t xml:space="preserve">버튼으로 15개 항목 자동 점검</w:t>
+      </w:r>
+      <w:r>
+        <w:t xml:space="preserve"> </w:t>
+      </w:r>
+      <w:r>
+        <w:t xml:space="preserve">- DB 연결, API 응답, 다국어 경로, 번역 키 누락, 파라미터 전달 등</w:t>
+      </w:r>
+    </w:p>
+    <w:p>
+      <w:pPr>
+        <w:pStyle w:val="BodyText"/>
+      </w:pPr>
+      <w:r>
+        <w:rPr>
+          <w:bCs/>
+          <w:b/>
+        </w:rPr>
+        <w:t xml:space="preserve">관리자 로그인 구글 OAuth 추가</w:t>
+      </w:r>
+      <w:r>
+        <w:t xml:space="preserve"> </w:t>
+      </w:r>
+      <w:r>
+        <w:t xml:space="preserve">- 기존 이메일/비밀번호 + Google 로그인 버튼 추가</w:t>
+      </w:r>
+      <w:r>
+        <w:t xml:space="preserve"> </w:t>
+      </w:r>
+      <w:r>
+        <w:t xml:space="preserve">- 구글 계정으로 바로 관리자 페이지 접근 가능</w:t>
+      </w:r>
+    </w:p>
+    <w:p>
+      <w:pPr>
+        <w:pStyle w:val="BodyText"/>
+      </w:pPr>
+      <w:r>
+        <w:t xml:space="preserve">[완료]</w:t>
+      </w:r>
+    </w:p>
+    <w:p>
+      <w:r>
+        <w:pict>
+          <v:rect style="width:0;height:1.5pt" o:hralign="center" o:hrstd="t" o:hr="t"/>
+        </w:pict>
+      </w:r>
+    </w:p>
+    <w:bookmarkEnd w:id="20"/>
+    <w:bookmarkStart w:id="21" w:name="데이터-동기화-수정-ai-검색-최소-10건-보장"/>
+    <w:p>
+      <w:pPr>
+        <w:pStyle w:val="Heading3"/>
+      </w:pPr>
+      <w:r>
+        <w:t xml:space="preserve">[2026-04-20 08:00] 데이터 동기화 수정 + AI 검색 최소 10건 보장</w:t>
+      </w:r>
+    </w:p>
+    <w:p>
+      <w:pPr>
+        <w:pStyle w:val="FirstParagraph"/>
+      </w:pPr>
+      <w:r>
+        <w:t xml:space="preserve">병원 데이터 수집과 검색 품질을 개선했습니다.</w:t>
+      </w:r>
+    </w:p>
+    <w:p>
+      <w:pPr>
+        <w:pStyle w:val="BodyText"/>
+      </w:pPr>
+      <w:r>
+        <w:rPr>
+          <w:bCs/>
+          <w:b/>
+        </w:rPr>
+        <w:t xml:space="preserve">데이터 동기화 (cron/sync) 수정</w:t>
+      </w:r>
+      <w:r>
+        <w:t xml:space="preserve"> </w:t>
+      </w:r>
+      <w:r>
+        <w:t xml:space="preserve">- 신규 개원 병원: 기존에 첫 페이지(100개)만 수집 → 전체 페이지 수집으로 변경 (누락 방지)</w:t>
+      </w:r>
+      <w:r>
+        <w:t xml:space="preserve"> </w:t>
+      </w:r>
+      <w:r>
+        <w:t xml:space="preserve">- 폐업 병원: 비활성화 로직이 없었음 → 심평원에서 조회 안 되는 병원을 자동으로 비활성 처리 추가</w:t>
+      </w:r>
+      <w:r>
+        <w:t xml:space="preserve"> </w:t>
+      </w:r>
+      <w:r>
+        <w:t xml:space="preserve">- 폐업 병원 데이터는 삭제하지 않고 is_active=false로만 변경</w:t>
+      </w:r>
+    </w:p>
+    <w:p>
+      <w:pPr>
+        <w:pStyle w:val="BodyText"/>
+      </w:pPr>
+      <w:r>
+        <w:rPr>
+          <w:bCs/>
+          <w:b/>
+        </w:rPr>
+        <w:t xml:space="preserve">AI 검색 최소 10건 보장</w:t>
+      </w:r>
+      <w:r>
+        <w:t xml:space="preserve"> </w:t>
+      </w:r>
+      <w:r>
+        <w:t xml:space="preserve">- 기존: 검색 결과 0건일 때만 조건 완화</w:t>
+      </w:r>
+      <w:r>
+        <w:t xml:space="preserve"> </w:t>
+      </w:r>
+      <w:r>
+        <w:t xml:space="preserve">- 변경: 10건 미만이면 자동으로 조건을 넓혀서 결과 보충</w:t>
+      </w:r>
+      <w:r>
+        <w:t xml:space="preserve"> </w:t>
+      </w:r>
+      <w:r>
+        <w:t xml:space="preserve">- 6단계 점진적 검색 (정밀→넓음), 중복 자동 제거</w:t>
+      </w:r>
+      <w:r>
+        <w:t xml:space="preserve"> </w:t>
+      </w:r>
+      <w:r>
+        <w:t xml:space="preserve">- 개인화 필터 추가해도 결과 수가 줄어들지 않는 구조</w:t>
+      </w:r>
+    </w:p>
+    <w:p>
+      <w:pPr>
+        <w:pStyle w:val="BodyText"/>
+      </w:pPr>
+      <w:r>
+        <w:rPr>
+          <w:bCs/>
+          <w:b/>
+        </w:rPr>
+        <w:t xml:space="preserve">PROJECT_INFO.md 수정</w:t>
+      </w:r>
+      <w:r>
+        <w:t xml:space="preserve"> </w:t>
+      </w:r>
+      <w:r>
+        <w:t xml:space="preserve">- 프로젝트명 오류 수정 (한국불교바둑협회 → K-Beauty Buyers Guide)</w:t>
+      </w:r>
+      <w:r>
+        <w:t xml:space="preserve"> </w:t>
+      </w:r>
+      <w:r>
+        <w:t xml:space="preserve">- 배포 URL, 연동 서비스, 환경변수 등 실제 정보로 전면 업데이트</w:t>
+      </w:r>
+    </w:p>
+    <w:p>
+      <w:pPr>
+        <w:pStyle w:val="BodyText"/>
+      </w:pPr>
+      <w:r>
+        <w:t xml:space="preserve">상태: [완료]</w:t>
+      </w:r>
+    </w:p>
+    <w:p>
+      <w:r>
+        <w:pict>
+          <v:rect style="width:0;height:1.5pt" o:hralign="center" o:hrstd="t" o:hr="t"/>
+        </w:pict>
+      </w:r>
+    </w:p>
+    <w:bookmarkEnd w:id="21"/>
+    <w:bookmarkStart w:id="22" w:name="관리자-패널-전면-개편-13단계-ai-검색-최적화"/>
     <w:p>
       <w:pPr>
         <w:pStyle w:val="Heading3"/>
@@ -196,8 +490,8 @@
         </w:pict>
       </w:r>
     </w:p>
-    <w:bookmarkEnd w:id="20"/>
-    <w:bookmarkStart w:id="21" w:name="화장품-순위-자동-수집-cron-구축"/>
+    <w:bookmarkEnd w:id="22"/>
+    <w:bookmarkStart w:id="23" w:name="화장품-순위-자동-수집-cron-구축"/>
     <w:p>
       <w:pPr>
         <w:pStyle w:val="Heading3"/>
@@ -277,8 +571,8 @@
         </w:pict>
       </w:r>
     </w:p>
-    <w:bookmarkEnd w:id="21"/>
-    <w:bookmarkStart w:id="22" w:name="highmedium-이슈-22건-일괄-수정"/>
+    <w:bookmarkEnd w:id="23"/>
+    <w:bookmarkStart w:id="24" w:name="highmedium-이슈-22건-일괄-수정"/>
     <w:p>
       <w:pPr>
         <w:pStyle w:val="Heading3"/>
@@ -367,8 +661,8 @@
         </w:pict>
       </w:r>
     </w:p>
-    <w:bookmarkEnd w:id="22"/>
-    <w:bookmarkStart w:id="23" w:name="ccg-3-ai-전체-기능-점검-critical-이슈-6건-수정"/>
+    <w:bookmarkEnd w:id="24"/>
+    <w:bookmarkStart w:id="25" w:name="ccg-3-ai-전체-기능-점검-critical-이슈-6건-수정"/>
     <w:p>
       <w:pPr>
         <w:pStyle w:val="Heading3"/>
@@ -1618,7 +1912,7 @@
         <w:t xml:space="preserve"> </w:t>
       </w:r>
       <w:r>
-        <w:t xml:space="preserve">- help@2bstory.com → jbshim1@gmail.com (Resend 무료 제한)</w:t>
+        <w:t xml:space="preserve">- jbshim1@gmail.com → jbshim1@gmail.com (Resend 무료 제한)</w:t>
       </w:r>
       <w:r>
         <w:t xml:space="preserve"> </w:t>
@@ -2358,7 +2652,7 @@
         <w:t xml:space="preserve"> </w:t>
       </w:r>
       <w:r>
-        <w:t xml:space="preserve">- Supabase 저장 + Resend 이메일 알림 (help@2bstory.com)</w:t>
+        <w:t xml:space="preserve">- Supabase 저장 + Resend 이메일 알림 (jbshim1@gmail.com)</w:t>
       </w:r>
     </w:p>
     <w:p>
@@ -2541,8 +2835,8 @@
         <w:t xml:space="preserve">- README.md 8개국 언어, 프로젝트 구조 현행화</w:t>
       </w:r>
     </w:p>
-    <w:bookmarkEnd w:id="23"/>
-    <w:bookmarkEnd w:id="24"/>
+    <w:bookmarkEnd w:id="25"/>
+    <w:bookmarkEnd w:id="26"/>
     <w:sectPr/>
   </w:body>
 </w:document>

</xml_diff>

<commit_message>
docs: 2026-04-20 CCG 2차 점검 작업 기록
Co-Authored-By: Claude Opus 4.6 (1M context) <noreply@anthropic.com>
</commit_message>
<xml_diff>
--- a/docs/exports/DEV_LOG.docx
+++ b/docs/exports/DEV_LOG.docx
@@ -2,7 +2,7 @@
 <file path=word/document.xml><?xml version="1.0" encoding="utf-8"?>
 <w:document xmlns:w="http://schemas.openxmlformats.org/wordprocessingml/2006/main" xmlns:m="http://schemas.openxmlformats.org/officeDocument/2006/math" xmlns:r="http://schemas.openxmlformats.org/officeDocument/2006/relationships" xmlns:o="urn:schemas-microsoft-com:office:office" xmlns:v="urn:schemas-microsoft-com:vml" xmlns:w10="urn:schemas-microsoft-com:office:word" xmlns:a="http://schemas.openxmlformats.org/drawingml/2006/main" xmlns:pic="http://schemas.openxmlformats.org/drawingml/2006/picture" xmlns:wp="http://schemas.openxmlformats.org/drawingml/2006/wordprocessingDrawing">
   <w:body>
-    <w:bookmarkStart w:id="27" w:name="개발-작업-기록-development-log"/>
+    <w:bookmarkStart w:id="28" w:name="개발-작업-기록-development-log"/>
     <w:p>
       <w:pPr>
         <w:pStyle w:val="Heading1"/>
@@ -26,13 +26,13 @@
         </w:pict>
       </w:r>
     </w:p>
-    <w:bookmarkStart w:id="20" w:name="외국인-유저-글쓰기-다국어-완전-점검-및-수정"/>
+    <w:bookmarkStart w:id="20" w:name="외인-유저-추가-이슈-일괄-수정-ccg-점검-2차"/>
     <w:p>
       <w:pPr>
         <w:pStyle w:val="Heading3"/>
       </w:pPr>
       <w:r>
-        <w:t xml:space="preserve">[2026-04-20 23:00] 외국인 유저 글쓰기 다국어 완전 점검 및 수정</w:t>
+        <w:t xml:space="preserve">[2026-04-20 23:30] 외��인 유저 추가 이슈 일괄 수정 (CCG 점검 2차)</w:t>
       </w:r>
     </w:p>
     <w:p>
@@ -40,43 +40,43 @@
         <w:pStyle w:val="FirstParagraph"/>
       </w:pPr>
       <w:r>
-        <w:t xml:space="preserve">외국인이 글을 쓸 때 발생하는 문제를 3개 AI(Claude+Codex+Gemini)로 전수 점검했습니다.</w:t>
-      </w:r>
-      <w:r>
-        <w:t xml:space="preserve"> </w:t>
-      </w:r>
-      <w:r>
-        <w:t xml:space="preserve">- 게시판 6개(K-POP, K-Food, K-Drama 등) 누락 → DB에 추가 완료</w:t>
-      </w:r>
-      <w:r>
-        <w:t xml:space="preserve"> </w:t>
-      </w:r>
-      <w:r>
-        <w:t xml:space="preserve">- 글쓰기 화면이 한국어/영어로만 표시되던 문제 → 8개 언어 번역 적용</w:t>
-      </w:r>
-      <w:r>
-        <w:t xml:space="preserve"> </w:t>
-      </w:r>
-      <w:r>
-        <w:t xml:space="preserve">- 이미지 업로드 에러가 한국어로만 뜨던 문제 → 8개 언어 지원</w:t>
-      </w:r>
-      <w:r>
-        <w:t xml:space="preserve"> </w:t>
-      </w:r>
-      <w:r>
-        <w:t xml:space="preserve">- 로그인 에러 메시지 8개 언어 지원</w:t>
-      </w:r>
-      <w:r>
-        <w:t xml:space="preserve"> </w:t>
-      </w:r>
-      <w:r>
-        <w:t xml:space="preserve">- 구글 로그인 후 언어가 영어로 바뀌던 문제 수정</w:t>
-      </w:r>
-      <w:r>
-        <w:t xml:space="preserve"> </w:t>
-      </w:r>
-      <w:r>
-        <w:t xml:space="preserve">- 댓글 삭제 시 권한 체크 오류 수정</w:t>
+        <w:t xml:space="preserve">3개 AI 점검에서 발견된 추가 문제 11건을 수정했습니다.</w:t>
+      </w:r>
+      <w:r>
+        <w:t xml:space="preserve"> </w:t>
+      </w:r>
+      <w:r>
+        <w:t xml:space="preserve">- 게시글 목록: 카테고리 매핑 오류 + 정렬 오류 수정</w:t>
+      </w:r>
+      <w:r>
+        <w:t xml:space="preserve"> </w:t>
+      </w:r>
+      <w:r>
+        <w:t xml:space="preserve">- 게���글 목록: 검색/삭제 버튼 8개 언어 번역 적용</w:t>
+      </w:r>
+      <w:r>
+        <w:t xml:space="preserve"> </w:t>
+      </w:r>
+      <w:r>
+        <w:t xml:space="preserve">- 게시글 상세: 날짜가 사용자 언어에 맞게 표시되도록 수정</w:t>
+      </w:r>
+      <w:r>
+        <w:t xml:space="preserve"> </w:t>
+      </w:r>
+      <w:r>
+        <w:t xml:space="preserve">- 추천/비추천: 새로고침해도 유지되도록 DB 저장 방식으로 변경</w:t>
+      </w:r>
+      <w:r>
+        <w:t xml:space="preserve"> </w:t>
+      </w:r>
+      <w:r>
+        <w:t xml:space="preserve">- 헤더: 모바일 메뉴 8개 언어 번역 + 긴 텍스트 잘림 방지</w:t>
+      </w:r>
+      <w:r>
+        <w:t xml:space="preserve"> </w:t>
+      </w:r>
+      <w:r>
+        <w:t xml:space="preserve">- 헤더: 언어 변경 시 검색 조건이 유지되도록 수정</w:t>
       </w:r>
       <w:r>
         <w:t xml:space="preserve"> </w:t>
@@ -93,7 +93,74 @@
       </w:r>
     </w:p>
     <w:bookmarkEnd w:id="20"/>
-    <w:bookmarkStart w:id="21" w:name="검색-연결-버그-수정-사이트-점검-기능-관리자-구글-로그인"/>
+    <w:bookmarkStart w:id="21" w:name="외국인-유저-글쓰기-다국어-완전-점검-및-수정"/>
+    <w:p>
+      <w:pPr>
+        <w:pStyle w:val="Heading3"/>
+      </w:pPr>
+      <w:r>
+        <w:t xml:space="preserve">[2026-04-20 23:00] 외국인 유저 글쓰기 다국어 완전 점검 및 수정</w:t>
+      </w:r>
+    </w:p>
+    <w:p>
+      <w:pPr>
+        <w:pStyle w:val="FirstParagraph"/>
+      </w:pPr>
+      <w:r>
+        <w:t xml:space="preserve">외국인이 글을 쓸 때 발생하는 문제를 3개 AI(Claude+Codex+Gemini)로 전수 점검했습니다.</w:t>
+      </w:r>
+      <w:r>
+        <w:t xml:space="preserve"> </w:t>
+      </w:r>
+      <w:r>
+        <w:t xml:space="preserve">- 게시판 6개(K-POP, K-Food, K-Drama 등) 누락 → DB에 추가 완료</w:t>
+      </w:r>
+      <w:r>
+        <w:t xml:space="preserve"> </w:t>
+      </w:r>
+      <w:r>
+        <w:t xml:space="preserve">- 글쓰기 화면이 한국어/영어로만 표시되던 문제 → 8개 언어 번역 적용</w:t>
+      </w:r>
+      <w:r>
+        <w:t xml:space="preserve"> </w:t>
+      </w:r>
+      <w:r>
+        <w:t xml:space="preserve">- 이미지 업로드 에러가 한국어로만 뜨던 문제 → 8개 언어 지원</w:t>
+      </w:r>
+      <w:r>
+        <w:t xml:space="preserve"> </w:t>
+      </w:r>
+      <w:r>
+        <w:t xml:space="preserve">- 로그인 에러 메시지 8개 언어 지원</w:t>
+      </w:r>
+      <w:r>
+        <w:t xml:space="preserve"> </w:t>
+      </w:r>
+      <w:r>
+        <w:t xml:space="preserve">- 구글 로그인 후 언어가 영어로 바뀌던 문제 수정</w:t>
+      </w:r>
+      <w:r>
+        <w:t xml:space="preserve"> </w:t>
+      </w:r>
+      <w:r>
+        <w:t xml:space="preserve">- 댓글 삭제 시 권한 체크 오류 수정</w:t>
+      </w:r>
+      <w:r>
+        <w:t xml:space="preserve"> </w:t>
+      </w:r>
+      <w:r>
+        <w:t xml:space="preserve">- 상태: [완료]</w:t>
+      </w:r>
+    </w:p>
+    <w:p>
+      <w:r>
+        <w:pict>
+          <v:rect style="width:0;height:1.5pt" o:hralign="center" o:hrstd="t" o:hr="t"/>
+        </w:pict>
+      </w:r>
+    </w:p>
+    <w:bookmarkEnd w:id="21"/>
+    <w:bookmarkStart w:id="22" w:name="검색-연결-버그-수정-사이트-점검-기능-관리자-구글-로그인"/>
     <w:p>
       <w:pPr>
         <w:pStyle w:val="Heading3"/>
@@ -263,8 +330,8 @@
         </w:pict>
       </w:r>
     </w:p>
-    <w:bookmarkEnd w:id="21"/>
-    <w:bookmarkStart w:id="22" w:name="데이터-동기화-수정-ai-검색-최소-10건-보장"/>
+    <w:bookmarkEnd w:id="22"/>
+    <w:bookmarkStart w:id="23" w:name="데이터-동기화-수정-ai-검색-최소-10건-보장"/>
     <w:p>
       <w:pPr>
         <w:pStyle w:val="Heading3"/>
@@ -386,8 +453,8 @@
         </w:pict>
       </w:r>
     </w:p>
-    <w:bookmarkEnd w:id="22"/>
-    <w:bookmarkStart w:id="23" w:name="관리자-패널-전면-개편-13단계-ai-검색-최적화"/>
+    <w:bookmarkEnd w:id="23"/>
+    <w:bookmarkStart w:id="24" w:name="관리자-패널-전면-개편-13단계-ai-검색-최적화"/>
     <w:p>
       <w:pPr>
         <w:pStyle w:val="Heading3"/>
@@ -557,8 +624,8 @@
         </w:pict>
       </w:r>
     </w:p>
-    <w:bookmarkEnd w:id="23"/>
-    <w:bookmarkStart w:id="24" w:name="화장품-순위-자동-수집-cron-구축"/>
+    <w:bookmarkEnd w:id="24"/>
+    <w:bookmarkStart w:id="25" w:name="화장품-순위-자동-수집-cron-구축"/>
     <w:p>
       <w:pPr>
         <w:pStyle w:val="Heading3"/>
@@ -638,8 +705,8 @@
         </w:pict>
       </w:r>
     </w:p>
-    <w:bookmarkEnd w:id="24"/>
-    <w:bookmarkStart w:id="25" w:name="highmedium-이슈-22건-일괄-수정"/>
+    <w:bookmarkEnd w:id="25"/>
+    <w:bookmarkStart w:id="26" w:name="highmedium-이슈-22건-일괄-수정"/>
     <w:p>
       <w:pPr>
         <w:pStyle w:val="Heading3"/>
@@ -728,8 +795,8 @@
         </w:pict>
       </w:r>
     </w:p>
-    <w:bookmarkEnd w:id="25"/>
-    <w:bookmarkStart w:id="26" w:name="ccg-3-ai-전체-기능-점검-critical-이슈-6건-수정"/>
+    <w:bookmarkEnd w:id="26"/>
+    <w:bookmarkStart w:id="27" w:name="ccg-3-ai-전체-기능-점검-critical-이슈-6건-수정"/>
     <w:p>
       <w:pPr>
         <w:pStyle w:val="Heading3"/>
@@ -2902,8 +2969,8 @@
         <w:t xml:space="preserve">- README.md 8개국 언어, 프로젝트 구조 현행화</w:t>
       </w:r>
     </w:p>
-    <w:bookmarkEnd w:id="26"/>
     <w:bookmarkEnd w:id="27"/>
+    <w:bookmarkEnd w:id="28"/>
     <w:sectPr/>
   </w:body>
 </w:document>

</xml_diff>

<commit_message>
docs: 2026-04-21 3-AI 딥서치 보안/SEO 점검 작업 기록
Co-Authored-By: Claude Opus 4.6 (1M context) <noreply@anthropic.com>
</commit_message>
<xml_diff>
--- a/docs/exports/DEV_LOG.docx
+++ b/docs/exports/DEV_LOG.docx
@@ -2,7 +2,7 @@
 <file path=word/document.xml><?xml version="1.0" encoding="utf-8"?>
 <w:document xmlns:w="http://schemas.openxmlformats.org/wordprocessingml/2006/main" xmlns:m="http://schemas.openxmlformats.org/officeDocument/2006/math" xmlns:r="http://schemas.openxmlformats.org/officeDocument/2006/relationships" xmlns:o="urn:schemas-microsoft-com:office:office" xmlns:v="urn:schemas-microsoft-com:vml" xmlns:w10="urn:schemas-microsoft-com:office:word" xmlns:a="http://schemas.openxmlformats.org/drawingml/2006/main" xmlns:pic="http://schemas.openxmlformats.org/drawingml/2006/picture" xmlns:wp="http://schemas.openxmlformats.org/drawingml/2006/wordprocessingDrawing">
   <w:body>
-    <w:bookmarkStart w:id="28" w:name="개발-작업-기록-development-log"/>
+    <w:bookmarkStart w:id="29" w:name="개발-작업-기록-development-log"/>
     <w:p>
       <w:pPr>
         <w:pStyle w:val="Heading1"/>
@@ -26,13 +26,13 @@
         </w:pict>
       </w:r>
     </w:p>
-    <w:bookmarkStart w:id="20" w:name="외인-유저-추가-이슈-일괄-수정-ccg-점검-2차"/>
+    <w:bookmarkStart w:id="20" w:name="ai-딥서치-보안seo아키텍처-전면-점검-및-수정"/>
     <w:p>
       <w:pPr>
         <w:pStyle w:val="Heading3"/>
       </w:pPr>
       <w:r>
-        <w:t xml:space="preserve">[2026-04-20 23:30] 외��인 유저 추가 이슈 일괄 수정 (CCG 점검 2차)</w:t>
+        <w:t xml:space="preserve">[2026-04-21 10:30] 3-AI 딥서치 보안/SEO/아키텍처 전면 점검 및 수정</w:t>
       </w:r>
     </w:p>
     <w:p>
@@ -40,43 +40,49 @@
         <w:pStyle w:val="FirstParagraph"/>
       </w:pPr>
       <w:r>
-        <w:t xml:space="preserve">3개 AI 점검에서 발견된 추가 문제 11건을 수정했습니다.</w:t>
-      </w:r>
-      <w:r>
-        <w:t xml:space="preserve"> </w:t>
-      </w:r>
-      <w:r>
-        <w:t xml:space="preserve">- 게시글 목록: 카테고리 매핑 오류 + 정렬 오류 수정</w:t>
-      </w:r>
-      <w:r>
-        <w:t xml:space="preserve"> </w:t>
-      </w:r>
-      <w:r>
-        <w:t xml:space="preserve">- 게���글 목록: 검색/삭제 버튼 8개 언어 번역 적용</w:t>
-      </w:r>
-      <w:r>
-        <w:t xml:space="preserve"> </w:t>
-      </w:r>
-      <w:r>
-        <w:t xml:space="preserve">- 게시글 상세: 날짜가 사용자 언어에 맞게 표시되도록 수정</w:t>
-      </w:r>
-      <w:r>
-        <w:t xml:space="preserve"> </w:t>
-      </w:r>
-      <w:r>
-        <w:t xml:space="preserve">- 추천/비추천: 새로고침해도 유지되도록 DB 저장 방식으로 변경</w:t>
-      </w:r>
-      <w:r>
-        <w:t xml:space="preserve"> </w:t>
-      </w:r>
-      <w:r>
-        <w:t xml:space="preserve">- 헤더: 모바일 메뉴 8개 언어 번역 + 긴 텍스트 잘림 방지</w:t>
-      </w:r>
-      <w:r>
-        <w:t xml:space="preserve"> </w:t>
-      </w:r>
-      <w:r>
-        <w:t xml:space="preserve">- 헤더: 언어 변경 시 검색 조건이 유지되도록 수정</w:t>
+        <w:t xml:space="preserve">3개 AI(Claude+Codex+Gemini)로 프로젝트 전체를 보안, 성능, SEO, 아키텍처 관점에서 점검했습니다.</w:t>
+      </w:r>
+      <w:r>
+        <w:t xml:space="preserve"> </w:t>
+      </w:r>
+      <w:r>
+        <w:t xml:space="preserve">- 관리자 페이지 서버 인증 추가 (로그인 안 하면 관리자 화면 접근 불가)</w:t>
+      </w:r>
+      <w:r>
+        <w:t xml:space="preserve"> </w:t>
+      </w:r>
+      <w:r>
+        <w:t xml:space="preserve">- 관리자 이메일 코드 노출 제거 → 환경변수로 이동</w:t>
+      </w:r>
+      <w:r>
+        <w:t xml:space="preserve"> </w:t>
+      </w:r>
+      <w:r>
+        <w:t xml:space="preserve">- 회원가입 시 유저 프로필 자동 생성 트리거 추가 (SQL 필요)</w:t>
+      </w:r>
+      <w:r>
+        <w:t xml:space="preserve"> </w:t>
+      </w:r>
+      <w:r>
+        <w:t xml:space="preserve">- robots.txt 한국어 차단 해제 + sitemap hreflang 추가</w:t>
+      </w:r>
+      <w:r>
+        <w:t xml:space="preserve"> </w:t>
+      </w:r>
+      <w:r>
+        <w:t xml:space="preserve">- 404 페이지 사용자 언어 유지</w:t>
+      </w:r>
+      <w:r>
+        <w:t xml:space="preserve"> </w:t>
+      </w:r>
+      <w:r>
+        <w:t xml:space="preserve">- AI 검색/이벤트 페이지 하드코딩 → 8개 언어 번역</w:t>
+      </w:r>
+      <w:r>
+        <w:t xml:space="preserve"> </w:t>
+      </w:r>
+      <w:r>
+        <w:t xml:space="preserve">- 코드 중복 제거 (FLAIR_STYLE 등 공통 모듈화)</w:t>
       </w:r>
       <w:r>
         <w:t xml:space="preserve"> </w:t>
@@ -93,13 +99,13 @@
       </w:r>
     </w:p>
     <w:bookmarkEnd w:id="20"/>
-    <w:bookmarkStart w:id="21" w:name="외국인-유저-글쓰기-다국어-완전-점검-및-수정"/>
+    <w:bookmarkStart w:id="21" w:name="외국인-유저-추가-이슈-일괄-수정-ccg-점검-2차"/>
     <w:p>
       <w:pPr>
         <w:pStyle w:val="Heading3"/>
       </w:pPr>
       <w:r>
-        <w:t xml:space="preserve">[2026-04-20 23:00] 외국인 유저 글쓰기 다국어 완전 점검 및 수정</w:t>
+        <w:t xml:space="preserve">[2026-04-20 23:30] 외국인 유저 추가 이슈 일괄 수정 (CCG 점검 2차)</w:t>
       </w:r>
     </w:p>
     <w:p>
@@ -107,43 +113,43 @@
         <w:pStyle w:val="FirstParagraph"/>
       </w:pPr>
       <w:r>
-        <w:t xml:space="preserve">외국인이 글을 쓸 때 발생하는 문제를 3개 AI(Claude+Codex+Gemini)로 전수 점검했습니다.</w:t>
-      </w:r>
-      <w:r>
-        <w:t xml:space="preserve"> </w:t>
-      </w:r>
-      <w:r>
-        <w:t xml:space="preserve">- 게시판 6개(K-POP, K-Food, K-Drama 등) 누락 → DB에 추가 완료</w:t>
-      </w:r>
-      <w:r>
-        <w:t xml:space="preserve"> </w:t>
-      </w:r>
-      <w:r>
-        <w:t xml:space="preserve">- 글쓰기 화면이 한국어/영어로만 표시되던 문제 → 8개 언어 번역 적용</w:t>
-      </w:r>
-      <w:r>
-        <w:t xml:space="preserve"> </w:t>
-      </w:r>
-      <w:r>
-        <w:t xml:space="preserve">- 이미지 업로드 에러가 한국어로만 뜨던 문제 → 8개 언어 지원</w:t>
-      </w:r>
-      <w:r>
-        <w:t xml:space="preserve"> </w:t>
-      </w:r>
-      <w:r>
-        <w:t xml:space="preserve">- 로그인 에러 메시지 8개 언어 지원</w:t>
-      </w:r>
-      <w:r>
-        <w:t xml:space="preserve"> </w:t>
-      </w:r>
-      <w:r>
-        <w:t xml:space="preserve">- 구글 로그인 후 언어가 영어로 바뀌던 문제 수정</w:t>
-      </w:r>
-      <w:r>
-        <w:t xml:space="preserve"> </w:t>
-      </w:r>
-      <w:r>
-        <w:t xml:space="preserve">- 댓글 삭제 시 권한 체크 오류 수정</w:t>
+        <w:t xml:space="preserve">3개 AI 점검에서 발견된 추가 문제 11건을 수정했습니다.</w:t>
+      </w:r>
+      <w:r>
+        <w:t xml:space="preserve"> </w:t>
+      </w:r>
+      <w:r>
+        <w:t xml:space="preserve">- 게시글 목록: 카테고리 매핑 오류 + 정렬 오류 수정</w:t>
+      </w:r>
+      <w:r>
+        <w:t xml:space="preserve"> </w:t>
+      </w:r>
+      <w:r>
+        <w:t xml:space="preserve">- 게���글 목록: 검색/삭제 버튼 8개 언어 번역 적용</w:t>
+      </w:r>
+      <w:r>
+        <w:t xml:space="preserve"> </w:t>
+      </w:r>
+      <w:r>
+        <w:t xml:space="preserve">- 게시글 상세: 날짜가 사용자 언어에 맞게 표시되도록 수정</w:t>
+      </w:r>
+      <w:r>
+        <w:t xml:space="preserve"> </w:t>
+      </w:r>
+      <w:r>
+        <w:t xml:space="preserve">- 추천/비추천: 새로고침해도 유지되도록 DB 저장 방식으로 변경</w:t>
+      </w:r>
+      <w:r>
+        <w:t xml:space="preserve"> </w:t>
+      </w:r>
+      <w:r>
+        <w:t xml:space="preserve">- 헤더: 모바일 메뉴 8개 언어 번역 + 긴 텍스트 잘림 방지</w:t>
+      </w:r>
+      <w:r>
+        <w:t xml:space="preserve"> </w:t>
+      </w:r>
+      <w:r>
+        <w:t xml:space="preserve">- 헤더: 언어 변경 시 검색 조건이 유지되도록 수정</w:t>
       </w:r>
       <w:r>
         <w:t xml:space="preserve"> </w:t>
@@ -160,7 +166,74 @@
       </w:r>
     </w:p>
     <w:bookmarkEnd w:id="21"/>
-    <w:bookmarkStart w:id="22" w:name="검색-연결-버그-수정-사이트-점검-기능-관리자-구글-로그인"/>
+    <w:bookmarkStart w:id="22" w:name="외국인-유저-글쓰기-다국어-완전-점검-및-수정"/>
+    <w:p>
+      <w:pPr>
+        <w:pStyle w:val="Heading3"/>
+      </w:pPr>
+      <w:r>
+        <w:t xml:space="preserve">[2026-04-20 23:00] 외국인 유저 글쓰기 다국어 완전 점검 및 수정</w:t>
+      </w:r>
+    </w:p>
+    <w:p>
+      <w:pPr>
+        <w:pStyle w:val="FirstParagraph"/>
+      </w:pPr>
+      <w:r>
+        <w:t xml:space="preserve">외국인이 글을 쓸 때 발생하는 문제를 3개 AI(Claude+Codex+Gemini)로 전수 점검했습니다.</w:t>
+      </w:r>
+      <w:r>
+        <w:t xml:space="preserve"> </w:t>
+      </w:r>
+      <w:r>
+        <w:t xml:space="preserve">- 게시판 6개(K-POP, K-Food, K-Drama 등) 누락 → DB에 추가 완료</w:t>
+      </w:r>
+      <w:r>
+        <w:t xml:space="preserve"> </w:t>
+      </w:r>
+      <w:r>
+        <w:t xml:space="preserve">- 글쓰기 화면이 한국어/영어로만 표시되던 문제 → 8개 언어 번역 적용</w:t>
+      </w:r>
+      <w:r>
+        <w:t xml:space="preserve"> </w:t>
+      </w:r>
+      <w:r>
+        <w:t xml:space="preserve">- 이미지 업로드 에러가 한국어로만 뜨던 문제 → 8개 언어 지원</w:t>
+      </w:r>
+      <w:r>
+        <w:t xml:space="preserve"> </w:t>
+      </w:r>
+      <w:r>
+        <w:t xml:space="preserve">- 로그인 에러 메시지 8개 언어 지원</w:t>
+      </w:r>
+      <w:r>
+        <w:t xml:space="preserve"> </w:t>
+      </w:r>
+      <w:r>
+        <w:t xml:space="preserve">- 구글 로그인 후 언어가 영어로 바뀌던 문제 수정</w:t>
+      </w:r>
+      <w:r>
+        <w:t xml:space="preserve"> </w:t>
+      </w:r>
+      <w:r>
+        <w:t xml:space="preserve">- 댓글 삭제 시 권한 체크 오류 수정</w:t>
+      </w:r>
+      <w:r>
+        <w:t xml:space="preserve"> </w:t>
+      </w:r>
+      <w:r>
+        <w:t xml:space="preserve">- 상태: [완료]</w:t>
+      </w:r>
+    </w:p>
+    <w:p>
+      <w:r>
+        <w:pict>
+          <v:rect style="width:0;height:1.5pt" o:hralign="center" o:hrstd="t" o:hr="t"/>
+        </w:pict>
+      </w:r>
+    </w:p>
+    <w:bookmarkEnd w:id="22"/>
+    <w:bookmarkStart w:id="23" w:name="검색-연결-버그-수정-사이트-점검-기능-관리자-구글-로그인"/>
     <w:p>
       <w:pPr>
         <w:pStyle w:val="Heading3"/>
@@ -330,8 +403,8 @@
         </w:pict>
       </w:r>
     </w:p>
-    <w:bookmarkEnd w:id="22"/>
-    <w:bookmarkStart w:id="23" w:name="데이터-동기화-수정-ai-검색-최소-10건-보장"/>
+    <w:bookmarkEnd w:id="23"/>
+    <w:bookmarkStart w:id="24" w:name="데이터-동기화-수정-ai-검색-최소-10건-보장"/>
     <w:p>
       <w:pPr>
         <w:pStyle w:val="Heading3"/>
@@ -453,8 +526,8 @@
         </w:pict>
       </w:r>
     </w:p>
-    <w:bookmarkEnd w:id="23"/>
-    <w:bookmarkStart w:id="24" w:name="관리자-패널-전면-개편-13단계-ai-검색-최적화"/>
+    <w:bookmarkEnd w:id="24"/>
+    <w:bookmarkStart w:id="25" w:name="관리자-패널-전면-개편-13단계-ai-검색-최적화"/>
     <w:p>
       <w:pPr>
         <w:pStyle w:val="Heading3"/>
@@ -624,8 +697,8 @@
         </w:pict>
       </w:r>
     </w:p>
-    <w:bookmarkEnd w:id="24"/>
-    <w:bookmarkStart w:id="25" w:name="화장품-순위-자동-수집-cron-구축"/>
+    <w:bookmarkEnd w:id="25"/>
+    <w:bookmarkStart w:id="26" w:name="화장품-순위-자동-수집-cron-구축"/>
     <w:p>
       <w:pPr>
         <w:pStyle w:val="Heading3"/>
@@ -705,8 +778,8 @@
         </w:pict>
       </w:r>
     </w:p>
-    <w:bookmarkEnd w:id="25"/>
-    <w:bookmarkStart w:id="26" w:name="highmedium-이슈-22건-일괄-수정"/>
+    <w:bookmarkEnd w:id="26"/>
+    <w:bookmarkStart w:id="27" w:name="highmedium-이슈-22건-일괄-수정"/>
     <w:p>
       <w:pPr>
         <w:pStyle w:val="Heading3"/>
@@ -795,8 +868,8 @@
         </w:pict>
       </w:r>
     </w:p>
-    <w:bookmarkEnd w:id="26"/>
-    <w:bookmarkStart w:id="27" w:name="ccg-3-ai-전체-기능-점검-critical-이슈-6건-수정"/>
+    <w:bookmarkEnd w:id="27"/>
+    <w:bookmarkStart w:id="28" w:name="ccg-3-ai-전체-기능-점검-critical-이슈-6건-수정"/>
     <w:p>
       <w:pPr>
         <w:pStyle w:val="Heading3"/>
@@ -2969,8 +3042,8 @@
         <w:t xml:space="preserve">- README.md 8개국 언어, 프로젝트 구조 현행화</w:t>
       </w:r>
     </w:p>
-    <w:bookmarkEnd w:id="27"/>
     <w:bookmarkEnd w:id="28"/>
+    <w:bookmarkEnd w:id="29"/>
     <w:sectPr/>
   </w:body>
 </w:document>

</xml_diff>

<commit_message>
docs: 2026-04-21 3-AI 재점검 작업 기록
Co-Authored-By: Claude Opus 4.6 (1M context) <noreply@anthropic.com>
</commit_message>
<xml_diff>
--- a/docs/exports/DEV_LOG.docx
+++ b/docs/exports/DEV_LOG.docx
@@ -2,7 +2,7 @@
 <file path=word/document.xml><?xml version="1.0" encoding="utf-8"?>
 <w:document xmlns:w="http://schemas.openxmlformats.org/wordprocessingml/2006/main" xmlns:m="http://schemas.openxmlformats.org/officeDocument/2006/math" xmlns:r="http://schemas.openxmlformats.org/officeDocument/2006/relationships" xmlns:o="urn:schemas-microsoft-com:office:office" xmlns:v="urn:schemas-microsoft-com:vml" xmlns:w10="urn:schemas-microsoft-com:office:word" xmlns:a="http://schemas.openxmlformats.org/drawingml/2006/main" xmlns:pic="http://schemas.openxmlformats.org/drawingml/2006/picture" xmlns:wp="http://schemas.openxmlformats.org/drawingml/2006/wordprocessingDrawing">
   <w:body>
-    <w:bookmarkStart w:id="29" w:name="개발-작업-기록-development-log"/>
+    <w:bookmarkStart w:id="30" w:name="개발-작업-기록-development-log"/>
     <w:p>
       <w:pPr>
         <w:pStyle w:val="Heading1"/>
@@ -26,7 +26,67 @@
         </w:pict>
       </w:r>
     </w:p>
-    <w:bookmarkStart w:id="20" w:name="ai-딥서치-보안seo아키텍처-전면-점검-및-수정"/>
+    <w:bookmarkStart w:id="20" w:name="ai-재점검-하드코딩-잔여-7건-수정"/>
+    <w:p>
+      <w:pPr>
+        <w:pStyle w:val="Heading3"/>
+      </w:pPr>
+      <w:r>
+        <w:t xml:space="preserve">[2026-04-21 11:30] 3-AI 재점검 — 하드코딩 잔여 7건 수정</w:t>
+      </w:r>
+    </w:p>
+    <w:p>
+      <w:pPr>
+        <w:pStyle w:val="FirstParagraph"/>
+      </w:pPr>
+      <w:r>
+        <w:t xml:space="preserve">이전 수정이 올바른지 + 새로운 문제가 있는지 3개 AI로 재점검했습니다.</w:t>
+      </w:r>
+      <w:r>
+        <w:t xml:space="preserve"> </w:t>
+      </w:r>
+      <w:r>
+        <w:t xml:space="preserve">- sitemap에 잘못된 URL(404 발생) 수정</w:t>
+      </w:r>
+      <w:r>
+        <w:t xml:space="preserve"> </w:t>
+      </w:r>
+      <w:r>
+        <w:t xml:space="preserve">- 글쓰기 태그(Flair) 8개 언어 번역 적용</w:t>
+      </w:r>
+      <w:r>
+        <w:t xml:space="preserve"> </w:t>
+      </w:r>
+      <w:r>
+        <w:t xml:space="preserve">- 병원 타입 필터(전체/의원/병원) 8개 언어 번역 적용</w:t>
+      </w:r>
+      <w:r>
+        <w:t xml:space="preserve"> </w:t>
+      </w:r>
+      <w:r>
+        <w:t xml:space="preserve">- 코스메틱 출처/가격 표시 8개 언어 번역 적용</w:t>
+      </w:r>
+      <w:r>
+        <w:t xml:space="preserve"> </w:t>
+      </w:r>
+      <w:r>
+        <w:t xml:space="preserve">- 투표 실패 시 에러 메시지 반환하도록 개선</w:t>
+      </w:r>
+      <w:r>
+        <w:t xml:space="preserve"> </w:t>
+      </w:r>
+      <w:r>
+        <w:t xml:space="preserve">- 모달/검색 접근성 라벨 수정</w:t>
+      </w:r>
+      <w:r>
+        <w:t xml:space="preserve"> </w:t>
+      </w:r>
+      <w:r>
+        <w:t xml:space="preserve">- 상태: [완료]</w:t>
+      </w:r>
+    </w:p>
+    <w:bookmarkEnd w:id="20"/>
+    <w:bookmarkStart w:id="21" w:name="ai-딥서치-보안seo아키텍처-전면-점검-및-수정"/>
     <w:p>
       <w:pPr>
         <w:pStyle w:val="Heading3"/>
@@ -98,8 +158,8 @@
         </w:pict>
       </w:r>
     </w:p>
-    <w:bookmarkEnd w:id="20"/>
-    <w:bookmarkStart w:id="21" w:name="외국인-유저-추가-이슈-일괄-수정-ccg-점검-2차"/>
+    <w:bookmarkEnd w:id="21"/>
+    <w:bookmarkStart w:id="22" w:name="외국인-유저-추가-이슈-일괄-수정-ccg-점검-2차"/>
     <w:p>
       <w:pPr>
         <w:pStyle w:val="Heading3"/>
@@ -165,8 +225,8 @@
         </w:pict>
       </w:r>
     </w:p>
-    <w:bookmarkEnd w:id="21"/>
-    <w:bookmarkStart w:id="22" w:name="외국인-유저-글쓰기-다국어-완전-점검-및-수정"/>
+    <w:bookmarkEnd w:id="22"/>
+    <w:bookmarkStart w:id="23" w:name="외국인-유저-글쓰기-다국어-완전-점검-및-수정"/>
     <w:p>
       <w:pPr>
         <w:pStyle w:val="Heading3"/>
@@ -232,8 +292,8 @@
         </w:pict>
       </w:r>
     </w:p>
-    <w:bookmarkEnd w:id="22"/>
-    <w:bookmarkStart w:id="23" w:name="검색-연결-버그-수정-사이트-점검-기능-관리자-구글-로그인"/>
+    <w:bookmarkEnd w:id="23"/>
+    <w:bookmarkStart w:id="24" w:name="검색-연결-버그-수정-사이트-점검-기능-관리자-구글-로그인"/>
     <w:p>
       <w:pPr>
         <w:pStyle w:val="Heading3"/>
@@ -403,8 +463,8 @@
         </w:pict>
       </w:r>
     </w:p>
-    <w:bookmarkEnd w:id="23"/>
-    <w:bookmarkStart w:id="24" w:name="데이터-동기화-수정-ai-검색-최소-10건-보장"/>
+    <w:bookmarkEnd w:id="24"/>
+    <w:bookmarkStart w:id="25" w:name="데이터-동기화-수정-ai-검색-최소-10건-보장"/>
     <w:p>
       <w:pPr>
         <w:pStyle w:val="Heading3"/>
@@ -526,8 +586,8 @@
         </w:pict>
       </w:r>
     </w:p>
-    <w:bookmarkEnd w:id="24"/>
-    <w:bookmarkStart w:id="25" w:name="관리자-패널-전면-개편-13단계-ai-검색-최적화"/>
+    <w:bookmarkEnd w:id="25"/>
+    <w:bookmarkStart w:id="26" w:name="관리자-패널-전면-개편-13단계-ai-검색-최적화"/>
     <w:p>
       <w:pPr>
         <w:pStyle w:val="Heading3"/>
@@ -697,8 +757,8 @@
         </w:pict>
       </w:r>
     </w:p>
-    <w:bookmarkEnd w:id="25"/>
-    <w:bookmarkStart w:id="26" w:name="화장품-순위-자동-수집-cron-구축"/>
+    <w:bookmarkEnd w:id="26"/>
+    <w:bookmarkStart w:id="27" w:name="화장품-순위-자동-수집-cron-구축"/>
     <w:p>
       <w:pPr>
         <w:pStyle w:val="Heading3"/>
@@ -778,8 +838,8 @@
         </w:pict>
       </w:r>
     </w:p>
-    <w:bookmarkEnd w:id="26"/>
-    <w:bookmarkStart w:id="27" w:name="highmedium-이슈-22건-일괄-수정"/>
+    <w:bookmarkEnd w:id="27"/>
+    <w:bookmarkStart w:id="28" w:name="highmedium-이슈-22건-일괄-수정"/>
     <w:p>
       <w:pPr>
         <w:pStyle w:val="Heading3"/>
@@ -868,8 +928,8 @@
         </w:pict>
       </w:r>
     </w:p>
-    <w:bookmarkEnd w:id="27"/>
-    <w:bookmarkStart w:id="28" w:name="ccg-3-ai-전체-기능-점검-critical-이슈-6건-수정"/>
+    <w:bookmarkEnd w:id="28"/>
+    <w:bookmarkStart w:id="29" w:name="ccg-3-ai-전체-기능-점검-critical-이슈-6건-수정"/>
     <w:p>
       <w:pPr>
         <w:pStyle w:val="Heading3"/>
@@ -3042,8 +3102,8 @@
         <w:t xml:space="preserve">- README.md 8개국 언어, 프로젝트 구조 현행화</w:t>
       </w:r>
     </w:p>
-    <w:bookmarkEnd w:id="28"/>
     <w:bookmarkEnd w:id="29"/>
+    <w:bookmarkEnd w:id="30"/>
     <w:sectPr/>
   </w:body>
 </w:document>

</xml_diff>

<commit_message>
docs: AI 추천 공유 기능 DEV_LOG 기록
Co-Authored-By: Claude Opus 4.6 (1M context) <noreply@anthropic.com>
</commit_message>
<xml_diff>
--- a/docs/exports/DEV_LOG.docx
+++ b/docs/exports/DEV_LOG.docx
@@ -2,7 +2,7 @@
 <file path=word/document.xml><?xml version="1.0" encoding="utf-8"?>
 <w:document xmlns:w="http://schemas.openxmlformats.org/wordprocessingml/2006/main" xmlns:m="http://schemas.openxmlformats.org/officeDocument/2006/math" xmlns:r="http://schemas.openxmlformats.org/officeDocument/2006/relationships" xmlns:o="urn:schemas-microsoft-com:office:office" xmlns:v="urn:schemas-microsoft-com:vml" xmlns:w10="urn:schemas-microsoft-com:office:word" xmlns:a="http://schemas.openxmlformats.org/drawingml/2006/main" xmlns:pic="http://schemas.openxmlformats.org/drawingml/2006/picture" xmlns:wp="http://schemas.openxmlformats.org/drawingml/2006/wordprocessingDrawing">
   <w:body>
-    <w:bookmarkStart w:id="31" w:name="개발-작업-기록-development-log"/>
+    <w:bookmarkStart w:id="32" w:name="개발-작업-기록-development-log"/>
     <w:p>
       <w:pPr>
         <w:pStyle w:val="Heading1"/>
@@ -26,13 +26,13 @@
         </w:pict>
       </w:r>
     </w:p>
-    <w:bookmarkStart w:id="20" w:name="보안-강화-및-코드-품질-개선"/>
+    <w:bookmarkStart w:id="20" w:name="ai-추천-결과-공유-기능-추가"/>
     <w:p>
       <w:pPr>
         <w:pStyle w:val="Heading3"/>
       </w:pPr>
       <w:r>
-        <w:t xml:space="preserve">[2026-04-25 14:00] 보안 강화 및 코드 품질 개선</w:t>
+        <w:t xml:space="preserve">[2026-04-26 10:00] AI 추천 결과 공유 기능 추가</w:t>
       </w:r>
     </w:p>
     <w:p>
@@ -40,55 +40,31 @@
         <w:pStyle w:val="FirstParagraph"/>
       </w:pPr>
       <w:r>
-        <w:t xml:space="preserve">사용자 입력을 안전하게 처리하고, 관리자 기능의 보안을 높이는 작업입니다.</w:t>
-      </w:r>
-      <w:r>
-        <w:t xml:space="preserve"> </w:t>
-      </w:r>
-      <w:r>
-        <w:t xml:space="preserve">- 악성 코드 입력 방지(XSS) 기능 추가 — 댓글, 게시글 작성 시 자동 적용</w:t>
-      </w:r>
-      <w:r>
-        <w:t xml:space="preserve"> </w:t>
-      </w:r>
-      <w:r>
-        <w:t xml:space="preserve">- 관리자 버그 리포트 페이지: 브라우저에서 직접 DB 접근 → 서버 API 경유로 변경</w:t>
-      </w:r>
-      <w:r>
-        <w:t xml:space="preserve"> </w:t>
-      </w:r>
-      <w:r>
-        <w:t xml:space="preserve">- 로그인 후 이동 경로 조작 방지, 봇 차단(reCAPTCHA) 요청 제한 추가</w:t>
-      </w:r>
-      <w:r>
-        <w:t xml:space="preserve"> </w:t>
-      </w:r>
-      <w:r>
-        <w:t xml:space="preserve">- AI 번역 API 보안 강화, 에러 메시지에서 내부 정보 노출 제거</w:t>
-      </w:r>
-      <w:r>
-        <w:t xml:space="preserve"> </w:t>
-      </w:r>
-      <w:r>
-        <w:t xml:space="preserve">- 관리자 이메일 환경변수를 서버 전용으로 변경 (ADMIN_EMAILS)</w:t>
-      </w:r>
-      <w:r>
-        <w:t xml:space="preserve"> </w:t>
-      </w:r>
-      <w:r>
-        <w:t xml:space="preserve">- 방문자 카운트 동시 접속 시 누락 방지 개선</w:t>
-      </w:r>
-      <w:r>
-        <w:t xml:space="preserve"> </w:t>
-      </w:r>
-      <w:r>
-        <w:t xml:space="preserve">- 버튼 색상 통일 (파란색 #0071e3)</w:t>
-      </w:r>
-      <w:r>
-        <w:t xml:space="preserve"> </w:t>
-      </w:r>
-      <w:r>
-        <w:t xml:space="preserve">- 상태: [완료]</w:t>
+        <w:t xml:space="preserve">AI 검색 결과를 친구에게 쉽게 공유할 수 있는 기능을 만들었습니다.</w:t>
+      </w:r>
+      <w:r>
+        <w:t xml:space="preserve"> </w:t>
+      </w:r>
+      <w:r>
+        <w:t xml:space="preserve">- 검색 결과 하단에 공유 패널 표시 (링크 복사, X(트위터), Facebook, 모바일 공유)</w:t>
+      </w:r>
+      <w:r>
+        <w:t xml:space="preserve"> </w:t>
+      </w:r>
+      <w:r>
+        <w:t xml:space="preserve">- 8개 언어 모두 지원 (한국어, 영어, 중국어, 일본어, 베트남어, 태국어, 러시아어, 몽골어)</w:t>
+      </w:r>
+      <w:r>
+        <w:t xml:space="preserve"> </w:t>
+      </w:r>
+      <w:r>
+        <w:t xml:space="preserve">- 공유받은 사람이 링크 클릭 시 같은 검색 결과 페이지로 바로 이동</w:t>
+      </w:r>
+      <w:r>
+        <w:t xml:space="preserve"> </w:t>
+      </w:r>
+      <w:r>
+        <w:t xml:space="preserve">- [완료]</w:t>
       </w:r>
     </w:p>
     <w:p>
@@ -99,13 +75,13 @@
       </w:r>
     </w:p>
     <w:bookmarkEnd w:id="20"/>
-    <w:bookmarkStart w:id="21" w:name="ai-재점검-하드코딩-잔여-7건-수정"/>
+    <w:bookmarkStart w:id="21" w:name="보안-강화-및-코드-품질-개선"/>
     <w:p>
       <w:pPr>
         <w:pStyle w:val="Heading3"/>
       </w:pPr>
       <w:r>
-        <w:t xml:space="preserve">[2026-04-21 11:30] 3-AI 재점검 — 하드코딩 잔여 7건 수정</w:t>
+        <w:t xml:space="preserve">[2026-04-25 14:00] 보안 강화 및 코드 품질 개선</w:t>
       </w:r>
     </w:p>
     <w:p>
@@ -113,109 +89,49 @@
         <w:pStyle w:val="FirstParagraph"/>
       </w:pPr>
       <w:r>
-        <w:t xml:space="preserve">이전 수정이 올바른지 + 새로운 문제가 있는지 3개 AI로 재점검했습니다.</w:t>
-      </w:r>
-      <w:r>
-        <w:t xml:space="preserve"> </w:t>
-      </w:r>
-      <w:r>
-        <w:t xml:space="preserve">- sitemap에 잘못된 URL(404 발생) 수정</w:t>
-      </w:r>
-      <w:r>
-        <w:t xml:space="preserve"> </w:t>
-      </w:r>
-      <w:r>
-        <w:t xml:space="preserve">- 글쓰기 태그(Flair) 8개 언어 번역 적용</w:t>
-      </w:r>
-      <w:r>
-        <w:t xml:space="preserve"> </w:t>
-      </w:r>
-      <w:r>
-        <w:t xml:space="preserve">- 병원 타입 필터(전체/의원/병원) 8개 언어 번역 적용</w:t>
-      </w:r>
-      <w:r>
-        <w:t xml:space="preserve"> </w:t>
-      </w:r>
-      <w:r>
-        <w:t xml:space="preserve">- 코스메틱 출처/가격 표시 8개 언어 번역 적용</w:t>
-      </w:r>
-      <w:r>
-        <w:t xml:space="preserve"> </w:t>
-      </w:r>
-      <w:r>
-        <w:t xml:space="preserve">- 투표 실패 시 에러 메시지 반환하도록 개선</w:t>
-      </w:r>
-      <w:r>
-        <w:t xml:space="preserve"> </w:t>
-      </w:r>
-      <w:r>
-        <w:t xml:space="preserve">- 모달/검색 접근성 라벨 수정</w:t>
-      </w:r>
-      <w:r>
-        <w:t xml:space="preserve"> </w:t>
-      </w:r>
-      <w:r>
-        <w:t xml:space="preserve">- 상태: [완료]</w:t>
-      </w:r>
-    </w:p>
-    <w:bookmarkEnd w:id="21"/>
-    <w:bookmarkStart w:id="22" w:name="ai-딥서치-보안seo아키텍처-전면-점검-및-수정"/>
-    <w:p>
-      <w:pPr>
-        <w:pStyle w:val="Heading3"/>
-      </w:pPr>
-      <w:r>
-        <w:t xml:space="preserve">[2026-04-21 10:30] 3-AI 딥서치 보안/SEO/아키텍처 전면 점검 및 수정</w:t>
-      </w:r>
-    </w:p>
-    <w:p>
-      <w:pPr>
-        <w:pStyle w:val="FirstParagraph"/>
-      </w:pPr>
-      <w:r>
-        <w:t xml:space="preserve">3개 AI(Claude+Codex+Gemini)로 프로젝트 전체를 보안, 성능, SEO, 아키텍처 관점에서 점검했습니다.</w:t>
-      </w:r>
-      <w:r>
-        <w:t xml:space="preserve"> </w:t>
-      </w:r>
-      <w:r>
-        <w:t xml:space="preserve">- 관리자 페이지 서버 인증 추가 (로그인 안 하면 관리자 화면 접근 불가)</w:t>
-      </w:r>
-      <w:r>
-        <w:t xml:space="preserve"> </w:t>
-      </w:r>
-      <w:r>
-        <w:t xml:space="preserve">- 관리자 이메일 코드 노출 제거 → 환경변수로 이동</w:t>
-      </w:r>
-      <w:r>
-        <w:t xml:space="preserve"> </w:t>
-      </w:r>
-      <w:r>
-        <w:t xml:space="preserve">- 회원가입 시 유저 프로필 자동 생성 트리거 추가 (SQL 필요)</w:t>
-      </w:r>
-      <w:r>
-        <w:t xml:space="preserve"> </w:t>
-      </w:r>
-      <w:r>
-        <w:t xml:space="preserve">- robots.txt 한국어 차단 해제 + sitemap hreflang 추가</w:t>
-      </w:r>
-      <w:r>
-        <w:t xml:space="preserve"> </w:t>
-      </w:r>
-      <w:r>
-        <w:t xml:space="preserve">- 404 페이지 사용자 언어 유지</w:t>
-      </w:r>
-      <w:r>
-        <w:t xml:space="preserve"> </w:t>
-      </w:r>
-      <w:r>
-        <w:t xml:space="preserve">- AI 검색/이벤트 페이지 하드코딩 → 8개 언어 번역</w:t>
-      </w:r>
-      <w:r>
-        <w:t xml:space="preserve"> </w:t>
-      </w:r>
-      <w:r>
-        <w:t xml:space="preserve">- 코드 중복 제거 (FLAIR_STYLE 등 공통 모듈화)</w:t>
+        <w:t xml:space="preserve">사용자 입력을 안전하게 처리하고, 관리자 기능의 보안을 높이는 작업입니다.</w:t>
+      </w:r>
+      <w:r>
+        <w:t xml:space="preserve"> </w:t>
+      </w:r>
+      <w:r>
+        <w:t xml:space="preserve">- 악성 코드 입력 방지(XSS) 기능 추가 — 댓글, 게시글 작성 시 자동 적용</w:t>
+      </w:r>
+      <w:r>
+        <w:t xml:space="preserve"> </w:t>
+      </w:r>
+      <w:r>
+        <w:t xml:space="preserve">- 관리자 버그 리포트 페이지: 브라우저에서 직접 DB 접근 → 서버 API 경유로 변경</w:t>
+      </w:r>
+      <w:r>
+        <w:t xml:space="preserve"> </w:t>
+      </w:r>
+      <w:r>
+        <w:t xml:space="preserve">- 로그인 후 이동 경로 조작 방지, 봇 차단(reCAPTCHA) 요청 제한 추가</w:t>
+      </w:r>
+      <w:r>
+        <w:t xml:space="preserve"> </w:t>
+      </w:r>
+      <w:r>
+        <w:t xml:space="preserve">- AI 번역 API 보안 강화, 에러 메시지에서 내부 정보 노출 제거</w:t>
+      </w:r>
+      <w:r>
+        <w:t xml:space="preserve"> </w:t>
+      </w:r>
+      <w:r>
+        <w:t xml:space="preserve">- 관리자 이메일 환경변수를 서버 전용으로 변경 (ADMIN_EMAILS)</w:t>
+      </w:r>
+      <w:r>
+        <w:t xml:space="preserve"> </w:t>
+      </w:r>
+      <w:r>
+        <w:t xml:space="preserve">- 방문자 카운트 동시 접속 시 누락 방지 개선</w:t>
+      </w:r>
+      <w:r>
+        <w:t xml:space="preserve"> </w:t>
+      </w:r>
+      <w:r>
+        <w:t xml:space="preserve">- 버튼 색상 통일 (파란색 #0071e3)</w:t>
       </w:r>
       <w:r>
         <w:t xml:space="preserve"> </w:t>
@@ -231,14 +147,74 @@
         </w:pict>
       </w:r>
     </w:p>
+    <w:bookmarkEnd w:id="21"/>
+    <w:bookmarkStart w:id="22" w:name="ai-재점검-하드코딩-잔여-7건-수정"/>
+    <w:p>
+      <w:pPr>
+        <w:pStyle w:val="Heading3"/>
+      </w:pPr>
+      <w:r>
+        <w:t xml:space="preserve">[2026-04-21 11:30] 3-AI 재점검 — 하드코딩 잔여 7건 수정</w:t>
+      </w:r>
+    </w:p>
+    <w:p>
+      <w:pPr>
+        <w:pStyle w:val="FirstParagraph"/>
+      </w:pPr>
+      <w:r>
+        <w:t xml:space="preserve">이전 수정이 올바른지 + 새로운 문제가 있는지 3개 AI로 재점검했습니다.</w:t>
+      </w:r>
+      <w:r>
+        <w:t xml:space="preserve"> </w:t>
+      </w:r>
+      <w:r>
+        <w:t xml:space="preserve">- sitemap에 잘못된 URL(404 발생) 수정</w:t>
+      </w:r>
+      <w:r>
+        <w:t xml:space="preserve"> </w:t>
+      </w:r>
+      <w:r>
+        <w:t xml:space="preserve">- 글쓰기 태그(Flair) 8개 언어 번역 적용</w:t>
+      </w:r>
+      <w:r>
+        <w:t xml:space="preserve"> </w:t>
+      </w:r>
+      <w:r>
+        <w:t xml:space="preserve">- 병원 타입 필터(전체/의원/병원) 8개 언어 번역 적용</w:t>
+      </w:r>
+      <w:r>
+        <w:t xml:space="preserve"> </w:t>
+      </w:r>
+      <w:r>
+        <w:t xml:space="preserve">- 코스메틱 출처/가격 표시 8개 언어 번역 적용</w:t>
+      </w:r>
+      <w:r>
+        <w:t xml:space="preserve"> </w:t>
+      </w:r>
+      <w:r>
+        <w:t xml:space="preserve">- 투표 실패 시 에러 메시지 반환하도록 개선</w:t>
+      </w:r>
+      <w:r>
+        <w:t xml:space="preserve"> </w:t>
+      </w:r>
+      <w:r>
+        <w:t xml:space="preserve">- 모달/검색 접근성 라벨 수정</w:t>
+      </w:r>
+      <w:r>
+        <w:t xml:space="preserve"> </w:t>
+      </w:r>
+      <w:r>
+        <w:t xml:space="preserve">- 상태: [완료]</w:t>
+      </w:r>
+    </w:p>
     <w:bookmarkEnd w:id="22"/>
-    <w:bookmarkStart w:id="23" w:name="외국인-유저-추가-이슈-일괄-수정-ccg-점검-2차"/>
+    <w:bookmarkStart w:id="23" w:name="ai-딥서치-보안seo아키텍처-전면-점검-및-수정"/>
     <w:p>
       <w:pPr>
         <w:pStyle w:val="Heading3"/>
       </w:pPr>
       <w:r>
-        <w:t xml:space="preserve">[2026-04-20 23:30] 외국인 유저 추가 이슈 일괄 수정 (CCG 점검 2차)</w:t>
+        <w:t xml:space="preserve">[2026-04-21 10:30] 3-AI 딥서치 보안/SEO/아키텍처 전면 점검 및 수정</w:t>
       </w:r>
     </w:p>
     <w:p>
@@ -246,43 +222,49 @@
         <w:pStyle w:val="FirstParagraph"/>
       </w:pPr>
       <w:r>
-        <w:t xml:space="preserve">3개 AI 점검에서 발견된 추가 문제 11건을 수정했습니다.</w:t>
-      </w:r>
-      <w:r>
-        <w:t xml:space="preserve"> </w:t>
-      </w:r>
-      <w:r>
-        <w:t xml:space="preserve">- 게시글 목록: 카테고리 매핑 오류 + 정렬 오류 수정</w:t>
-      </w:r>
-      <w:r>
-        <w:t xml:space="preserve"> </w:t>
-      </w:r>
-      <w:r>
-        <w:t xml:space="preserve">- 게���글 목록: 검색/삭제 버튼 8개 언어 번역 적용</w:t>
-      </w:r>
-      <w:r>
-        <w:t xml:space="preserve"> </w:t>
-      </w:r>
-      <w:r>
-        <w:t xml:space="preserve">- 게시글 상세: 날짜가 사용자 언어에 맞게 표시되도록 수정</w:t>
-      </w:r>
-      <w:r>
-        <w:t xml:space="preserve"> </w:t>
-      </w:r>
-      <w:r>
-        <w:t xml:space="preserve">- 추천/비추천: 새로고침해도 유지되도록 DB 저장 방식으로 변경</w:t>
-      </w:r>
-      <w:r>
-        <w:t xml:space="preserve"> </w:t>
-      </w:r>
-      <w:r>
-        <w:t xml:space="preserve">- 헤더: 모바일 메뉴 8개 언어 번역 + 긴 텍스트 잘림 방지</w:t>
-      </w:r>
-      <w:r>
-        <w:t xml:space="preserve"> </w:t>
-      </w:r>
-      <w:r>
-        <w:t xml:space="preserve">- 헤더: 언어 변경 시 검색 조건이 유지되도록 수정</w:t>
+        <w:t xml:space="preserve">3개 AI(Claude+Codex+Gemini)로 프로젝트 전체를 보안, 성능, SEO, 아키텍처 관점에서 점검했습니다.</w:t>
+      </w:r>
+      <w:r>
+        <w:t xml:space="preserve"> </w:t>
+      </w:r>
+      <w:r>
+        <w:t xml:space="preserve">- 관리자 페이지 서버 인증 추가 (로그인 안 하면 관리자 화면 접근 불가)</w:t>
+      </w:r>
+      <w:r>
+        <w:t xml:space="preserve"> </w:t>
+      </w:r>
+      <w:r>
+        <w:t xml:space="preserve">- 관리자 이메일 코드 노출 제거 → 환경변수로 이동</w:t>
+      </w:r>
+      <w:r>
+        <w:t xml:space="preserve"> </w:t>
+      </w:r>
+      <w:r>
+        <w:t xml:space="preserve">- 회원가입 시 유저 프로필 자동 생성 트리거 추가 (SQL 필요)</w:t>
+      </w:r>
+      <w:r>
+        <w:t xml:space="preserve"> </w:t>
+      </w:r>
+      <w:r>
+        <w:t xml:space="preserve">- robots.txt 한국어 차단 해제 + sitemap hreflang 추가</w:t>
+      </w:r>
+      <w:r>
+        <w:t xml:space="preserve"> </w:t>
+      </w:r>
+      <w:r>
+        <w:t xml:space="preserve">- 404 페이지 사용자 언어 유지</w:t>
+      </w:r>
+      <w:r>
+        <w:t xml:space="preserve"> </w:t>
+      </w:r>
+      <w:r>
+        <w:t xml:space="preserve">- AI 검색/이벤트 페이지 하드코딩 → 8개 언어 번역</w:t>
+      </w:r>
+      <w:r>
+        <w:t xml:space="preserve"> </w:t>
+      </w:r>
+      <w:r>
+        <w:t xml:space="preserve">- 코드 중복 제거 (FLAIR_STYLE 등 공통 모듈화)</w:t>
       </w:r>
       <w:r>
         <w:t xml:space="preserve"> </w:t>
@@ -299,13 +281,13 @@
       </w:r>
     </w:p>
     <w:bookmarkEnd w:id="23"/>
-    <w:bookmarkStart w:id="24" w:name="외국인-유저-글쓰기-다국어-완전-점검-및-수정"/>
+    <w:bookmarkStart w:id="24" w:name="외국인-유저-추가-이슈-일괄-수정-ccg-점검-2차"/>
     <w:p>
       <w:pPr>
         <w:pStyle w:val="Heading3"/>
       </w:pPr>
       <w:r>
-        <w:t xml:space="preserve">[2026-04-20 23:00] 외국인 유저 글쓰기 다국어 완전 점검 및 수정</w:t>
+        <w:t xml:space="preserve">[2026-04-20 23:30] 외국인 유저 추가 이슈 일괄 수정 (CCG 점검 2차)</w:t>
       </w:r>
     </w:p>
     <w:p>
@@ -313,43 +295,43 @@
         <w:pStyle w:val="FirstParagraph"/>
       </w:pPr>
       <w:r>
-        <w:t xml:space="preserve">외국인이 글을 쓸 때 발생하는 문제를 3개 AI(Claude+Codex+Gemini)로 전수 점검했습니다.</w:t>
-      </w:r>
-      <w:r>
-        <w:t xml:space="preserve"> </w:t>
-      </w:r>
-      <w:r>
-        <w:t xml:space="preserve">- 게시판 6개(K-POP, K-Food, K-Drama 등) 누락 → DB에 추가 완료</w:t>
-      </w:r>
-      <w:r>
-        <w:t xml:space="preserve"> </w:t>
-      </w:r>
-      <w:r>
-        <w:t xml:space="preserve">- 글쓰기 화면이 한국어/영어로만 표시되던 문제 → 8개 언어 번역 적용</w:t>
-      </w:r>
-      <w:r>
-        <w:t xml:space="preserve"> </w:t>
-      </w:r>
-      <w:r>
-        <w:t xml:space="preserve">- 이미지 업로드 에러가 한국어로만 뜨던 문제 → 8개 언어 지원</w:t>
-      </w:r>
-      <w:r>
-        <w:t xml:space="preserve"> </w:t>
-      </w:r>
-      <w:r>
-        <w:t xml:space="preserve">- 로그인 에러 메시지 8개 언어 지원</w:t>
-      </w:r>
-      <w:r>
-        <w:t xml:space="preserve"> </w:t>
-      </w:r>
-      <w:r>
-        <w:t xml:space="preserve">- 구글 로그인 후 언어가 영어로 바뀌던 문제 수정</w:t>
-      </w:r>
-      <w:r>
-        <w:t xml:space="preserve"> </w:t>
-      </w:r>
-      <w:r>
-        <w:t xml:space="preserve">- 댓글 삭제 시 권한 체크 오류 수정</w:t>
+        <w:t xml:space="preserve">3개 AI 점검에서 발견된 추가 문제 11건을 수정했습니다.</w:t>
+      </w:r>
+      <w:r>
+        <w:t xml:space="preserve"> </w:t>
+      </w:r>
+      <w:r>
+        <w:t xml:space="preserve">- 게시글 목록: 카테고리 매핑 오류 + 정렬 오류 수정</w:t>
+      </w:r>
+      <w:r>
+        <w:t xml:space="preserve"> </w:t>
+      </w:r>
+      <w:r>
+        <w:t xml:space="preserve">- 게���글 목록: 검색/삭제 버튼 8개 언어 번역 적용</w:t>
+      </w:r>
+      <w:r>
+        <w:t xml:space="preserve"> </w:t>
+      </w:r>
+      <w:r>
+        <w:t xml:space="preserve">- 게시글 상세: 날짜가 사용자 언어에 맞게 표시되도록 수정</w:t>
+      </w:r>
+      <w:r>
+        <w:t xml:space="preserve"> </w:t>
+      </w:r>
+      <w:r>
+        <w:t xml:space="preserve">- 추천/비추천: 새로고침해도 유지되도록 DB 저장 방식으로 변경</w:t>
+      </w:r>
+      <w:r>
+        <w:t xml:space="preserve"> </w:t>
+      </w:r>
+      <w:r>
+        <w:t xml:space="preserve">- 헤더: 모바일 메뉴 8개 언어 번역 + 긴 텍스트 잘림 방지</w:t>
+      </w:r>
+      <w:r>
+        <w:t xml:space="preserve"> </w:t>
+      </w:r>
+      <w:r>
+        <w:t xml:space="preserve">- 헤더: 언어 변경 시 검색 조건이 유지되도록 수정</w:t>
       </w:r>
       <w:r>
         <w:t xml:space="preserve"> </w:t>
@@ -366,7 +348,74 @@
       </w:r>
     </w:p>
     <w:bookmarkEnd w:id="24"/>
-    <w:bookmarkStart w:id="25" w:name="검색-연결-버그-수정-사이트-점검-기능-관리자-구글-로그인"/>
+    <w:bookmarkStart w:id="25" w:name="외국인-유저-글쓰기-다국어-완전-점검-및-수정"/>
+    <w:p>
+      <w:pPr>
+        <w:pStyle w:val="Heading3"/>
+      </w:pPr>
+      <w:r>
+        <w:t xml:space="preserve">[2026-04-20 23:00] 외국인 유저 글쓰기 다국어 완전 점검 및 수정</w:t>
+      </w:r>
+    </w:p>
+    <w:p>
+      <w:pPr>
+        <w:pStyle w:val="FirstParagraph"/>
+      </w:pPr>
+      <w:r>
+        <w:t xml:space="preserve">외국인이 글을 쓸 때 발생하는 문제를 3개 AI(Claude+Codex+Gemini)로 전수 점검했습니다.</w:t>
+      </w:r>
+      <w:r>
+        <w:t xml:space="preserve"> </w:t>
+      </w:r>
+      <w:r>
+        <w:t xml:space="preserve">- 게시판 6개(K-POP, K-Food, K-Drama 등) 누락 → DB에 추가 완료</w:t>
+      </w:r>
+      <w:r>
+        <w:t xml:space="preserve"> </w:t>
+      </w:r>
+      <w:r>
+        <w:t xml:space="preserve">- 글쓰기 화면이 한국어/영어로만 표시되던 문제 → 8개 언어 번역 적용</w:t>
+      </w:r>
+      <w:r>
+        <w:t xml:space="preserve"> </w:t>
+      </w:r>
+      <w:r>
+        <w:t xml:space="preserve">- 이미지 업로드 에러가 한국어로만 뜨던 문제 → 8개 언어 지원</w:t>
+      </w:r>
+      <w:r>
+        <w:t xml:space="preserve"> </w:t>
+      </w:r>
+      <w:r>
+        <w:t xml:space="preserve">- 로그인 에러 메시지 8개 언어 지원</w:t>
+      </w:r>
+      <w:r>
+        <w:t xml:space="preserve"> </w:t>
+      </w:r>
+      <w:r>
+        <w:t xml:space="preserve">- 구글 로그인 후 언어가 영어로 바뀌던 문제 수정</w:t>
+      </w:r>
+      <w:r>
+        <w:t xml:space="preserve"> </w:t>
+      </w:r>
+      <w:r>
+        <w:t xml:space="preserve">- 댓글 삭제 시 권한 체크 오류 수정</w:t>
+      </w:r>
+      <w:r>
+        <w:t xml:space="preserve"> </w:t>
+      </w:r>
+      <w:r>
+        <w:t xml:space="preserve">- 상태: [완료]</w:t>
+      </w:r>
+    </w:p>
+    <w:p>
+      <w:r>
+        <w:pict>
+          <v:rect style="width:0;height:1.5pt" o:hralign="center" o:hrstd="t" o:hr="t"/>
+        </w:pict>
+      </w:r>
+    </w:p>
+    <w:bookmarkEnd w:id="25"/>
+    <w:bookmarkStart w:id="26" w:name="검색-연결-버그-수정-사이트-점검-기능-관리자-구글-로그인"/>
     <w:p>
       <w:pPr>
         <w:pStyle w:val="Heading3"/>
@@ -536,8 +585,8 @@
         </w:pict>
       </w:r>
     </w:p>
-    <w:bookmarkEnd w:id="25"/>
-    <w:bookmarkStart w:id="26" w:name="데이터-동기화-수정-ai-검색-최소-10건-보장"/>
+    <w:bookmarkEnd w:id="26"/>
+    <w:bookmarkStart w:id="27" w:name="데이터-동기화-수정-ai-검색-최소-10건-보장"/>
     <w:p>
       <w:pPr>
         <w:pStyle w:val="Heading3"/>
@@ -659,8 +708,8 @@
         </w:pict>
       </w:r>
     </w:p>
-    <w:bookmarkEnd w:id="26"/>
-    <w:bookmarkStart w:id="27" w:name="관리자-패널-전면-개편-13단계-ai-검색-최적화"/>
+    <w:bookmarkEnd w:id="27"/>
+    <w:bookmarkStart w:id="28" w:name="관리자-패널-전면-개편-13단계-ai-검색-최적화"/>
     <w:p>
       <w:pPr>
         <w:pStyle w:val="Heading3"/>
@@ -830,8 +879,8 @@
         </w:pict>
       </w:r>
     </w:p>
-    <w:bookmarkEnd w:id="27"/>
-    <w:bookmarkStart w:id="28" w:name="화장품-순위-자동-수집-cron-구축"/>
+    <w:bookmarkEnd w:id="28"/>
+    <w:bookmarkStart w:id="29" w:name="화장품-순위-자동-수집-cron-구축"/>
     <w:p>
       <w:pPr>
         <w:pStyle w:val="Heading3"/>
@@ -911,8 +960,8 @@
         </w:pict>
       </w:r>
     </w:p>
-    <w:bookmarkEnd w:id="28"/>
-    <w:bookmarkStart w:id="29" w:name="highmedium-이슈-22건-일괄-수정"/>
+    <w:bookmarkEnd w:id="29"/>
+    <w:bookmarkStart w:id="30" w:name="highmedium-이슈-22건-일괄-수정"/>
     <w:p>
       <w:pPr>
         <w:pStyle w:val="Heading3"/>
@@ -1001,8 +1050,8 @@
         </w:pict>
       </w:r>
     </w:p>
-    <w:bookmarkEnd w:id="29"/>
-    <w:bookmarkStart w:id="30" w:name="ccg-3-ai-전체-기능-점검-critical-이슈-6건-수정"/>
+    <w:bookmarkEnd w:id="30"/>
+    <w:bookmarkStart w:id="31" w:name="ccg-3-ai-전체-기능-점검-critical-이슈-6건-수정"/>
     <w:p>
       <w:pPr>
         <w:pStyle w:val="Heading3"/>
@@ -3175,8 +3224,8 @@
         <w:t xml:space="preserve">- README.md 8개국 언어, 프로젝트 구조 현행화</w:t>
       </w:r>
     </w:p>
-    <w:bookmarkEnd w:id="30"/>
     <w:bookmarkEnd w:id="31"/>
+    <w:bookmarkEnd w:id="32"/>
     <w:sectPr/>
   </w:body>
 </w:document>

</xml_diff>

<commit_message>
docs: 내부 블로그 DEV_LOG + cron 래퍼 추가
Co-Authored-By: Claude Opus 4.6 (1M context) <noreply@anthropic.com>
</commit_message>
<xml_diff>
--- a/docs/exports/DEV_LOG.docx
+++ b/docs/exports/DEV_LOG.docx
@@ -2,7 +2,7 @@
 <file path=word/document.xml><?xml version="1.0" encoding="utf-8"?>
 <w:document xmlns:w="http://schemas.openxmlformats.org/wordprocessingml/2006/main" xmlns:m="http://schemas.openxmlformats.org/officeDocument/2006/math" xmlns:r="http://schemas.openxmlformats.org/officeDocument/2006/relationships" xmlns:o="urn:schemas-microsoft-com:office:office" xmlns:v="urn:schemas-microsoft-com:vml" xmlns:w10="urn:schemas-microsoft-com:office:word" xmlns:a="http://schemas.openxmlformats.org/drawingml/2006/main" xmlns:pic="http://schemas.openxmlformats.org/drawingml/2006/picture" xmlns:wp="http://schemas.openxmlformats.org/drawingml/2006/wordprocessingDrawing">
   <w:body>
-    <w:bookmarkStart w:id="33" w:name="개발-작업-기록-development-log"/>
+    <w:bookmarkStart w:id="34" w:name="개발-작업-기록-development-log"/>
     <w:p>
       <w:pPr>
         <w:pStyle w:val="Heading1"/>
@@ -26,13 +26,13 @@
         </w:pict>
       </w:r>
     </w:p>
-    <w:bookmarkStart w:id="20" w:name="프로그래매틱-seo-페이지-229개-자동-생성"/>
+    <w:bookmarkStart w:id="20" w:name="내부-블로그-시스템-자동-포스팅-구현"/>
     <w:p>
       <w:pPr>
         <w:pStyle w:val="Heading3"/>
       </w:pPr>
       <w:r>
-        <w:t xml:space="preserve">[2026-04-26 11:30] 프로그래매틱 SEO 페이지 229개 자동 생성</w:t>
+        <w:t xml:space="preserve">[2026-04-26 14:00] 내부 블로그 시스템 + 자동 포스팅 구현</w:t>
       </w:r>
     </w:p>
     <w:p>
@@ -40,19 +40,43 @@
         <w:pStyle w:val="FirstParagraph"/>
       </w:pPr>
       <w:r>
-        <w:t xml:space="preserve">구글 검색에서 외국인이 찾을 수 있도록 대량의 SEO 페이지를 자동으로 만들었습니다.</w:t>
-      </w:r>
-      <w:r>
-        <w:t xml:space="preserve"> </w:t>
-      </w:r>
-      <w:r>
-        <w:t xml:space="preserve">- 시술별 개별 페이지 39개: 코성형, 쌍꺼풀, 라식 등 각 시술의 비용·회복기간·FAQ 안내</w:t>
-      </w:r>
-      <w:r>
-        <w:t xml:space="preserve"> </w:t>
-      </w:r>
-      <w:r>
-        <w:t xml:space="preserve">- 시술×지역 조합 페이지 190개:</w:t>
+        <w:t xml:space="preserve">SEO 유입을 위한 내부 블로그를 만들었습니다. 매일 자동으로 글이 올라갑니다.</w:t>
+      </w:r>
+      <w:r>
+        <w:t xml:space="preserve"> </w:t>
+      </w:r>
+      <w:r>
+        <w:t xml:space="preserve">- 블로그 목록(/blog) + 상세 페이지(/blog/[slug]) 구현</w:t>
+      </w:r>
+      <w:r>
+        <w:t xml:space="preserve"> </w:t>
+      </w:r>
+      <w:r>
+        <w:t xml:space="preserve">- 매일 오후 3시(한국 시간) Claude AI가 K-뷰티 글 1개 자동 작성</w:t>
+      </w:r>
+      <w:r>
+        <w:t xml:space="preserve"> </w:t>
+      </w:r>
+      <w:r>
+        <w:t xml:space="preserve">- 8개 언어 자동 번역 포함, 메뉴에는 노출 안 함 (구글 검색 전용)</w:t>
+      </w:r>
+      <w:r>
+        <w:t xml:space="preserve"> </w:t>
+      </w:r>
+      <w:r>
+        <w:t xml:space="preserve">- 주제: 시술 가이드, 화장품 순위, FAQ, 비용 비교, 성분 분석, 의료관광 팁</w:t>
+      </w:r>
+      <w:r>
+        <w:t xml:space="preserve"> </w:t>
+      </w:r>
+      <w:r>
+        <w:t xml:space="preserve">- 병원명 가격비교 절대 금지 (평균 가격대만 표시)</w:t>
+      </w:r>
+      <w:r>
+        <w:t xml:space="preserve"> </w:t>
+      </w:r>
+      <w:r>
+        <w:t xml:space="preserve">-</w:t>
       </w:r>
       <w:r>
         <w:t xml:space="preserve"> </w:t>
@@ -61,13 +85,22 @@
         <w:t xml:space="preserve">“</w:t>
       </w:r>
       <w:r>
-        <w:t xml:space="preserve">강남 코성형 클리닉</w:t>
+        <w:t xml:space="preserve">AI 활용 제작</w:t>
       </w:r>
       <w:r>
         <w:t xml:space="preserve">”</w:t>
       </w:r>
       <w:r>
-        <w:t xml:space="preserve">,</w:t>
+        <w:t xml:space="preserve"> </w:t>
+      </w:r>
+      <w:r>
+        <w:t xml:space="preserve">표시 자동 삽입 (한국 법 준수)</w:t>
+      </w:r>
+      <w:r>
+        <w:t xml:space="preserve"> </w:t>
+      </w:r>
+      <w:r>
+        <w:t xml:space="preserve">- 첫 글 생성 완료:</w:t>
       </w:r>
       <w:r>
         <w:t xml:space="preserve"> </w:t>
@@ -76,28 +109,10 @@
         <w:t xml:space="preserve">“</w:t>
       </w:r>
       <w:r>
-        <w:t xml:space="preserve">부산 피부과</w:t>
+        <w:t xml:space="preserve">한국 코성형 완전 가이드</w:t>
       </w:r>
       <w:r>
         <w:t xml:space="preserve">”</w:t>
-      </w:r>
-      <w:r>
-        <w:t xml:space="preserve"> </w:t>
-      </w:r>
-      <w:r>
-        <w:t xml:space="preserve">등 검색 키워드 대응</w:t>
-      </w:r>
-      <w:r>
-        <w:t xml:space="preserve"> </w:t>
-      </w:r>
-      <w:r>
-        <w:t xml:space="preserve">- 8개 언어 지원 → 총 1,832개 URL이 구글 sitemap에 등록됨</w:t>
-      </w:r>
-      <w:r>
-        <w:t xml:space="preserve"> </w:t>
-      </w:r>
-      <w:r>
-        <w:t xml:space="preserve">- 각 페이지에 구조화 데이터(FAQ, 클리닉 목록) 포함 → 구글 리치 스니펫 노출 가능</w:t>
       </w:r>
       <w:r>
         <w:t xml:space="preserve"> </w:t>
@@ -114,13 +129,13 @@
       </w:r>
     </w:p>
     <w:bookmarkEnd w:id="20"/>
-    <w:bookmarkStart w:id="21" w:name="ai-추천-결과-공유-기능-추가"/>
+    <w:bookmarkStart w:id="21" w:name="프로그래매틱-seo-페이지-229개-자동-생성"/>
     <w:p>
       <w:pPr>
         <w:pStyle w:val="Heading3"/>
       </w:pPr>
       <w:r>
-        <w:t xml:space="preserve">[2026-04-26 10:00] AI 추천 결과 공유 기능 추가</w:t>
+        <w:t xml:space="preserve">[2026-04-26 11:30] 프로그래매틱 SEO 페이지 229개 자동 생성</w:t>
       </w:r>
     </w:p>
     <w:p>
@@ -128,25 +143,64 @@
         <w:pStyle w:val="FirstParagraph"/>
       </w:pPr>
       <w:r>
-        <w:t xml:space="preserve">AI 검색 결과를 친구에게 쉽게 공유할 수 있는 기능을 만들었습니다.</w:t>
-      </w:r>
-      <w:r>
-        <w:t xml:space="preserve"> </w:t>
-      </w:r>
-      <w:r>
-        <w:t xml:space="preserve">- 검색 결과 하단에 공유 패널 표시 (링크 복사, X(트위터), Facebook, 모바일 공유)</w:t>
-      </w:r>
-      <w:r>
-        <w:t xml:space="preserve"> </w:t>
-      </w:r>
-      <w:r>
-        <w:t xml:space="preserve">- 8개 언어 모두 지원 (한국어, 영어, 중국어, 일본어, 베트남어, 태국어, 러시아어, 몽골어)</w:t>
-      </w:r>
-      <w:r>
-        <w:t xml:space="preserve"> </w:t>
-      </w:r>
-      <w:r>
-        <w:t xml:space="preserve">- 공유받은 사람이 링크 클릭 시 같은 검색 결과 페이지로 바로 이동</w:t>
+        <w:t xml:space="preserve">구글 검색에서 외국인이 찾을 수 있도록 대량의 SEO 페이지를 자동으로 만들었습니다.</w:t>
+      </w:r>
+      <w:r>
+        <w:t xml:space="preserve"> </w:t>
+      </w:r>
+      <w:r>
+        <w:t xml:space="preserve">- 시술별 개별 페이지 39개: 코성형, 쌍꺼풀, 라식 등 각 시술의 비용·회복기간·FAQ 안내</w:t>
+      </w:r>
+      <w:r>
+        <w:t xml:space="preserve"> </w:t>
+      </w:r>
+      <w:r>
+        <w:t xml:space="preserve">- 시술×지역 조합 페이지 190개:</w:t>
+      </w:r>
+      <w:r>
+        <w:t xml:space="preserve"> </w:t>
+      </w:r>
+      <w:r>
+        <w:t xml:space="preserve">“</w:t>
+      </w:r>
+      <w:r>
+        <w:t xml:space="preserve">강남 코성형 클리닉</w:t>
+      </w:r>
+      <w:r>
+        <w:t xml:space="preserve">”</w:t>
+      </w:r>
+      <w:r>
+        <w:t xml:space="preserve">,</w:t>
+      </w:r>
+      <w:r>
+        <w:t xml:space="preserve"> </w:t>
+      </w:r>
+      <w:r>
+        <w:t xml:space="preserve">“</w:t>
+      </w:r>
+      <w:r>
+        <w:t xml:space="preserve">부산 피부과</w:t>
+      </w:r>
+      <w:r>
+        <w:t xml:space="preserve">”</w:t>
+      </w:r>
+      <w:r>
+        <w:t xml:space="preserve"> </w:t>
+      </w:r>
+      <w:r>
+        <w:t xml:space="preserve">등 검색 키워드 대응</w:t>
+      </w:r>
+      <w:r>
+        <w:t xml:space="preserve"> </w:t>
+      </w:r>
+      <w:r>
+        <w:t xml:space="preserve">- 8개 언어 지원 → 총 1,832개 URL이 구글 sitemap에 등록됨</w:t>
+      </w:r>
+      <w:r>
+        <w:t xml:space="preserve"> </w:t>
+      </w:r>
+      <w:r>
+        <w:t xml:space="preserve">- 각 페이지에 구조화 데이터(FAQ, 클리닉 목록) 포함 → 구글 리치 스니펫 노출 가능</w:t>
       </w:r>
       <w:r>
         <w:t xml:space="preserve"> </w:t>
@@ -163,13 +217,13 @@
       </w:r>
     </w:p>
     <w:bookmarkEnd w:id="21"/>
-    <w:bookmarkStart w:id="22" w:name="보안-강화-및-코드-품질-개선"/>
+    <w:bookmarkStart w:id="22" w:name="ai-추천-결과-공유-기능-추가"/>
     <w:p>
       <w:pPr>
         <w:pStyle w:val="Heading3"/>
       </w:pPr>
       <w:r>
-        <w:t xml:space="preserve">[2026-04-25 14:00] 보안 강화 및 코드 품질 개선</w:t>
+        <w:t xml:space="preserve">[2026-04-26 10:00] AI 추천 결과 공유 기능 추가</w:t>
       </w:r>
     </w:p>
     <w:p>
@@ -177,55 +231,31 @@
         <w:pStyle w:val="FirstParagraph"/>
       </w:pPr>
       <w:r>
-        <w:t xml:space="preserve">사용자 입력을 안전하게 처리하고, 관리자 기능의 보안을 높이는 작업입니다.</w:t>
-      </w:r>
-      <w:r>
-        <w:t xml:space="preserve"> </w:t>
-      </w:r>
-      <w:r>
-        <w:t xml:space="preserve">- 악성 코드 입력 방지(XSS) 기능 추가 — 댓글, 게시글 작성 시 자동 적용</w:t>
-      </w:r>
-      <w:r>
-        <w:t xml:space="preserve"> </w:t>
-      </w:r>
-      <w:r>
-        <w:t xml:space="preserve">- 관리자 버그 리포트 페이지: 브라우저에서 직접 DB 접근 → 서버 API 경유로 변경</w:t>
-      </w:r>
-      <w:r>
-        <w:t xml:space="preserve"> </w:t>
-      </w:r>
-      <w:r>
-        <w:t xml:space="preserve">- 로그인 후 이동 경로 조작 방지, 봇 차단(reCAPTCHA) 요청 제한 추가</w:t>
-      </w:r>
-      <w:r>
-        <w:t xml:space="preserve"> </w:t>
-      </w:r>
-      <w:r>
-        <w:t xml:space="preserve">- AI 번역 API 보안 강화, 에러 메시지에서 내부 정보 노출 제거</w:t>
-      </w:r>
-      <w:r>
-        <w:t xml:space="preserve"> </w:t>
-      </w:r>
-      <w:r>
-        <w:t xml:space="preserve">- 관리자 이메일 환경변수를 서버 전용으로 변경 (ADMIN_EMAILS)</w:t>
-      </w:r>
-      <w:r>
-        <w:t xml:space="preserve"> </w:t>
-      </w:r>
-      <w:r>
-        <w:t xml:space="preserve">- 방문자 카운트 동시 접속 시 누락 방지 개선</w:t>
-      </w:r>
-      <w:r>
-        <w:t xml:space="preserve"> </w:t>
-      </w:r>
-      <w:r>
-        <w:t xml:space="preserve">- 버튼 색상 통일 (파란색 #0071e3)</w:t>
-      </w:r>
-      <w:r>
-        <w:t xml:space="preserve"> </w:t>
-      </w:r>
-      <w:r>
-        <w:t xml:space="preserve">- 상태: [완료]</w:t>
+        <w:t xml:space="preserve">AI 검색 결과를 친구에게 쉽게 공유할 수 있는 기능을 만들었습니다.</w:t>
+      </w:r>
+      <w:r>
+        <w:t xml:space="preserve"> </w:t>
+      </w:r>
+      <w:r>
+        <w:t xml:space="preserve">- 검색 결과 하단에 공유 패널 표시 (링크 복사, X(트위터), Facebook, 모바일 공유)</w:t>
+      </w:r>
+      <w:r>
+        <w:t xml:space="preserve"> </w:t>
+      </w:r>
+      <w:r>
+        <w:t xml:space="preserve">- 8개 언어 모두 지원 (한국어, 영어, 중국어, 일본어, 베트남어, 태국어, 러시아어, 몽골어)</w:t>
+      </w:r>
+      <w:r>
+        <w:t xml:space="preserve"> </w:t>
+      </w:r>
+      <w:r>
+        <w:t xml:space="preserve">- 공유받은 사람이 링크 클릭 시 같은 검색 결과 페이지로 바로 이동</w:t>
+      </w:r>
+      <w:r>
+        <w:t xml:space="preserve"> </w:t>
+      </w:r>
+      <w:r>
+        <w:t xml:space="preserve">- [완료]</w:t>
       </w:r>
     </w:p>
     <w:p>
@@ -236,13 +266,13 @@
       </w:r>
     </w:p>
     <w:bookmarkEnd w:id="22"/>
-    <w:bookmarkStart w:id="23" w:name="ai-재점검-하드코딩-잔여-7건-수정"/>
+    <w:bookmarkStart w:id="23" w:name="보안-강화-및-코드-품질-개선"/>
     <w:p>
       <w:pPr>
         <w:pStyle w:val="Heading3"/>
       </w:pPr>
       <w:r>
-        <w:t xml:space="preserve">[2026-04-21 11:30] 3-AI 재점검 — 하드코딩 잔여 7건 수정</w:t>
+        <w:t xml:space="preserve">[2026-04-25 14:00] 보안 강화 및 코드 품질 개선</w:t>
       </w:r>
     </w:p>
     <w:p>
@@ -250,109 +280,49 @@
         <w:pStyle w:val="FirstParagraph"/>
       </w:pPr>
       <w:r>
-        <w:t xml:space="preserve">이전 수정이 올바른지 + 새로운 문제가 있는지 3개 AI로 재점검했습니다.</w:t>
-      </w:r>
-      <w:r>
-        <w:t xml:space="preserve"> </w:t>
-      </w:r>
-      <w:r>
-        <w:t xml:space="preserve">- sitemap에 잘못된 URL(404 발생) 수정</w:t>
-      </w:r>
-      <w:r>
-        <w:t xml:space="preserve"> </w:t>
-      </w:r>
-      <w:r>
-        <w:t xml:space="preserve">- 글쓰기 태그(Flair) 8개 언어 번역 적용</w:t>
-      </w:r>
-      <w:r>
-        <w:t xml:space="preserve"> </w:t>
-      </w:r>
-      <w:r>
-        <w:t xml:space="preserve">- 병원 타입 필터(전체/의원/병원) 8개 언어 번역 적용</w:t>
-      </w:r>
-      <w:r>
-        <w:t xml:space="preserve"> </w:t>
-      </w:r>
-      <w:r>
-        <w:t xml:space="preserve">- 코스메틱 출처/가격 표시 8개 언어 번역 적용</w:t>
-      </w:r>
-      <w:r>
-        <w:t xml:space="preserve"> </w:t>
-      </w:r>
-      <w:r>
-        <w:t xml:space="preserve">- 투표 실패 시 에러 메시지 반환하도록 개선</w:t>
-      </w:r>
-      <w:r>
-        <w:t xml:space="preserve"> </w:t>
-      </w:r>
-      <w:r>
-        <w:t xml:space="preserve">- 모달/검색 접근성 라벨 수정</w:t>
-      </w:r>
-      <w:r>
-        <w:t xml:space="preserve"> </w:t>
-      </w:r>
-      <w:r>
-        <w:t xml:space="preserve">- 상태: [완료]</w:t>
-      </w:r>
-    </w:p>
-    <w:bookmarkEnd w:id="23"/>
-    <w:bookmarkStart w:id="24" w:name="ai-딥서치-보안seo아키텍처-전면-점검-및-수정"/>
-    <w:p>
-      <w:pPr>
-        <w:pStyle w:val="Heading3"/>
-      </w:pPr>
-      <w:r>
-        <w:t xml:space="preserve">[2026-04-21 10:30] 3-AI 딥서치 보안/SEO/아키텍처 전면 점검 및 수정</w:t>
-      </w:r>
-    </w:p>
-    <w:p>
-      <w:pPr>
-        <w:pStyle w:val="FirstParagraph"/>
-      </w:pPr>
-      <w:r>
-        <w:t xml:space="preserve">3개 AI(Claude+Codex+Gemini)로 프로젝트 전체를 보안, 성능, SEO, 아키텍처 관점에서 점검했습니다.</w:t>
-      </w:r>
-      <w:r>
-        <w:t xml:space="preserve"> </w:t>
-      </w:r>
-      <w:r>
-        <w:t xml:space="preserve">- 관리자 페이지 서버 인증 추가 (로그인 안 하면 관리자 화면 접근 불가)</w:t>
-      </w:r>
-      <w:r>
-        <w:t xml:space="preserve"> </w:t>
-      </w:r>
-      <w:r>
-        <w:t xml:space="preserve">- 관리자 이메일 코드 노출 제거 → 환경변수로 이동</w:t>
-      </w:r>
-      <w:r>
-        <w:t xml:space="preserve"> </w:t>
-      </w:r>
-      <w:r>
-        <w:t xml:space="preserve">- 회원가입 시 유저 프로필 자동 생성 트리거 추가 (SQL 필요)</w:t>
-      </w:r>
-      <w:r>
-        <w:t xml:space="preserve"> </w:t>
-      </w:r>
-      <w:r>
-        <w:t xml:space="preserve">- robots.txt 한국어 차단 해제 + sitemap hreflang 추가</w:t>
-      </w:r>
-      <w:r>
-        <w:t xml:space="preserve"> </w:t>
-      </w:r>
-      <w:r>
-        <w:t xml:space="preserve">- 404 페이지 사용자 언어 유지</w:t>
-      </w:r>
-      <w:r>
-        <w:t xml:space="preserve"> </w:t>
-      </w:r>
-      <w:r>
-        <w:t xml:space="preserve">- AI 검색/이벤트 페이지 하드코딩 → 8개 언어 번역</w:t>
-      </w:r>
-      <w:r>
-        <w:t xml:space="preserve"> </w:t>
-      </w:r>
-      <w:r>
-        <w:t xml:space="preserve">- 코드 중복 제거 (FLAIR_STYLE 등 공통 모듈화)</w:t>
+        <w:t xml:space="preserve">사용자 입력을 안전하게 처리하고, 관리자 기능의 보안을 높이는 작업입니다.</w:t>
+      </w:r>
+      <w:r>
+        <w:t xml:space="preserve"> </w:t>
+      </w:r>
+      <w:r>
+        <w:t xml:space="preserve">- 악성 코드 입력 방지(XSS) 기능 추가 — 댓글, 게시글 작성 시 자동 적용</w:t>
+      </w:r>
+      <w:r>
+        <w:t xml:space="preserve"> </w:t>
+      </w:r>
+      <w:r>
+        <w:t xml:space="preserve">- 관리자 버그 리포트 페이지: 브라우저에서 직접 DB 접근 → 서버 API 경유로 변경</w:t>
+      </w:r>
+      <w:r>
+        <w:t xml:space="preserve"> </w:t>
+      </w:r>
+      <w:r>
+        <w:t xml:space="preserve">- 로그인 후 이동 경로 조작 방지, 봇 차단(reCAPTCHA) 요청 제한 추가</w:t>
+      </w:r>
+      <w:r>
+        <w:t xml:space="preserve"> </w:t>
+      </w:r>
+      <w:r>
+        <w:t xml:space="preserve">- AI 번역 API 보안 강화, 에러 메시지에서 내부 정보 노출 제거</w:t>
+      </w:r>
+      <w:r>
+        <w:t xml:space="preserve"> </w:t>
+      </w:r>
+      <w:r>
+        <w:t xml:space="preserve">- 관리자 이메일 환경변수를 서버 전용으로 변경 (ADMIN_EMAILS)</w:t>
+      </w:r>
+      <w:r>
+        <w:t xml:space="preserve"> </w:t>
+      </w:r>
+      <w:r>
+        <w:t xml:space="preserve">- 방문자 카운트 동시 접속 시 누락 방지 개선</w:t>
+      </w:r>
+      <w:r>
+        <w:t xml:space="preserve"> </w:t>
+      </w:r>
+      <w:r>
+        <w:t xml:space="preserve">- 버튼 색상 통일 (파란색 #0071e3)</w:t>
       </w:r>
       <w:r>
         <w:t xml:space="preserve"> </w:t>
@@ -368,14 +338,74 @@
         </w:pict>
       </w:r>
     </w:p>
+    <w:bookmarkEnd w:id="23"/>
+    <w:bookmarkStart w:id="24" w:name="ai-재점검-하드코딩-잔여-7건-수정"/>
+    <w:p>
+      <w:pPr>
+        <w:pStyle w:val="Heading3"/>
+      </w:pPr>
+      <w:r>
+        <w:t xml:space="preserve">[2026-04-21 11:30] 3-AI 재점검 — 하드코딩 잔여 7건 수정</w:t>
+      </w:r>
+    </w:p>
+    <w:p>
+      <w:pPr>
+        <w:pStyle w:val="FirstParagraph"/>
+      </w:pPr>
+      <w:r>
+        <w:t xml:space="preserve">이전 수정이 올바른지 + 새로운 문제가 있는지 3개 AI로 재점검했습니다.</w:t>
+      </w:r>
+      <w:r>
+        <w:t xml:space="preserve"> </w:t>
+      </w:r>
+      <w:r>
+        <w:t xml:space="preserve">- sitemap에 잘못된 URL(404 발생) 수정</w:t>
+      </w:r>
+      <w:r>
+        <w:t xml:space="preserve"> </w:t>
+      </w:r>
+      <w:r>
+        <w:t xml:space="preserve">- 글쓰기 태그(Flair) 8개 언어 번역 적용</w:t>
+      </w:r>
+      <w:r>
+        <w:t xml:space="preserve"> </w:t>
+      </w:r>
+      <w:r>
+        <w:t xml:space="preserve">- 병원 타입 필터(전체/의원/병원) 8개 언어 번역 적용</w:t>
+      </w:r>
+      <w:r>
+        <w:t xml:space="preserve"> </w:t>
+      </w:r>
+      <w:r>
+        <w:t xml:space="preserve">- 코스메틱 출처/가격 표시 8개 언어 번역 적용</w:t>
+      </w:r>
+      <w:r>
+        <w:t xml:space="preserve"> </w:t>
+      </w:r>
+      <w:r>
+        <w:t xml:space="preserve">- 투표 실패 시 에러 메시지 반환하도록 개선</w:t>
+      </w:r>
+      <w:r>
+        <w:t xml:space="preserve"> </w:t>
+      </w:r>
+      <w:r>
+        <w:t xml:space="preserve">- 모달/검색 접근성 라벨 수정</w:t>
+      </w:r>
+      <w:r>
+        <w:t xml:space="preserve"> </w:t>
+      </w:r>
+      <w:r>
+        <w:t xml:space="preserve">- 상태: [완료]</w:t>
+      </w:r>
+    </w:p>
     <w:bookmarkEnd w:id="24"/>
-    <w:bookmarkStart w:id="25" w:name="외국인-유저-추가-이슈-일괄-수정-ccg-점검-2차"/>
+    <w:bookmarkStart w:id="25" w:name="ai-딥서치-보안seo아키텍처-전면-점검-및-수정"/>
     <w:p>
       <w:pPr>
         <w:pStyle w:val="Heading3"/>
       </w:pPr>
       <w:r>
-        <w:t xml:space="preserve">[2026-04-20 23:30] 외국인 유저 추가 이슈 일괄 수정 (CCG 점검 2차)</w:t>
+        <w:t xml:space="preserve">[2026-04-21 10:30] 3-AI 딥서치 보안/SEO/아키텍처 전면 점검 및 수정</w:t>
       </w:r>
     </w:p>
     <w:p>
@@ -383,43 +413,49 @@
         <w:pStyle w:val="FirstParagraph"/>
       </w:pPr>
       <w:r>
-        <w:t xml:space="preserve">3개 AI 점검에서 발견된 추가 문제 11건을 수정했습니다.</w:t>
-      </w:r>
-      <w:r>
-        <w:t xml:space="preserve"> </w:t>
-      </w:r>
-      <w:r>
-        <w:t xml:space="preserve">- 게시글 목록: 카테고리 매핑 오류 + 정렬 오류 수정</w:t>
-      </w:r>
-      <w:r>
-        <w:t xml:space="preserve"> </w:t>
-      </w:r>
-      <w:r>
-        <w:t xml:space="preserve">- 게���글 목록: 검색/삭제 버튼 8개 언어 번역 적용</w:t>
-      </w:r>
-      <w:r>
-        <w:t xml:space="preserve"> </w:t>
-      </w:r>
-      <w:r>
-        <w:t xml:space="preserve">- 게시글 상세: 날짜가 사용자 언어에 맞게 표시되도록 수정</w:t>
-      </w:r>
-      <w:r>
-        <w:t xml:space="preserve"> </w:t>
-      </w:r>
-      <w:r>
-        <w:t xml:space="preserve">- 추천/비추천: 새로고침해도 유지되도록 DB 저장 방식으로 변경</w:t>
-      </w:r>
-      <w:r>
-        <w:t xml:space="preserve"> </w:t>
-      </w:r>
-      <w:r>
-        <w:t xml:space="preserve">- 헤더: 모바일 메뉴 8개 언어 번역 + 긴 텍스트 잘림 방지</w:t>
-      </w:r>
-      <w:r>
-        <w:t xml:space="preserve"> </w:t>
-      </w:r>
-      <w:r>
-        <w:t xml:space="preserve">- 헤더: 언어 변경 시 검색 조건이 유지되도록 수정</w:t>
+        <w:t xml:space="preserve">3개 AI(Claude+Codex+Gemini)로 프로젝트 전체를 보안, 성능, SEO, 아키텍처 관점에서 점검했습니다.</w:t>
+      </w:r>
+      <w:r>
+        <w:t xml:space="preserve"> </w:t>
+      </w:r>
+      <w:r>
+        <w:t xml:space="preserve">- 관리자 페이지 서버 인증 추가 (로그인 안 하면 관리자 화면 접근 불가)</w:t>
+      </w:r>
+      <w:r>
+        <w:t xml:space="preserve"> </w:t>
+      </w:r>
+      <w:r>
+        <w:t xml:space="preserve">- 관리자 이메일 코드 노출 제거 → 환경변수로 이동</w:t>
+      </w:r>
+      <w:r>
+        <w:t xml:space="preserve"> </w:t>
+      </w:r>
+      <w:r>
+        <w:t xml:space="preserve">- 회원가입 시 유저 프로필 자동 생성 트리거 추가 (SQL 필요)</w:t>
+      </w:r>
+      <w:r>
+        <w:t xml:space="preserve"> </w:t>
+      </w:r>
+      <w:r>
+        <w:t xml:space="preserve">- robots.txt 한국어 차단 해제 + sitemap hreflang 추가</w:t>
+      </w:r>
+      <w:r>
+        <w:t xml:space="preserve"> </w:t>
+      </w:r>
+      <w:r>
+        <w:t xml:space="preserve">- 404 페이지 사용자 언어 유지</w:t>
+      </w:r>
+      <w:r>
+        <w:t xml:space="preserve"> </w:t>
+      </w:r>
+      <w:r>
+        <w:t xml:space="preserve">- AI 검색/이벤트 페이지 하드코딩 → 8개 언어 번역</w:t>
+      </w:r>
+      <w:r>
+        <w:t xml:space="preserve"> </w:t>
+      </w:r>
+      <w:r>
+        <w:t xml:space="preserve">- 코드 중복 제거 (FLAIR_STYLE 등 공통 모듈화)</w:t>
       </w:r>
       <w:r>
         <w:t xml:space="preserve"> </w:t>
@@ -436,13 +472,13 @@
       </w:r>
     </w:p>
     <w:bookmarkEnd w:id="25"/>
-    <w:bookmarkStart w:id="26" w:name="외국인-유저-글쓰기-다국어-완전-점검-및-수정"/>
+    <w:bookmarkStart w:id="26" w:name="외국인-유저-추가-이슈-일괄-수정-ccg-점검-2차"/>
     <w:p>
       <w:pPr>
         <w:pStyle w:val="Heading3"/>
       </w:pPr>
       <w:r>
-        <w:t xml:space="preserve">[2026-04-20 23:00] 외국인 유저 글쓰기 다국어 완전 점검 및 수정</w:t>
+        <w:t xml:space="preserve">[2026-04-20 23:30] 외국인 유저 추가 이슈 일괄 수정 (CCG 점검 2차)</w:t>
       </w:r>
     </w:p>
     <w:p>
@@ -450,43 +486,43 @@
         <w:pStyle w:val="FirstParagraph"/>
       </w:pPr>
       <w:r>
-        <w:t xml:space="preserve">외국인이 글을 쓸 때 발생하는 문제를 3개 AI(Claude+Codex+Gemini)로 전수 점검했습니다.</w:t>
-      </w:r>
-      <w:r>
-        <w:t xml:space="preserve"> </w:t>
-      </w:r>
-      <w:r>
-        <w:t xml:space="preserve">- 게시판 6개(K-POP, K-Food, K-Drama 등) 누락 → DB에 추가 완료</w:t>
-      </w:r>
-      <w:r>
-        <w:t xml:space="preserve"> </w:t>
-      </w:r>
-      <w:r>
-        <w:t xml:space="preserve">- 글쓰기 화면이 한국어/영어로만 표시되던 문제 → 8개 언어 번역 적용</w:t>
-      </w:r>
-      <w:r>
-        <w:t xml:space="preserve"> </w:t>
-      </w:r>
-      <w:r>
-        <w:t xml:space="preserve">- 이미지 업로드 에러가 한국어로만 뜨던 문제 → 8개 언어 지원</w:t>
-      </w:r>
-      <w:r>
-        <w:t xml:space="preserve"> </w:t>
-      </w:r>
-      <w:r>
-        <w:t xml:space="preserve">- 로그인 에러 메시지 8개 언어 지원</w:t>
-      </w:r>
-      <w:r>
-        <w:t xml:space="preserve"> </w:t>
-      </w:r>
-      <w:r>
-        <w:t xml:space="preserve">- 구글 로그인 후 언어가 영어로 바뀌던 문제 수정</w:t>
-      </w:r>
-      <w:r>
-        <w:t xml:space="preserve"> </w:t>
-      </w:r>
-      <w:r>
-        <w:t xml:space="preserve">- 댓글 삭제 시 권한 체크 오류 수정</w:t>
+        <w:t xml:space="preserve">3개 AI 점검에서 발견된 추가 문제 11건을 수정했습니다.</w:t>
+      </w:r>
+      <w:r>
+        <w:t xml:space="preserve"> </w:t>
+      </w:r>
+      <w:r>
+        <w:t xml:space="preserve">- 게시글 목록: 카테고리 매핑 오류 + 정렬 오류 수정</w:t>
+      </w:r>
+      <w:r>
+        <w:t xml:space="preserve"> </w:t>
+      </w:r>
+      <w:r>
+        <w:t xml:space="preserve">- 게���글 목록: 검색/삭제 버튼 8개 언어 번역 적용</w:t>
+      </w:r>
+      <w:r>
+        <w:t xml:space="preserve"> </w:t>
+      </w:r>
+      <w:r>
+        <w:t xml:space="preserve">- 게시글 상세: 날짜가 사용자 언어에 맞게 표시되도록 수정</w:t>
+      </w:r>
+      <w:r>
+        <w:t xml:space="preserve"> </w:t>
+      </w:r>
+      <w:r>
+        <w:t xml:space="preserve">- 추천/비추천: 새로고침해도 유지되도록 DB 저장 방식으로 변경</w:t>
+      </w:r>
+      <w:r>
+        <w:t xml:space="preserve"> </w:t>
+      </w:r>
+      <w:r>
+        <w:t xml:space="preserve">- 헤더: 모바일 메뉴 8개 언어 번역 + 긴 텍스트 잘림 방지</w:t>
+      </w:r>
+      <w:r>
+        <w:t xml:space="preserve"> </w:t>
+      </w:r>
+      <w:r>
+        <w:t xml:space="preserve">- 헤더: 언어 변경 시 검색 조건이 유지되도록 수정</w:t>
       </w:r>
       <w:r>
         <w:t xml:space="preserve"> </w:t>
@@ -503,7 +539,74 @@
       </w:r>
     </w:p>
     <w:bookmarkEnd w:id="26"/>
-    <w:bookmarkStart w:id="27" w:name="검색-연결-버그-수정-사이트-점검-기능-관리자-구글-로그인"/>
+    <w:bookmarkStart w:id="27" w:name="외국인-유저-글쓰기-다국어-완전-점검-및-수정"/>
+    <w:p>
+      <w:pPr>
+        <w:pStyle w:val="Heading3"/>
+      </w:pPr>
+      <w:r>
+        <w:t xml:space="preserve">[2026-04-20 23:00] 외국인 유저 글쓰기 다국어 완전 점검 및 수정</w:t>
+      </w:r>
+    </w:p>
+    <w:p>
+      <w:pPr>
+        <w:pStyle w:val="FirstParagraph"/>
+      </w:pPr>
+      <w:r>
+        <w:t xml:space="preserve">외국인이 글을 쓸 때 발생하는 문제를 3개 AI(Claude+Codex+Gemini)로 전수 점검했습니다.</w:t>
+      </w:r>
+      <w:r>
+        <w:t xml:space="preserve"> </w:t>
+      </w:r>
+      <w:r>
+        <w:t xml:space="preserve">- 게시판 6개(K-POP, K-Food, K-Drama 등) 누락 → DB에 추가 완료</w:t>
+      </w:r>
+      <w:r>
+        <w:t xml:space="preserve"> </w:t>
+      </w:r>
+      <w:r>
+        <w:t xml:space="preserve">- 글쓰기 화면이 한국어/영어로만 표시되던 문제 → 8개 언어 번역 적용</w:t>
+      </w:r>
+      <w:r>
+        <w:t xml:space="preserve"> </w:t>
+      </w:r>
+      <w:r>
+        <w:t xml:space="preserve">- 이미지 업로드 에러가 한국어로만 뜨던 문제 → 8개 언어 지원</w:t>
+      </w:r>
+      <w:r>
+        <w:t xml:space="preserve"> </w:t>
+      </w:r>
+      <w:r>
+        <w:t xml:space="preserve">- 로그인 에러 메시지 8개 언어 지원</w:t>
+      </w:r>
+      <w:r>
+        <w:t xml:space="preserve"> </w:t>
+      </w:r>
+      <w:r>
+        <w:t xml:space="preserve">- 구글 로그인 후 언어가 영어로 바뀌던 문제 수정</w:t>
+      </w:r>
+      <w:r>
+        <w:t xml:space="preserve"> </w:t>
+      </w:r>
+      <w:r>
+        <w:t xml:space="preserve">- 댓글 삭제 시 권한 체크 오류 수정</w:t>
+      </w:r>
+      <w:r>
+        <w:t xml:space="preserve"> </w:t>
+      </w:r>
+      <w:r>
+        <w:t xml:space="preserve">- 상태: [완료]</w:t>
+      </w:r>
+    </w:p>
+    <w:p>
+      <w:r>
+        <w:pict>
+          <v:rect style="width:0;height:1.5pt" o:hralign="center" o:hrstd="t" o:hr="t"/>
+        </w:pict>
+      </w:r>
+    </w:p>
+    <w:bookmarkEnd w:id="27"/>
+    <w:bookmarkStart w:id="28" w:name="검색-연결-버그-수정-사이트-점검-기능-관리자-구글-로그인"/>
     <w:p>
       <w:pPr>
         <w:pStyle w:val="Heading3"/>
@@ -673,8 +776,8 @@
         </w:pict>
       </w:r>
     </w:p>
-    <w:bookmarkEnd w:id="27"/>
-    <w:bookmarkStart w:id="28" w:name="데이터-동기화-수정-ai-검색-최소-10건-보장"/>
+    <w:bookmarkEnd w:id="28"/>
+    <w:bookmarkStart w:id="29" w:name="데이터-동기화-수정-ai-검색-최소-10건-보장"/>
     <w:p>
       <w:pPr>
         <w:pStyle w:val="Heading3"/>
@@ -796,8 +899,8 @@
         </w:pict>
       </w:r>
     </w:p>
-    <w:bookmarkEnd w:id="28"/>
-    <w:bookmarkStart w:id="29" w:name="관리자-패널-전면-개편-13단계-ai-검색-최적화"/>
+    <w:bookmarkEnd w:id="29"/>
+    <w:bookmarkStart w:id="30" w:name="관리자-패널-전면-개편-13단계-ai-검색-최적화"/>
     <w:p>
       <w:pPr>
         <w:pStyle w:val="Heading3"/>
@@ -967,8 +1070,8 @@
         </w:pict>
       </w:r>
     </w:p>
-    <w:bookmarkEnd w:id="29"/>
-    <w:bookmarkStart w:id="30" w:name="화장품-순위-자동-수집-cron-구축"/>
+    <w:bookmarkEnd w:id="30"/>
+    <w:bookmarkStart w:id="31" w:name="화장품-순위-자동-수집-cron-구축"/>
     <w:p>
       <w:pPr>
         <w:pStyle w:val="Heading3"/>
@@ -1048,8 +1151,8 @@
         </w:pict>
       </w:r>
     </w:p>
-    <w:bookmarkEnd w:id="30"/>
-    <w:bookmarkStart w:id="31" w:name="highmedium-이슈-22건-일괄-수정"/>
+    <w:bookmarkEnd w:id="31"/>
+    <w:bookmarkStart w:id="32" w:name="highmedium-이슈-22건-일괄-수정"/>
     <w:p>
       <w:pPr>
         <w:pStyle w:val="Heading3"/>
@@ -1138,8 +1241,8 @@
         </w:pict>
       </w:r>
     </w:p>
-    <w:bookmarkEnd w:id="31"/>
-    <w:bookmarkStart w:id="32" w:name="ccg-3-ai-전체-기능-점검-critical-이슈-6건-수정"/>
+    <w:bookmarkEnd w:id="32"/>
+    <w:bookmarkStart w:id="33" w:name="ccg-3-ai-전체-기능-점검-critical-이슈-6건-수정"/>
     <w:p>
       <w:pPr>
         <w:pStyle w:val="Heading3"/>
@@ -3312,8 +3415,8 @@
         <w:t xml:space="preserve">- README.md 8개국 언어, 프로젝트 구조 현행화</w:t>
       </w:r>
     </w:p>
-    <w:bookmarkEnd w:id="32"/>
     <w:bookmarkEnd w:id="33"/>
+    <w:bookmarkEnd w:id="34"/>
     <w:sectPr/>
   </w:body>
 </w:document>

</xml_diff>

<commit_message>
docs: 2026-05-02 작업 기록 업데이트 (DNS, 블로그 수정, SEO, 쇼츠)
Co-Authored-By: Claude Opus 4.6 (1M context) <noreply@anthropic.com>
</commit_message>
<xml_diff>
--- a/docs/exports/DEV_LOG.docx
+++ b/docs/exports/DEV_LOG.docx
@@ -2,7 +2,7 @@
 <file path=word/document.xml><?xml version="1.0" encoding="utf-8"?>
 <w:document xmlns:w="http://schemas.openxmlformats.org/wordprocessingml/2006/main" xmlns:m="http://schemas.openxmlformats.org/officeDocument/2006/math" xmlns:r="http://schemas.openxmlformats.org/officeDocument/2006/relationships" xmlns:o="urn:schemas-microsoft-com:office:office" xmlns:v="urn:schemas-microsoft-com:vml" xmlns:w10="urn:schemas-microsoft-com:office:word" xmlns:a="http://schemas.openxmlformats.org/drawingml/2006/main" xmlns:pic="http://schemas.openxmlformats.org/drawingml/2006/picture" xmlns:wp="http://schemas.openxmlformats.org/drawingml/2006/wordprocessingDrawing">
   <w:body>
-    <w:bookmarkStart w:id="35" w:name="개발-작업-기록-development-log"/>
+    <w:bookmarkStart w:id="41" w:name="개발-작업-기록-development-log"/>
     <w:p>
       <w:pPr>
         <w:pStyle w:val="Heading1"/>
@@ -26,13 +26,13 @@
         </w:pict>
       </w:r>
     </w:p>
-    <w:bookmarkStart w:id="20" w:name="미완료-작업-일괄-점검-마케팅-콘텐츠-생성"/>
+    <w:bookmarkStart w:id="20" w:name="youtube-shorts-자동화-완료"/>
     <w:p>
       <w:pPr>
         <w:pStyle w:val="Heading3"/>
       </w:pPr>
       <w:r>
-        <w:t xml:space="preserve">[2026-05-01 15:00] 미완료 작업 일괄 점검 + 마케팅 콘텐츠 생성</w:t>
+        <w:t xml:space="preserve">[2026-05-02 19:45] YouTube Shorts 자동화 완료</w:t>
       </w:r>
     </w:p>
     <w:p>
@@ -40,25 +40,25 @@
         <w:pStyle w:val="FirstParagraph"/>
       </w:pPr>
       <w:r>
-        <w:t xml:space="preserve">KBBG 프로젝트의 미완료 작업들을 자동으로 처리할 수 있는 것부터 진행했습니다.</w:t>
-      </w:r>
-      <w:r>
-        <w:t xml:space="preserve"> </w:t>
-      </w:r>
-      <w:r>
-        <w:t xml:space="preserve">- KBBG 블로그 500 에러 → 정상 작동 확인 완료 (HTTP 200)</w:t>
-      </w:r>
-      <w:r>
-        <w:t xml:space="preserve"> </w:t>
-      </w:r>
-      <w:r>
-        <w:t xml:space="preserve">- 4개 블로그 이미지 중복 → 중복 없음 확인 완료 (최근 20개 포스트)</w:t>
-      </w:r>
-      <w:r>
-        <w:t xml:space="preserve"> </w:t>
-      </w:r>
-      <w:r>
-        <w:t xml:space="preserve">- 외부 블로그 사이트명 수정: kskindaily</w:t>
+        <w:t xml:space="preserve">AutoShorts.ai로 K-MEDI TV 채널에 매일 자동 쇼츠 업로드를 설정했습니다.</w:t>
+      </w:r>
+      <w:r>
+        <w:t xml:space="preserve"> </w:t>
+      </w:r>
+      <w:r>
+        <w:t xml:space="preserve">- AutoShorts.ai Daily 플랜($39/월) 가입 + K-MEDI TV 연결</w:t>
+      </w:r>
+      <w:r>
+        <w:t xml:space="preserve"> </w:t>
+      </w:r>
+      <w:r>
+        <w:t xml:space="preserve">- Custom Prompt로 K-Beauty/의료관광 주제 자동 생성</w:t>
+      </w:r>
+      <w:r>
+        <w:t xml:space="preserve"> </w:t>
+      </w:r>
+      <w:r>
+        <w:t xml:space="preserve">- 첫 영상</w:t>
       </w:r>
       <w:r>
         <w:t xml:space="preserve"> </w:t>
@@ -67,85 +67,256 @@
         <w:t xml:space="preserve">“</w:t>
       </w:r>
       <w:r>
-        <w:t xml:space="preserve">K Blog</w:t>
+        <w:t xml:space="preserve">K-Beauty Laser Prices: Korea vs. LA Shock!</w:t>
       </w:r>
       <w:r>
         <w:t xml:space="preserve">”</w:t>
       </w:r>
       <w:r>
-        <w:t xml:space="preserve">→</w:t>
-      </w:r>
-      <w:r>
-        <w:t xml:space="preserve">“</w:t>
-      </w:r>
-      <w:r>
-        <w:t xml:space="preserve">K Skin Daily</w:t>
-      </w:r>
-      <w:r>
-        <w:t xml:space="preserve">”</w:t>
-      </w:r>
-      <w:r>
-        <w:t xml:space="preserve">, dailyhallyuwave</w:t>
-      </w:r>
-      <w:r>
-        <w:t xml:space="preserve"> </w:t>
-      </w:r>
-      <w:r>
-        <w:t xml:space="preserve">“</w:t>
-      </w:r>
-      <w:r>
-        <w:t xml:space="preserve">K Blog</w:t>
-      </w:r>
-      <w:r>
-        <w:t xml:space="preserve">”</w:t>
-      </w:r>
-      <w:r>
-        <w:t xml:space="preserve">→</w:t>
-      </w:r>
-      <w:r>
-        <w:t xml:space="preserve">“</w:t>
-      </w:r>
-      <w:r>
-        <w:t xml:space="preserve">Daily Hallyu Wave</w:t>
-      </w:r>
-      <w:r>
-        <w:t xml:space="preserve">”</w:t>
-      </w:r>
-      <w:r>
-        <w:t xml:space="preserve"> </w:t>
-      </w:r>
-      <w:r>
-        <w:t xml:space="preserve">(siteId도 수정)</w:t>
-      </w:r>
-      <w:r>
-        <w:t xml:space="preserve"> </w:t>
-      </w:r>
-      <w:r>
-        <w:t xml:space="preserve">- 외부 블로그 3개 DNS → SERVFAIL (도메인 등록/DNS 설정 필요, 별도 진행 예정)</w:t>
-      </w:r>
-      <w:r>
-        <w:t xml:space="preserve"> </w:t>
-      </w:r>
-      <w:r>
-        <w:t xml:space="preserve">- Quora 자문자답 세트 20개 생성 (docs/quora-qa-20.md)</w:t>
-      </w:r>
-      <w:r>
-        <w:t xml:space="preserve"> </w:t>
-      </w:r>
-      <w:r>
-        <w:t xml:space="preserve">- Reddit 답변 템플릿 10개 생성 (docs/reddit-templates-10.md)</w:t>
-      </w:r>
-      <w:r>
-        <w:t xml:space="preserve"> </w:t>
-      </w:r>
-      <w:r>
-        <w:t xml:space="preserve">- docx 변환 완료 (docs/exports/)</w:t>
-      </w:r>
-      <w:r>
-        <w:t xml:space="preserve"> </w:t>
-      </w:r>
-      <w:r>
-        <w:t xml:space="preserve">- [완료]</w:t>
+        <w:t xml:space="preserve"> </w:t>
+      </w:r>
+      <w:r>
+        <w:t xml:space="preserve">오후 9:15 업로드 예정</w:t>
+      </w:r>
+      <w:r>
+        <w:t xml:space="preserve"> </w:t>
+      </w:r>
+      <w:r>
+        <w:t xml:space="preserve">- 3채널분 쇼츠 주제 1,095개 준비 (scripts/shorts-topics-*.mjs)</w:t>
+      </w:r>
+      <w:r>
+        <w:t xml:space="preserve"> </w:t>
+      </w:r>
+      <w:r>
+        <w:t xml:space="preserve">- 상태: [완료]</w:t>
+      </w:r>
+    </w:p>
+    <w:bookmarkEnd w:id="20"/>
+    <w:bookmarkStart w:id="21" w:name="kbbg-웹사이트-관리자-모드-전수-점검"/>
+    <w:p>
+      <w:pPr>
+        <w:pStyle w:val="Heading3"/>
+      </w:pPr>
+      <w:r>
+        <w:t xml:space="preserve">[2026-05-02 17:00] KBBG 웹사이트 + 관리자 모드 전수 점검</w:t>
+      </w:r>
+    </w:p>
+    <w:p>
+      <w:pPr>
+        <w:pStyle w:val="FirstParagraph"/>
+      </w:pPr>
+      <w:r>
+        <w:t xml:space="preserve">6개 AI 에이전트로 웹사이트와 관리자 기능을 병렬 점검했습니다.</w:t>
+      </w:r>
+      <w:r>
+        <w:t xml:space="preserve"> </w:t>
+      </w:r>
+      <w:r>
+        <w:t xml:space="preserve">- Critical 7건 수정: 이메일 환경변수, 대시보드 통계 버그, XSS, 404 등</w:t>
+      </w:r>
+      <w:r>
+        <w:t xml:space="preserve"> </w:t>
+      </w:r>
+      <w:r>
+        <w:t xml:space="preserve">- Warning 16건 중 6건 수정: Rate Limit, UUID검증, LIKE이스케이프 등</w:t>
+      </w:r>
+      <w:r>
+        <w:t xml:space="preserve"> </w:t>
+      </w:r>
+      <w:r>
+        <w:t xml:space="preserve">- 관리자 인증 정상 확인, 보안 헤더 정상</w:t>
+      </w:r>
+      <w:r>
+        <w:t xml:space="preserve"> </w:t>
+      </w:r>
+      <w:r>
+        <w:t xml:space="preserve">- 보류 4건: 감사 로그 연동, Race Condition(RPC 필요)</w:t>
+      </w:r>
+      <w:r>
+        <w:t xml:space="preserve"> </w:t>
+      </w:r>
+      <w:r>
+        <w:t xml:space="preserve">- 상태: [완료] (보류 4건 별도 진행)</w:t>
+      </w:r>
+    </w:p>
+    <w:bookmarkEnd w:id="21"/>
+    <w:bookmarkStart w:id="22" w:name="google-search-console-seo-점검"/>
+    <w:p>
+      <w:pPr>
+        <w:pStyle w:val="Heading3"/>
+      </w:pPr>
+      <w:r>
+        <w:t xml:space="preserve">[2026-05-02 15:00] Google Search Console SEO 점검</w:t>
+      </w:r>
+    </w:p>
+    <w:p>
+      <w:pPr>
+        <w:pStyle w:val="FirstParagraph"/>
+      </w:pPr>
+      <w:r>
+        <w:t xml:space="preserve">구글 인덱싱 상태를 확인하고 오류를 수정했습니다.</w:t>
+      </w:r>
+      <w:r>
+        <w:t xml:space="preserve"> </w:t>
+      </w:r>
+      <w:r>
+        <w:t xml:space="preserve">- 488페이지 색인 완료, 1,685페이지 대기 중 (정상)</w:t>
+      </w:r>
+      <w:r>
+        <w:t xml:space="preserve"> </w:t>
+      </w:r>
+      <w:r>
+        <w:t xml:space="preserve">- 404 오류 수정: guides JSON-LD URL /guides/→/procedures/ 수정</w:t>
+      </w:r>
+      <w:r>
+        <w:t xml:space="preserve"> </w:t>
+      </w:r>
+      <w:r>
+        <w:t xml:space="preserve">- 사이트맵 2,016개 URL 정상 등록 확인</w:t>
+      </w:r>
+      <w:r>
+        <w:t xml:space="preserve"> </w:t>
+      </w:r>
+      <w:r>
+        <w:t xml:space="preserve">- 상태: [완료]</w:t>
+      </w:r>
+    </w:p>
+    <w:bookmarkEnd w:id="22"/>
+    <w:bookmarkStart w:id="23" w:name="개-블로그-시스템-딥서치-전수-수정"/>
+    <w:p>
+      <w:pPr>
+        <w:pStyle w:val="Heading3"/>
+      </w:pPr>
+      <w:r>
+        <w:t xml:space="preserve">[2026-05-02 14:00] 4개 블로그 시스템 딥서치 전수 수정</w:t>
+      </w:r>
+    </w:p>
+    <w:p>
+      <w:pPr>
+        <w:pStyle w:val="FirstParagraph"/>
+      </w:pPr>
+      <w:r>
+        <w:t xml:space="preserve">3개 AI 에이전트로 블로그 4개를 병렬 점검하고 오류를 수정했습니다.</w:t>
+      </w:r>
+      <w:r>
+        <w:t xml:space="preserve"> </w:t>
+      </w:r>
+      <w:r>
+        <w:t xml:space="preserve">- KBBG 블로그 페이지에 site 필터 추가 (외부 글 혼합 방지)</w:t>
+      </w:r>
+      <w:r>
+        <w:t xml:space="preserve"> </w:t>
+      </w:r>
+      <w:r>
+        <w:t xml:space="preserve">- 번역 콘텐츠 이미지 삽입 개선 + Promise.allSettled 적용</w:t>
+      </w:r>
+      <w:r>
+        <w:t xml:space="preserve"> </w:t>
+      </w:r>
+      <w:r>
+        <w:t xml:space="preserve">- koreatravel365 fallback 기본값 수정</w:t>
+      </w:r>
+      <w:r>
+        <w:t xml:space="preserve"> </w:t>
+      </w:r>
+      <w:r>
+        <w:t xml:space="preserve">- 5/1 botox 포스팅 7개 언어 번역 복구</w:t>
+      </w:r>
+      <w:r>
+        <w:t xml:space="preserve"> </w:t>
+      </w:r>
+      <w:r>
+        <w:t xml:space="preserve">- Pixabay category 사이트별 분리, 쉘 스크립트 개선</w:t>
+      </w:r>
+      <w:r>
+        <w:t xml:space="preserve"> </w:t>
+      </w:r>
+      <w:r>
+        <w:t xml:space="preserve">- 상태: [완료]</w:t>
+      </w:r>
+    </w:p>
+    <w:bookmarkEnd w:id="23"/>
+    <w:bookmarkStart w:id="24" w:name="kbbg-내부-블로그-다국어-번역-활성화"/>
+    <w:p>
+      <w:pPr>
+        <w:pStyle w:val="Heading3"/>
+      </w:pPr>
+      <w:r>
+        <w:t xml:space="preserve">[2026-05-02 13:30] KBBG 내부 블로그 다국어 번역 활성화</w:t>
+      </w:r>
+    </w:p>
+    <w:p>
+      <w:pPr>
+        <w:pStyle w:val="FirstParagraph"/>
+      </w:pPr>
+      <w:r>
+        <w:t xml:space="preserve">기존에 영어만 생성되던 내부 블로그를 한국어 포함 7개 언어로 확장했습니다.</w:t>
+      </w:r>
+      <w:r>
+        <w:t xml:space="preserve"> </w:t>
+      </w:r>
+      <w:r>
+        <w:t xml:space="preserve">- auto-blog.mjs에 translateTitle + translateToKorean 추가</w:t>
+      </w:r>
+      <w:r>
+        <w:t xml:space="preserve"> </w:t>
+      </w:r>
+      <w:r>
+        <w:t xml:space="preserve">- Anthropic API 자동 재충전 설정 완료</w:t>
+      </w:r>
+      <w:r>
+        <w:t xml:space="preserve"> </w:t>
+      </w:r>
+      <w:r>
+        <w:t xml:space="preserve">- 상태: [완료]</w:t>
+      </w:r>
+    </w:p>
+    <w:bookmarkEnd w:id="24"/>
+    <w:bookmarkStart w:id="25" w:name="외부-블로그-3개-도메인-dns-설정"/>
+    <w:p>
+      <w:pPr>
+        <w:pStyle w:val="Heading3"/>
+      </w:pPr>
+      <w:r>
+        <w:t xml:space="preserve">[2026-05-02 13:00] 외부 블로그 3개 도메인 DNS 설정</w:t>
+      </w:r>
+    </w:p>
+    <w:p>
+      <w:pPr>
+        <w:pStyle w:val="FirstParagraph"/>
+      </w:pPr>
+      <w:r>
+        <w:t xml:space="preserve">카페24 DNS + Vercel 도메인 연결을 완료했습니다.</w:t>
+      </w:r>
+      <w:r>
+        <w:t xml:space="preserve"> </w:t>
+      </w:r>
+      <w:r>
+        <w:t xml:space="preserve">- kskindaily.com: A(76.76.21.21) + CNAME(www→cname.vercel-dns.com)</w:t>
+      </w:r>
+      <w:r>
+        <w:t xml:space="preserve"> </w:t>
+      </w:r>
+      <w:r>
+        <w:t xml:space="preserve">- dailyhallyuwave.com: 동일 (www A→CNAME 권장방식 변경)</w:t>
+      </w:r>
+      <w:r>
+        <w:t xml:space="preserve"> </w:t>
+      </w:r>
+      <w:r>
+        <w:t xml:space="preserve">- koreatravel365.com: 동일 (www A→CNAME 권장방식 변경)</w:t>
+      </w:r>
+      <w:r>
+        <w:t xml:space="preserve"> </w:t>
+      </w:r>
+      <w:r>
+        <w:t xml:space="preserve">- Vercel 3개 프로젝트 도메인 연결 확인</w:t>
+      </w:r>
+      <w:r>
+        <w:t xml:space="preserve"> </w:t>
+      </w:r>
+      <w:r>
+        <w:t xml:space="preserve">- 상태: [완료]</w:t>
       </w:r>
     </w:p>
     <w:p>
@@ -155,14 +326,14 @@
         </w:pict>
       </w:r>
     </w:p>
-    <w:bookmarkEnd w:id="20"/>
-    <w:bookmarkStart w:id="21" w:name="내부-블로그-시스템-자동-포스팅-구현"/>
+    <w:bookmarkEnd w:id="25"/>
+    <w:bookmarkStart w:id="26" w:name="미완료-작업-일괄-점검-마케팅-콘텐츠-생성"/>
     <w:p>
       <w:pPr>
         <w:pStyle w:val="Heading3"/>
       </w:pPr>
       <w:r>
-        <w:t xml:space="preserve">[2026-04-26 14:00] 내부 블로그 시스템 + 자동 포스팅 구현</w:t>
+        <w:t xml:space="preserve">[2026-05-01 15:00] 미완료 작업 일괄 점검 + 마케팅 콘텐츠 생성</w:t>
       </w:r>
     </w:p>
     <w:p>
@@ -170,43 +341,25 @@
         <w:pStyle w:val="FirstParagraph"/>
       </w:pPr>
       <w:r>
-        <w:t xml:space="preserve">SEO 유입을 위한 내부 블로그를 만들었습니다. 매일 자동으로 글이 올라갑니다.</w:t>
-      </w:r>
-      <w:r>
-        <w:t xml:space="preserve"> </w:t>
-      </w:r>
-      <w:r>
-        <w:t xml:space="preserve">- 블로그 목록(/blog) + 상세 페이지(/blog/[slug]) 구현</w:t>
-      </w:r>
-      <w:r>
-        <w:t xml:space="preserve"> </w:t>
-      </w:r>
-      <w:r>
-        <w:t xml:space="preserve">- 매일 오후 3시(한국 시간) Claude AI가 K-뷰티 글 1개 자동 작성</w:t>
-      </w:r>
-      <w:r>
-        <w:t xml:space="preserve"> </w:t>
-      </w:r>
-      <w:r>
-        <w:t xml:space="preserve">- 8개 언어 자동 번역 포함, 메뉴에는 노출 안 함 (구글 검색 전용)</w:t>
-      </w:r>
-      <w:r>
-        <w:t xml:space="preserve"> </w:t>
-      </w:r>
-      <w:r>
-        <w:t xml:space="preserve">- 주제: 시술 가이드, 화장품 순위, FAQ, 비용 비교, 성분 분석, 의료관광 팁</w:t>
-      </w:r>
-      <w:r>
-        <w:t xml:space="preserve"> </w:t>
-      </w:r>
-      <w:r>
-        <w:t xml:space="preserve">- 병원명 가격비교 절대 금지 (평균 가격대만 표시)</w:t>
-      </w:r>
-      <w:r>
-        <w:t xml:space="preserve"> </w:t>
-      </w:r>
-      <w:r>
-        <w:t xml:space="preserve">-</w:t>
+        <w:t xml:space="preserve">KBBG 프로젝트의 미완료 작업들을 자동으로 처리할 수 있는 것부터 진행했습니다.</w:t>
+      </w:r>
+      <w:r>
+        <w:t xml:space="preserve"> </w:t>
+      </w:r>
+      <w:r>
+        <w:t xml:space="preserve">- KBBG 블로그 500 에러 → 정상 작동 확인 완료 (HTTP 200)</w:t>
+      </w:r>
+      <w:r>
+        <w:t xml:space="preserve"> </w:t>
+      </w:r>
+      <w:r>
+        <w:t xml:space="preserve">- 4개 블로그 이미지 중복 → 중복 없음 확인 완료 (최근 20개 포스트)</w:t>
+      </w:r>
+      <w:r>
+        <w:t xml:space="preserve"> </w:t>
+      </w:r>
+      <w:r>
+        <w:t xml:space="preserve">- 외부 블로그 사이트명 수정: kskindaily</w:t>
       </w:r>
       <w:r>
         <w:t xml:space="preserve"> </w:t>
@@ -215,34 +368,79 @@
         <w:t xml:space="preserve">“</w:t>
       </w:r>
       <w:r>
-        <w:t xml:space="preserve">AI 활용 제작</w:t>
+        <w:t xml:space="preserve">K Blog</w:t>
       </w:r>
       <w:r>
         <w:t xml:space="preserve">”</w:t>
       </w:r>
       <w:r>
-        <w:t xml:space="preserve"> </w:t>
-      </w:r>
-      <w:r>
-        <w:t xml:space="preserve">표시 자동 삽입 (한국 법 준수)</w:t>
-      </w:r>
-      <w:r>
-        <w:t xml:space="preserve"> </w:t>
-      </w:r>
-      <w:r>
-        <w:t xml:space="preserve">- 첫 글 생성 완료:</w:t>
-      </w:r>
-      <w:r>
-        <w:t xml:space="preserve"> </w:t>
+        <w:t xml:space="preserve">→</w:t>
       </w:r>
       <w:r>
         <w:t xml:space="preserve">“</w:t>
       </w:r>
       <w:r>
-        <w:t xml:space="preserve">한국 코성형 완전 가이드</w:t>
+        <w:t xml:space="preserve">K Skin Daily</w:t>
       </w:r>
       <w:r>
         <w:t xml:space="preserve">”</w:t>
+      </w:r>
+      <w:r>
+        <w:t xml:space="preserve">, dailyhallyuwave</w:t>
+      </w:r>
+      <w:r>
+        <w:t xml:space="preserve"> </w:t>
+      </w:r>
+      <w:r>
+        <w:t xml:space="preserve">“</w:t>
+      </w:r>
+      <w:r>
+        <w:t xml:space="preserve">K Blog</w:t>
+      </w:r>
+      <w:r>
+        <w:t xml:space="preserve">”</w:t>
+      </w:r>
+      <w:r>
+        <w:t xml:space="preserve">→</w:t>
+      </w:r>
+      <w:r>
+        <w:t xml:space="preserve">“</w:t>
+      </w:r>
+      <w:r>
+        <w:t xml:space="preserve">Daily Hallyu Wave</w:t>
+      </w:r>
+      <w:r>
+        <w:t xml:space="preserve">”</w:t>
+      </w:r>
+      <w:r>
+        <w:t xml:space="preserve"> </w:t>
+      </w:r>
+      <w:r>
+        <w:t xml:space="preserve">(siteId도 수정)</w:t>
+      </w:r>
+      <w:r>
+        <w:t xml:space="preserve"> </w:t>
+      </w:r>
+      <w:r>
+        <w:t xml:space="preserve">- 외부 블로그 3개 DNS → SERVFAIL (도메인 등록/DNS 설정 필요, 별도 진행 예정)</w:t>
+      </w:r>
+      <w:r>
+        <w:t xml:space="preserve"> </w:t>
+      </w:r>
+      <w:r>
+        <w:t xml:space="preserve">- Quora 자문자답 세트 20개 생성 (docs/quora-qa-20.md)</w:t>
+      </w:r>
+      <w:r>
+        <w:t xml:space="preserve"> </w:t>
+      </w:r>
+      <w:r>
+        <w:t xml:space="preserve">- Reddit 답변 템플릿 10개 생성 (docs/reddit-templates-10.md)</w:t>
+      </w:r>
+      <w:r>
+        <w:t xml:space="preserve"> </w:t>
+      </w:r>
+      <w:r>
+        <w:t xml:space="preserve">- docx 변환 완료 (docs/exports/)</w:t>
       </w:r>
       <w:r>
         <w:t xml:space="preserve"> </w:t>
@@ -258,14 +456,14 @@
         </w:pict>
       </w:r>
     </w:p>
-    <w:bookmarkEnd w:id="21"/>
-    <w:bookmarkStart w:id="22" w:name="프로그래매틱-seo-페이지-229개-자동-생성"/>
+    <w:bookmarkEnd w:id="26"/>
+    <w:bookmarkStart w:id="27" w:name="내부-블로그-시스템-자동-포스팅-구현"/>
     <w:p>
       <w:pPr>
         <w:pStyle w:val="Heading3"/>
       </w:pPr>
       <w:r>
-        <w:t xml:space="preserve">[2026-04-26 11:30] 프로그래매틱 SEO 페이지 229개 자동 생성</w:t>
+        <w:t xml:space="preserve">[2026-04-26 14:00] 내부 블로그 시스템 + 자동 포스팅 구현</w:t>
       </w:r>
     </w:p>
     <w:p>
@@ -273,19 +471,43 @@
         <w:pStyle w:val="FirstParagraph"/>
       </w:pPr>
       <w:r>
-        <w:t xml:space="preserve">구글 검색에서 외국인이 찾을 수 있도록 대량의 SEO 페이지를 자동으로 만들었습니다.</w:t>
-      </w:r>
-      <w:r>
-        <w:t xml:space="preserve"> </w:t>
-      </w:r>
-      <w:r>
-        <w:t xml:space="preserve">- 시술별 개별 페이지 39개: 코성형, 쌍꺼풀, 라식 등 각 시술의 비용·회복기간·FAQ 안내</w:t>
-      </w:r>
-      <w:r>
-        <w:t xml:space="preserve"> </w:t>
-      </w:r>
-      <w:r>
-        <w:t xml:space="preserve">- 시술×지역 조합 페이지 190개:</w:t>
+        <w:t xml:space="preserve">SEO 유입을 위한 내부 블로그를 만들었습니다. 매일 자동으로 글이 올라갑니다.</w:t>
+      </w:r>
+      <w:r>
+        <w:t xml:space="preserve"> </w:t>
+      </w:r>
+      <w:r>
+        <w:t xml:space="preserve">- 블로그 목록(/blog) + 상세 페이지(/blog/[slug]) 구현</w:t>
+      </w:r>
+      <w:r>
+        <w:t xml:space="preserve"> </w:t>
+      </w:r>
+      <w:r>
+        <w:t xml:space="preserve">- 매일 오후 3시(한국 시간) Claude AI가 K-뷰티 글 1개 자동 작성</w:t>
+      </w:r>
+      <w:r>
+        <w:t xml:space="preserve"> </w:t>
+      </w:r>
+      <w:r>
+        <w:t xml:space="preserve">- 8개 언어 자동 번역 포함, 메뉴에는 노출 안 함 (구글 검색 전용)</w:t>
+      </w:r>
+      <w:r>
+        <w:t xml:space="preserve"> </w:t>
+      </w:r>
+      <w:r>
+        <w:t xml:space="preserve">- 주제: 시술 가이드, 화장품 순위, FAQ, 비용 비교, 성분 분석, 의료관광 팁</w:t>
+      </w:r>
+      <w:r>
+        <w:t xml:space="preserve"> </w:t>
+      </w:r>
+      <w:r>
+        <w:t xml:space="preserve">- 병원명 가격비교 절대 금지 (평균 가격대만 표시)</w:t>
+      </w:r>
+      <w:r>
+        <w:t xml:space="preserve"> </w:t>
+      </w:r>
+      <w:r>
+        <w:t xml:space="preserve">-</w:t>
       </w:r>
       <w:r>
         <w:t xml:space="preserve"> </w:t>
@@ -294,13 +516,22 @@
         <w:t xml:space="preserve">“</w:t>
       </w:r>
       <w:r>
-        <w:t xml:space="preserve">강남 코성형 클리닉</w:t>
+        <w:t xml:space="preserve">AI 활용 제작</w:t>
       </w:r>
       <w:r>
         <w:t xml:space="preserve">”</w:t>
       </w:r>
       <w:r>
-        <w:t xml:space="preserve">,</w:t>
+        <w:t xml:space="preserve"> </w:t>
+      </w:r>
+      <w:r>
+        <w:t xml:space="preserve">표시 자동 삽입 (한국 법 준수)</w:t>
+      </w:r>
+      <w:r>
+        <w:t xml:space="preserve"> </w:t>
+      </w:r>
+      <w:r>
+        <w:t xml:space="preserve">- 첫 글 생성 완료:</w:t>
       </w:r>
       <w:r>
         <w:t xml:space="preserve"> </w:t>
@@ -309,28 +540,10 @@
         <w:t xml:space="preserve">“</w:t>
       </w:r>
       <w:r>
-        <w:t xml:space="preserve">부산 피부과</w:t>
+        <w:t xml:space="preserve">한국 코성형 완전 가이드</w:t>
       </w:r>
       <w:r>
         <w:t xml:space="preserve">”</w:t>
-      </w:r>
-      <w:r>
-        <w:t xml:space="preserve"> </w:t>
-      </w:r>
-      <w:r>
-        <w:t xml:space="preserve">등 검색 키워드 대응</w:t>
-      </w:r>
-      <w:r>
-        <w:t xml:space="preserve"> </w:t>
-      </w:r>
-      <w:r>
-        <w:t xml:space="preserve">- 8개 언어 지원 → 총 1,832개 URL이 구글 sitemap에 등록됨</w:t>
-      </w:r>
-      <w:r>
-        <w:t xml:space="preserve"> </w:t>
-      </w:r>
-      <w:r>
-        <w:t xml:space="preserve">- 각 페이지에 구조화 데이터(FAQ, 클리닉 목록) 포함 → 구글 리치 스니펫 노출 가능</w:t>
       </w:r>
       <w:r>
         <w:t xml:space="preserve"> </w:t>
@@ -346,14 +559,14 @@
         </w:pict>
       </w:r>
     </w:p>
-    <w:bookmarkEnd w:id="22"/>
-    <w:bookmarkStart w:id="23" w:name="ai-추천-결과-공유-기능-추가"/>
+    <w:bookmarkEnd w:id="27"/>
+    <w:bookmarkStart w:id="28" w:name="프로그래매틱-seo-페이지-229개-자동-생성"/>
     <w:p>
       <w:pPr>
         <w:pStyle w:val="Heading3"/>
       </w:pPr>
       <w:r>
-        <w:t xml:space="preserve">[2026-04-26 10:00] AI 추천 결과 공유 기능 추가</w:t>
+        <w:t xml:space="preserve">[2026-04-26 11:30] 프로그래매틱 SEO 페이지 229개 자동 생성</w:t>
       </w:r>
     </w:p>
     <w:p>
@@ -361,25 +574,64 @@
         <w:pStyle w:val="FirstParagraph"/>
       </w:pPr>
       <w:r>
-        <w:t xml:space="preserve">AI 검색 결과를 친구에게 쉽게 공유할 수 있는 기능을 만들었습니다.</w:t>
-      </w:r>
-      <w:r>
-        <w:t xml:space="preserve"> </w:t>
-      </w:r>
-      <w:r>
-        <w:t xml:space="preserve">- 검색 결과 하단에 공유 패널 표시 (링크 복사, X(트위터), Facebook, 모바일 공유)</w:t>
-      </w:r>
-      <w:r>
-        <w:t xml:space="preserve"> </w:t>
-      </w:r>
-      <w:r>
-        <w:t xml:space="preserve">- 8개 언어 모두 지원 (한국어, 영어, 중국어, 일본어, 베트남어, 태국어, 러시아어, 몽골어)</w:t>
-      </w:r>
-      <w:r>
-        <w:t xml:space="preserve"> </w:t>
-      </w:r>
-      <w:r>
-        <w:t xml:space="preserve">- 공유받은 사람이 링크 클릭 시 같은 검색 결과 페이지로 바로 이동</w:t>
+        <w:t xml:space="preserve">구글 검색에서 외국인이 찾을 수 있도록 대량의 SEO 페이지를 자동으로 만들었습니다.</w:t>
+      </w:r>
+      <w:r>
+        <w:t xml:space="preserve"> </w:t>
+      </w:r>
+      <w:r>
+        <w:t xml:space="preserve">- 시술별 개별 페이지 39개: 코성형, 쌍꺼풀, 라식 등 각 시술의 비용·회복기간·FAQ 안내</w:t>
+      </w:r>
+      <w:r>
+        <w:t xml:space="preserve"> </w:t>
+      </w:r>
+      <w:r>
+        <w:t xml:space="preserve">- 시술×지역 조합 페이지 190개:</w:t>
+      </w:r>
+      <w:r>
+        <w:t xml:space="preserve"> </w:t>
+      </w:r>
+      <w:r>
+        <w:t xml:space="preserve">“</w:t>
+      </w:r>
+      <w:r>
+        <w:t xml:space="preserve">강남 코성형 클리닉</w:t>
+      </w:r>
+      <w:r>
+        <w:t xml:space="preserve">”</w:t>
+      </w:r>
+      <w:r>
+        <w:t xml:space="preserve">,</w:t>
+      </w:r>
+      <w:r>
+        <w:t xml:space="preserve"> </w:t>
+      </w:r>
+      <w:r>
+        <w:t xml:space="preserve">“</w:t>
+      </w:r>
+      <w:r>
+        <w:t xml:space="preserve">부산 피부과</w:t>
+      </w:r>
+      <w:r>
+        <w:t xml:space="preserve">”</w:t>
+      </w:r>
+      <w:r>
+        <w:t xml:space="preserve"> </w:t>
+      </w:r>
+      <w:r>
+        <w:t xml:space="preserve">등 검색 키워드 대응</w:t>
+      </w:r>
+      <w:r>
+        <w:t xml:space="preserve"> </w:t>
+      </w:r>
+      <w:r>
+        <w:t xml:space="preserve">- 8개 언어 지원 → 총 1,832개 URL이 구글 sitemap에 등록됨</w:t>
+      </w:r>
+      <w:r>
+        <w:t xml:space="preserve"> </w:t>
+      </w:r>
+      <w:r>
+        <w:t xml:space="preserve">- 각 페이지에 구조화 데이터(FAQ, 클리닉 목록) 포함 → 구글 리치 스니펫 노출 가능</w:t>
       </w:r>
       <w:r>
         <w:t xml:space="preserve"> </w:t>
@@ -395,14 +647,14 @@
         </w:pict>
       </w:r>
     </w:p>
-    <w:bookmarkEnd w:id="23"/>
-    <w:bookmarkStart w:id="24" w:name="보안-강화-및-코드-품질-개선"/>
+    <w:bookmarkEnd w:id="28"/>
+    <w:bookmarkStart w:id="29" w:name="ai-추천-결과-공유-기능-추가"/>
     <w:p>
       <w:pPr>
         <w:pStyle w:val="Heading3"/>
       </w:pPr>
       <w:r>
-        <w:t xml:space="preserve">[2026-04-25 14:00] 보안 강화 및 코드 품질 개선</w:t>
+        <w:t xml:space="preserve">[2026-04-26 10:00] AI 추천 결과 공유 기능 추가</w:t>
       </w:r>
     </w:p>
     <w:p>
@@ -410,55 +662,31 @@
         <w:pStyle w:val="FirstParagraph"/>
       </w:pPr>
       <w:r>
-        <w:t xml:space="preserve">사용자 입력을 안전하게 처리하고, 관리자 기능의 보안을 높이는 작업입니다.</w:t>
-      </w:r>
-      <w:r>
-        <w:t xml:space="preserve"> </w:t>
-      </w:r>
-      <w:r>
-        <w:t xml:space="preserve">- 악성 코드 입력 방지(XSS) 기능 추가 — 댓글, 게시글 작성 시 자동 적용</w:t>
-      </w:r>
-      <w:r>
-        <w:t xml:space="preserve"> </w:t>
-      </w:r>
-      <w:r>
-        <w:t xml:space="preserve">- 관리자 버그 리포트 페이지: 브라우저에서 직접 DB 접근 → 서버 API 경유로 변경</w:t>
-      </w:r>
-      <w:r>
-        <w:t xml:space="preserve"> </w:t>
-      </w:r>
-      <w:r>
-        <w:t xml:space="preserve">- 로그인 후 이동 경로 조작 방지, 봇 차단(reCAPTCHA) 요청 제한 추가</w:t>
-      </w:r>
-      <w:r>
-        <w:t xml:space="preserve"> </w:t>
-      </w:r>
-      <w:r>
-        <w:t xml:space="preserve">- AI 번역 API 보안 강화, 에러 메시지에서 내부 정보 노출 제거</w:t>
-      </w:r>
-      <w:r>
-        <w:t xml:space="preserve"> </w:t>
-      </w:r>
-      <w:r>
-        <w:t xml:space="preserve">- 관리자 이메일 환경변수를 서버 전용으로 변경 (ADMIN_EMAILS)</w:t>
-      </w:r>
-      <w:r>
-        <w:t xml:space="preserve"> </w:t>
-      </w:r>
-      <w:r>
-        <w:t xml:space="preserve">- 방문자 카운트 동시 접속 시 누락 방지 개선</w:t>
-      </w:r>
-      <w:r>
-        <w:t xml:space="preserve"> </w:t>
-      </w:r>
-      <w:r>
-        <w:t xml:space="preserve">- 버튼 색상 통일 (파란색 #0071e3)</w:t>
-      </w:r>
-      <w:r>
-        <w:t xml:space="preserve"> </w:t>
-      </w:r>
-      <w:r>
-        <w:t xml:space="preserve">- 상태: [완료]</w:t>
+        <w:t xml:space="preserve">AI 검색 결과를 친구에게 쉽게 공유할 수 있는 기능을 만들었습니다.</w:t>
+      </w:r>
+      <w:r>
+        <w:t xml:space="preserve"> </w:t>
+      </w:r>
+      <w:r>
+        <w:t xml:space="preserve">- 검색 결과 하단에 공유 패널 표시 (링크 복사, X(트위터), Facebook, 모바일 공유)</w:t>
+      </w:r>
+      <w:r>
+        <w:t xml:space="preserve"> </w:t>
+      </w:r>
+      <w:r>
+        <w:t xml:space="preserve">- 8개 언어 모두 지원 (한국어, 영어, 중국어, 일본어, 베트남어, 태국어, 러시아어, 몽골어)</w:t>
+      </w:r>
+      <w:r>
+        <w:t xml:space="preserve"> </w:t>
+      </w:r>
+      <w:r>
+        <w:t xml:space="preserve">- 공유받은 사람이 링크 클릭 시 같은 검색 결과 페이지로 바로 이동</w:t>
+      </w:r>
+      <w:r>
+        <w:t xml:space="preserve"> </w:t>
+      </w:r>
+      <w:r>
+        <w:t xml:space="preserve">- [완료]</w:t>
       </w:r>
     </w:p>
     <w:p>
@@ -468,14 +696,14 @@
         </w:pict>
       </w:r>
     </w:p>
-    <w:bookmarkEnd w:id="24"/>
-    <w:bookmarkStart w:id="25" w:name="ai-재점검-하드코딩-잔여-7건-수정"/>
+    <w:bookmarkEnd w:id="29"/>
+    <w:bookmarkStart w:id="30" w:name="보안-강화-및-코드-품질-개선"/>
     <w:p>
       <w:pPr>
         <w:pStyle w:val="Heading3"/>
       </w:pPr>
       <w:r>
-        <w:t xml:space="preserve">[2026-04-21 11:30] 3-AI 재점검 — 하드코딩 잔여 7건 수정</w:t>
+        <w:t xml:space="preserve">[2026-04-25 14:00] 보안 강화 및 코드 품질 개선</w:t>
       </w:r>
     </w:p>
     <w:p>
@@ -483,109 +711,49 @@
         <w:pStyle w:val="FirstParagraph"/>
       </w:pPr>
       <w:r>
-        <w:t xml:space="preserve">이전 수정이 올바른지 + 새로운 문제가 있는지 3개 AI로 재점검했습니다.</w:t>
-      </w:r>
-      <w:r>
-        <w:t xml:space="preserve"> </w:t>
-      </w:r>
-      <w:r>
-        <w:t xml:space="preserve">- sitemap에 잘못된 URL(404 발생) 수정</w:t>
-      </w:r>
-      <w:r>
-        <w:t xml:space="preserve"> </w:t>
-      </w:r>
-      <w:r>
-        <w:t xml:space="preserve">- 글쓰기 태그(Flair) 8개 언어 번역 적용</w:t>
-      </w:r>
-      <w:r>
-        <w:t xml:space="preserve"> </w:t>
-      </w:r>
-      <w:r>
-        <w:t xml:space="preserve">- 병원 타입 필터(전체/의원/병원) 8개 언어 번역 적용</w:t>
-      </w:r>
-      <w:r>
-        <w:t xml:space="preserve"> </w:t>
-      </w:r>
-      <w:r>
-        <w:t xml:space="preserve">- 코스메틱 출처/가격 표시 8개 언어 번역 적용</w:t>
-      </w:r>
-      <w:r>
-        <w:t xml:space="preserve"> </w:t>
-      </w:r>
-      <w:r>
-        <w:t xml:space="preserve">- 투표 실패 시 에러 메시지 반환하도록 개선</w:t>
-      </w:r>
-      <w:r>
-        <w:t xml:space="preserve"> </w:t>
-      </w:r>
-      <w:r>
-        <w:t xml:space="preserve">- 모달/검색 접근성 라벨 수정</w:t>
-      </w:r>
-      <w:r>
-        <w:t xml:space="preserve"> </w:t>
-      </w:r>
-      <w:r>
-        <w:t xml:space="preserve">- 상태: [완료]</w:t>
-      </w:r>
-    </w:p>
-    <w:bookmarkEnd w:id="25"/>
-    <w:bookmarkStart w:id="26" w:name="ai-딥서치-보안seo아키텍처-전면-점검-및-수정"/>
-    <w:p>
-      <w:pPr>
-        <w:pStyle w:val="Heading3"/>
-      </w:pPr>
-      <w:r>
-        <w:t xml:space="preserve">[2026-04-21 10:30] 3-AI 딥서치 보안/SEO/아키텍처 전면 점검 및 수정</w:t>
-      </w:r>
-    </w:p>
-    <w:p>
-      <w:pPr>
-        <w:pStyle w:val="FirstParagraph"/>
-      </w:pPr>
-      <w:r>
-        <w:t xml:space="preserve">3개 AI(Claude+Codex+Gemini)로 프로젝트 전체를 보안, 성능, SEO, 아키텍처 관점에서 점검했습니다.</w:t>
-      </w:r>
-      <w:r>
-        <w:t xml:space="preserve"> </w:t>
-      </w:r>
-      <w:r>
-        <w:t xml:space="preserve">- 관리자 페이지 서버 인증 추가 (로그인 안 하면 관리자 화면 접근 불가)</w:t>
-      </w:r>
-      <w:r>
-        <w:t xml:space="preserve"> </w:t>
-      </w:r>
-      <w:r>
-        <w:t xml:space="preserve">- 관리자 이메일 코드 노출 제거 → 환경변수로 이동</w:t>
-      </w:r>
-      <w:r>
-        <w:t xml:space="preserve"> </w:t>
-      </w:r>
-      <w:r>
-        <w:t xml:space="preserve">- 회원가입 시 유저 프로필 자동 생성 트리거 추가 (SQL 필요)</w:t>
-      </w:r>
-      <w:r>
-        <w:t xml:space="preserve"> </w:t>
-      </w:r>
-      <w:r>
-        <w:t xml:space="preserve">- robots.txt 한국어 차단 해제 + sitemap hreflang 추가</w:t>
-      </w:r>
-      <w:r>
-        <w:t xml:space="preserve"> </w:t>
-      </w:r>
-      <w:r>
-        <w:t xml:space="preserve">- 404 페이지 사용자 언어 유지</w:t>
-      </w:r>
-      <w:r>
-        <w:t xml:space="preserve"> </w:t>
-      </w:r>
-      <w:r>
-        <w:t xml:space="preserve">- AI 검색/이벤트 페이지 하드코딩 → 8개 언어 번역</w:t>
-      </w:r>
-      <w:r>
-        <w:t xml:space="preserve"> </w:t>
-      </w:r>
-      <w:r>
-        <w:t xml:space="preserve">- 코드 중복 제거 (FLAIR_STYLE 등 공통 모듈화)</w:t>
+        <w:t xml:space="preserve">사용자 입력을 안전하게 처리하고, 관리자 기능의 보안을 높이는 작업입니다.</w:t>
+      </w:r>
+      <w:r>
+        <w:t xml:space="preserve"> </w:t>
+      </w:r>
+      <w:r>
+        <w:t xml:space="preserve">- 악성 코드 입력 방지(XSS) 기능 추가 — 댓글, 게시글 작성 시 자동 적용</w:t>
+      </w:r>
+      <w:r>
+        <w:t xml:space="preserve"> </w:t>
+      </w:r>
+      <w:r>
+        <w:t xml:space="preserve">- 관리자 버그 리포트 페이지: 브라우저에서 직접 DB 접근 → 서버 API 경유로 변경</w:t>
+      </w:r>
+      <w:r>
+        <w:t xml:space="preserve"> </w:t>
+      </w:r>
+      <w:r>
+        <w:t xml:space="preserve">- 로그인 후 이동 경로 조작 방지, 봇 차단(reCAPTCHA) 요청 제한 추가</w:t>
+      </w:r>
+      <w:r>
+        <w:t xml:space="preserve"> </w:t>
+      </w:r>
+      <w:r>
+        <w:t xml:space="preserve">- AI 번역 API 보안 강화, 에러 메시지에서 내부 정보 노출 제거</w:t>
+      </w:r>
+      <w:r>
+        <w:t xml:space="preserve"> </w:t>
+      </w:r>
+      <w:r>
+        <w:t xml:space="preserve">- 관리자 이메일 환경변수를 서버 전용으로 변경 (ADMIN_EMAILS)</w:t>
+      </w:r>
+      <w:r>
+        <w:t xml:space="preserve"> </w:t>
+      </w:r>
+      <w:r>
+        <w:t xml:space="preserve">- 방문자 카운트 동시 접속 시 누락 방지 개선</w:t>
+      </w:r>
+      <w:r>
+        <w:t xml:space="preserve"> </w:t>
+      </w:r>
+      <w:r>
+        <w:t xml:space="preserve">- 버튼 색상 통일 (파란색 #0071e3)</w:t>
       </w:r>
       <w:r>
         <w:t xml:space="preserve"> </w:t>
@@ -601,14 +769,14 @@
         </w:pict>
       </w:r>
     </w:p>
-    <w:bookmarkEnd w:id="26"/>
-    <w:bookmarkStart w:id="27" w:name="외국인-유저-추가-이슈-일괄-수정-ccg-점검-2차"/>
+    <w:bookmarkEnd w:id="30"/>
+    <w:bookmarkStart w:id="31" w:name="ai-재점검-하드코딩-잔여-7건-수정"/>
     <w:p>
       <w:pPr>
         <w:pStyle w:val="Heading3"/>
       </w:pPr>
       <w:r>
-        <w:t xml:space="preserve">[2026-04-20 23:30] 외국인 유저 추가 이슈 일괄 수정 (CCG 점검 2차)</w:t>
+        <w:t xml:space="preserve">[2026-04-21 11:30] 3-AI 재점검 — 하드코딩 잔여 7건 수정</w:t>
       </w:r>
     </w:p>
     <w:p>
@@ -616,43 +784,109 @@
         <w:pStyle w:val="FirstParagraph"/>
       </w:pPr>
       <w:r>
-        <w:t xml:space="preserve">3개 AI 점검에서 발견된 추가 문제 11건을 수정했습니다.</w:t>
-      </w:r>
-      <w:r>
-        <w:t xml:space="preserve"> </w:t>
-      </w:r>
-      <w:r>
-        <w:t xml:space="preserve">- 게시글 목록: 카테고리 매핑 오류 + 정렬 오류 수정</w:t>
-      </w:r>
-      <w:r>
-        <w:t xml:space="preserve"> </w:t>
-      </w:r>
-      <w:r>
-        <w:t xml:space="preserve">- 게���글 목록: 검색/삭제 버튼 8개 언어 번역 적용</w:t>
-      </w:r>
-      <w:r>
-        <w:t xml:space="preserve"> </w:t>
-      </w:r>
-      <w:r>
-        <w:t xml:space="preserve">- 게시글 상세: 날짜가 사용자 언어에 맞게 표시되도록 수정</w:t>
-      </w:r>
-      <w:r>
-        <w:t xml:space="preserve"> </w:t>
-      </w:r>
-      <w:r>
-        <w:t xml:space="preserve">- 추천/비추천: 새로고침해도 유지되도록 DB 저장 방식으로 변경</w:t>
-      </w:r>
-      <w:r>
-        <w:t xml:space="preserve"> </w:t>
-      </w:r>
-      <w:r>
-        <w:t xml:space="preserve">- 헤더: 모바일 메뉴 8개 언어 번역 + 긴 텍스트 잘림 방지</w:t>
-      </w:r>
-      <w:r>
-        <w:t xml:space="preserve"> </w:t>
-      </w:r>
-      <w:r>
-        <w:t xml:space="preserve">- 헤더: 언어 변경 시 검색 조건이 유지되도록 수정</w:t>
+        <w:t xml:space="preserve">이전 수정이 올바른지 + 새로운 문제가 있는지 3개 AI로 재점검했습니다.</w:t>
+      </w:r>
+      <w:r>
+        <w:t xml:space="preserve"> </w:t>
+      </w:r>
+      <w:r>
+        <w:t xml:space="preserve">- sitemap에 잘못된 URL(404 발생) 수정</w:t>
+      </w:r>
+      <w:r>
+        <w:t xml:space="preserve"> </w:t>
+      </w:r>
+      <w:r>
+        <w:t xml:space="preserve">- 글쓰기 태그(Flair) 8개 언어 번역 적용</w:t>
+      </w:r>
+      <w:r>
+        <w:t xml:space="preserve"> </w:t>
+      </w:r>
+      <w:r>
+        <w:t xml:space="preserve">- 병원 타입 필터(전체/의원/병원) 8개 언어 번역 적용</w:t>
+      </w:r>
+      <w:r>
+        <w:t xml:space="preserve"> </w:t>
+      </w:r>
+      <w:r>
+        <w:t xml:space="preserve">- 코스메틱 출처/가격 표시 8개 언어 번역 적용</w:t>
+      </w:r>
+      <w:r>
+        <w:t xml:space="preserve"> </w:t>
+      </w:r>
+      <w:r>
+        <w:t xml:space="preserve">- 투표 실패 시 에러 메시지 반환하도록 개선</w:t>
+      </w:r>
+      <w:r>
+        <w:t xml:space="preserve"> </w:t>
+      </w:r>
+      <w:r>
+        <w:t xml:space="preserve">- 모달/검색 접근성 라벨 수정</w:t>
+      </w:r>
+      <w:r>
+        <w:t xml:space="preserve"> </w:t>
+      </w:r>
+      <w:r>
+        <w:t xml:space="preserve">- 상태: [완료]</w:t>
+      </w:r>
+    </w:p>
+    <w:bookmarkEnd w:id="31"/>
+    <w:bookmarkStart w:id="32" w:name="ai-딥서치-보안seo아키텍처-전면-점검-및-수정"/>
+    <w:p>
+      <w:pPr>
+        <w:pStyle w:val="Heading3"/>
+      </w:pPr>
+      <w:r>
+        <w:t xml:space="preserve">[2026-04-21 10:30] 3-AI 딥서치 보안/SEO/아키텍처 전면 점검 및 수정</w:t>
+      </w:r>
+    </w:p>
+    <w:p>
+      <w:pPr>
+        <w:pStyle w:val="FirstParagraph"/>
+      </w:pPr>
+      <w:r>
+        <w:t xml:space="preserve">3개 AI(Claude+Codex+Gemini)로 프로젝트 전체를 보안, 성능, SEO, 아키텍처 관점에서 점검했습니다.</w:t>
+      </w:r>
+      <w:r>
+        <w:t xml:space="preserve"> </w:t>
+      </w:r>
+      <w:r>
+        <w:t xml:space="preserve">- 관리자 페이지 서버 인증 추가 (로그인 안 하면 관리자 화면 접근 불가)</w:t>
+      </w:r>
+      <w:r>
+        <w:t xml:space="preserve"> </w:t>
+      </w:r>
+      <w:r>
+        <w:t xml:space="preserve">- 관리자 이메일 코드 노출 제거 → 환경변수로 이동</w:t>
+      </w:r>
+      <w:r>
+        <w:t xml:space="preserve"> </w:t>
+      </w:r>
+      <w:r>
+        <w:t xml:space="preserve">- 회원가입 시 유저 프로필 자동 생성 트리거 추가 (SQL 필요)</w:t>
+      </w:r>
+      <w:r>
+        <w:t xml:space="preserve"> </w:t>
+      </w:r>
+      <w:r>
+        <w:t xml:space="preserve">- robots.txt 한국어 차단 해제 + sitemap hreflang 추가</w:t>
+      </w:r>
+      <w:r>
+        <w:t xml:space="preserve"> </w:t>
+      </w:r>
+      <w:r>
+        <w:t xml:space="preserve">- 404 페이지 사용자 언어 유지</w:t>
+      </w:r>
+      <w:r>
+        <w:t xml:space="preserve"> </w:t>
+      </w:r>
+      <w:r>
+        <w:t xml:space="preserve">- AI 검색/이벤트 페이지 하드코딩 → 8개 언어 번역</w:t>
+      </w:r>
+      <w:r>
+        <w:t xml:space="preserve"> </w:t>
+      </w:r>
+      <w:r>
+        <w:t xml:space="preserve">- 코드 중복 제거 (FLAIR_STYLE 등 공통 모듈화)</w:t>
       </w:r>
       <w:r>
         <w:t xml:space="preserve"> </w:t>
@@ -668,14 +902,14 @@
         </w:pict>
       </w:r>
     </w:p>
-    <w:bookmarkEnd w:id="27"/>
-    <w:bookmarkStart w:id="28" w:name="외국인-유저-글쓰기-다국어-완전-점검-및-수정"/>
+    <w:bookmarkEnd w:id="32"/>
+    <w:bookmarkStart w:id="33" w:name="외국인-유저-추가-이슈-일괄-수정-ccg-점검-2차"/>
     <w:p>
       <w:pPr>
         <w:pStyle w:val="Heading3"/>
       </w:pPr>
       <w:r>
-        <w:t xml:space="preserve">[2026-04-20 23:00] 외국인 유저 글쓰기 다국어 완전 점검 및 수정</w:t>
+        <w:t xml:space="preserve">[2026-04-20 23:30] 외국인 유저 추가 이슈 일괄 수정 (CCG 점검 2차)</w:t>
       </w:r>
     </w:p>
     <w:p>
@@ -683,43 +917,43 @@
         <w:pStyle w:val="FirstParagraph"/>
       </w:pPr>
       <w:r>
-        <w:t xml:space="preserve">외국인이 글을 쓸 때 발생하는 문제를 3개 AI(Claude+Codex+Gemini)로 전수 점검했습니다.</w:t>
-      </w:r>
-      <w:r>
-        <w:t xml:space="preserve"> </w:t>
-      </w:r>
-      <w:r>
-        <w:t xml:space="preserve">- 게시판 6개(K-POP, K-Food, K-Drama 등) 누락 → DB에 추가 완료</w:t>
-      </w:r>
-      <w:r>
-        <w:t xml:space="preserve"> </w:t>
-      </w:r>
-      <w:r>
-        <w:t xml:space="preserve">- 글쓰기 화면이 한국어/영어로만 표시되던 문제 → 8개 언어 번역 적용</w:t>
-      </w:r>
-      <w:r>
-        <w:t xml:space="preserve"> </w:t>
-      </w:r>
-      <w:r>
-        <w:t xml:space="preserve">- 이미지 업로드 에러가 한국어로만 뜨던 문제 → 8개 언어 지원</w:t>
-      </w:r>
-      <w:r>
-        <w:t xml:space="preserve"> </w:t>
-      </w:r>
-      <w:r>
-        <w:t xml:space="preserve">- 로그인 에러 메시지 8개 언어 지원</w:t>
-      </w:r>
-      <w:r>
-        <w:t xml:space="preserve"> </w:t>
-      </w:r>
-      <w:r>
-        <w:t xml:space="preserve">- 구글 로그인 후 언어가 영어로 바뀌던 문제 수정</w:t>
-      </w:r>
-      <w:r>
-        <w:t xml:space="preserve"> </w:t>
-      </w:r>
-      <w:r>
-        <w:t xml:space="preserve">- 댓글 삭제 시 권한 체크 오류 수정</w:t>
+        <w:t xml:space="preserve">3개 AI 점검에서 발견된 추가 문제 11건을 수정했습니다.</w:t>
+      </w:r>
+      <w:r>
+        <w:t xml:space="preserve"> </w:t>
+      </w:r>
+      <w:r>
+        <w:t xml:space="preserve">- 게시글 목록: 카테고리 매핑 오류 + 정렬 오류 수정</w:t>
+      </w:r>
+      <w:r>
+        <w:t xml:space="preserve"> </w:t>
+      </w:r>
+      <w:r>
+        <w:t xml:space="preserve">- 게���글 목록: 검색/삭제 버튼 8개 언어 번역 적용</w:t>
+      </w:r>
+      <w:r>
+        <w:t xml:space="preserve"> </w:t>
+      </w:r>
+      <w:r>
+        <w:t xml:space="preserve">- 게시글 상세: 날짜가 사용자 언어에 맞게 표시되도록 수정</w:t>
+      </w:r>
+      <w:r>
+        <w:t xml:space="preserve"> </w:t>
+      </w:r>
+      <w:r>
+        <w:t xml:space="preserve">- 추천/비추천: 새로고침해도 유지되도록 DB 저장 방식으로 변경</w:t>
+      </w:r>
+      <w:r>
+        <w:t xml:space="preserve"> </w:t>
+      </w:r>
+      <w:r>
+        <w:t xml:space="preserve">- 헤더: 모바일 메뉴 8개 언어 번역 + 긴 텍스트 잘림 방지</w:t>
+      </w:r>
+      <w:r>
+        <w:t xml:space="preserve"> </w:t>
+      </w:r>
+      <w:r>
+        <w:t xml:space="preserve">- 헤더: 언어 변경 시 검색 조건이 유지되도록 수정</w:t>
       </w:r>
       <w:r>
         <w:t xml:space="preserve"> </w:t>
@@ -735,8 +969,75 @@
         </w:pict>
       </w:r>
     </w:p>
-    <w:bookmarkEnd w:id="28"/>
-    <w:bookmarkStart w:id="29" w:name="검색-연결-버그-수정-사이트-점검-기능-관리자-구글-로그인"/>
+    <w:bookmarkEnd w:id="33"/>
+    <w:bookmarkStart w:id="34" w:name="외국인-유저-글쓰기-다국어-완전-점검-및-수정"/>
+    <w:p>
+      <w:pPr>
+        <w:pStyle w:val="Heading3"/>
+      </w:pPr>
+      <w:r>
+        <w:t xml:space="preserve">[2026-04-20 23:00] 외국인 유저 글쓰기 다국어 완전 점검 및 수정</w:t>
+      </w:r>
+    </w:p>
+    <w:p>
+      <w:pPr>
+        <w:pStyle w:val="FirstParagraph"/>
+      </w:pPr>
+      <w:r>
+        <w:t xml:space="preserve">외국인이 글을 쓸 때 발생하는 문제를 3개 AI(Claude+Codex+Gemini)로 전수 점검했습니다.</w:t>
+      </w:r>
+      <w:r>
+        <w:t xml:space="preserve"> </w:t>
+      </w:r>
+      <w:r>
+        <w:t xml:space="preserve">- 게시판 6개(K-POP, K-Food, K-Drama 등) 누락 → DB에 추가 완료</w:t>
+      </w:r>
+      <w:r>
+        <w:t xml:space="preserve"> </w:t>
+      </w:r>
+      <w:r>
+        <w:t xml:space="preserve">- 글쓰기 화면이 한국어/영어로만 표시되던 문제 → 8개 언어 번역 적용</w:t>
+      </w:r>
+      <w:r>
+        <w:t xml:space="preserve"> </w:t>
+      </w:r>
+      <w:r>
+        <w:t xml:space="preserve">- 이미지 업로드 에러가 한국어로만 뜨던 문제 → 8개 언어 지원</w:t>
+      </w:r>
+      <w:r>
+        <w:t xml:space="preserve"> </w:t>
+      </w:r>
+      <w:r>
+        <w:t xml:space="preserve">- 로그인 에러 메시지 8개 언어 지원</w:t>
+      </w:r>
+      <w:r>
+        <w:t xml:space="preserve"> </w:t>
+      </w:r>
+      <w:r>
+        <w:t xml:space="preserve">- 구글 로그인 후 언어가 영어로 바뀌던 문제 수정</w:t>
+      </w:r>
+      <w:r>
+        <w:t xml:space="preserve"> </w:t>
+      </w:r>
+      <w:r>
+        <w:t xml:space="preserve">- 댓글 삭제 시 권한 체크 오류 수정</w:t>
+      </w:r>
+      <w:r>
+        <w:t xml:space="preserve"> </w:t>
+      </w:r>
+      <w:r>
+        <w:t xml:space="preserve">- 상태: [완료]</w:t>
+      </w:r>
+    </w:p>
+    <w:p>
+      <w:r>
+        <w:pict>
+          <v:rect style="width:0;height:1.5pt" o:hralign="center" o:hrstd="t" o:hr="t"/>
+        </w:pict>
+      </w:r>
+    </w:p>
+    <w:bookmarkEnd w:id="34"/>
+    <w:bookmarkStart w:id="35" w:name="검색-연결-버그-수정-사이트-점검-기능-관리자-구글-로그인"/>
     <w:p>
       <w:pPr>
         <w:pStyle w:val="Heading3"/>
@@ -906,8 +1207,8 @@
         </w:pict>
       </w:r>
     </w:p>
-    <w:bookmarkEnd w:id="29"/>
-    <w:bookmarkStart w:id="30" w:name="데이터-동기화-수정-ai-검색-최소-10건-보장"/>
+    <w:bookmarkEnd w:id="35"/>
+    <w:bookmarkStart w:id="36" w:name="데이터-동기화-수정-ai-검색-최소-10건-보장"/>
     <w:p>
       <w:pPr>
         <w:pStyle w:val="Heading3"/>
@@ -1029,8 +1330,8 @@
         </w:pict>
       </w:r>
     </w:p>
-    <w:bookmarkEnd w:id="30"/>
-    <w:bookmarkStart w:id="31" w:name="관리자-패널-전면-개편-13단계-ai-검색-최적화"/>
+    <w:bookmarkEnd w:id="36"/>
+    <w:bookmarkStart w:id="37" w:name="관리자-패널-전면-개편-13단계-ai-검색-최적화"/>
     <w:p>
       <w:pPr>
         <w:pStyle w:val="Heading3"/>
@@ -1200,8 +1501,8 @@
         </w:pict>
       </w:r>
     </w:p>
-    <w:bookmarkEnd w:id="31"/>
-    <w:bookmarkStart w:id="32" w:name="화장품-순위-자동-수집-cron-구축"/>
+    <w:bookmarkEnd w:id="37"/>
+    <w:bookmarkStart w:id="38" w:name="화장품-순위-자동-수집-cron-구축"/>
     <w:p>
       <w:pPr>
         <w:pStyle w:val="Heading3"/>
@@ -1281,8 +1582,8 @@
         </w:pict>
       </w:r>
     </w:p>
-    <w:bookmarkEnd w:id="32"/>
-    <w:bookmarkStart w:id="33" w:name="highmedium-이슈-22건-일괄-수정"/>
+    <w:bookmarkEnd w:id="38"/>
+    <w:bookmarkStart w:id="39" w:name="highmedium-이슈-22건-일괄-수정"/>
     <w:p>
       <w:pPr>
         <w:pStyle w:val="Heading3"/>
@@ -1371,8 +1672,8 @@
         </w:pict>
       </w:r>
     </w:p>
-    <w:bookmarkEnd w:id="33"/>
-    <w:bookmarkStart w:id="34" w:name="ccg-3-ai-전체-기능-점검-critical-이슈-6건-수정"/>
+    <w:bookmarkEnd w:id="39"/>
+    <w:bookmarkStart w:id="40" w:name="ccg-3-ai-전체-기능-점검-critical-이슈-6건-수정"/>
     <w:p>
       <w:pPr>
         <w:pStyle w:val="Heading3"/>
@@ -3545,8 +3846,8 @@
         <w:t xml:space="preserve">- README.md 8개국 언어, 프로젝트 구조 현행화</w:t>
       </w:r>
     </w:p>
-    <w:bookmarkEnd w:id="34"/>
-    <w:bookmarkEnd w:id="35"/>
+    <w:bookmarkEnd w:id="40"/>
+    <w:bookmarkEnd w:id="41"/>
     <w:sectPr/>
   </w:body>
 </w:document>

</xml_diff>

<commit_message>
docs: DEV_LOG 2026-05-18 CCG 전수 점검 작업 기록 추가
</commit_message>
<xml_diff>
--- a/docs/exports/DEV_LOG.docx
+++ b/docs/exports/DEV_LOG.docx
@@ -2,7 +2,7 @@
 <file path=word/document.xml><?xml version="1.0" encoding="utf-8"?>
 <w:document xmlns:w="http://schemas.openxmlformats.org/wordprocessingml/2006/main" xmlns:m="http://schemas.openxmlformats.org/officeDocument/2006/math" xmlns:r="http://schemas.openxmlformats.org/officeDocument/2006/relationships" xmlns:o="urn:schemas-microsoft-com:office:office" xmlns:v="urn:schemas-microsoft-com:vml" xmlns:w10="urn:schemas-microsoft-com:office:word" xmlns:a="http://schemas.openxmlformats.org/drawingml/2006/main" xmlns:pic="http://schemas.openxmlformats.org/drawingml/2006/picture" xmlns:wp="http://schemas.openxmlformats.org/drawingml/2006/wordprocessingDrawing">
   <w:body>
-    <w:bookmarkStart w:id="52" w:name="개발-작업-기록-development-log"/>
+    <w:bookmarkStart w:id="53" w:name="개발-작업-기록-development-log"/>
     <w:p>
       <w:pPr>
         <w:pStyle w:val="Heading1"/>
@@ -26,13 +26,13 @@
         </w:pict>
       </w:r>
     </w:p>
-    <w:bookmarkStart w:id="20" w:name="reddit-quora-통합-커뮤니티-모니터링"/>
+    <w:bookmarkStart w:id="20" w:name="ccg-전수-점검-전체-수정-리뷰-시스템-플래너-재작성"/>
     <w:p>
       <w:pPr>
         <w:pStyle w:val="Heading3"/>
       </w:pPr>
       <w:r>
-        <w:t xml:space="preserve">[2026-05-16 07:00] Reddit + Quora 통합 커뮤니티 모니터링</w:t>
+        <w:t xml:space="preserve">[2026-05-18 00:00] CCG 전수 점검 + 전체 수정, 리뷰 시스템, 플래너 재작성</w:t>
       </w:r>
     </w:p>
     <w:p>
@@ -40,49 +40,13 @@
         <w:pStyle w:val="FirstParagraph"/>
       </w:pPr>
       <w:r>
-        <w:t xml:space="preserve">Reddit 5개 제한 제거 → 전체 표시 (최대 20개 AI 초안). Quora 토픽 RSS 모니터링 추가.</w:t>
-      </w:r>
-      <w:r>
-        <w:t xml:space="preserve"> </w:t>
-      </w:r>
-      <w:r>
-        <w:t xml:space="preserve">이메일 제목:</w:t>
-      </w:r>
-      <w:r>
-        <w:t xml:space="preserve"> </w:t>
-      </w:r>
-      <w:r>
-        <w:t xml:space="preserve">“</w:t>
-      </w:r>
-      <w:r>
-        <w:t xml:space="preserve">[KBBG] Reddit N개 + Quora N개 발견</w:t>
-      </w:r>
-      <w:r>
-        <w:t xml:space="preserve">”</w:t>
-      </w:r>
-      <w:r>
-        <w:t xml:space="preserve">, Reddit/Quora 섹션 분리 표시.</w:t>
-      </w:r>
-      <w:r>
-        <w:t xml:space="preserve"> </w:t>
-      </w:r>
-      <w:r>
-        <w:t xml:space="preserve">Quora RSS 응답 없는 날은</w:t>
-      </w:r>
-      <w:r>
-        <w:t xml:space="preserve"> </w:t>
-      </w:r>
-      <w:r>
-        <w:t xml:space="preserve">“</w:t>
-      </w:r>
-      <w:r>
-        <w:t xml:space="preserve">오늘 새 질문 없음</w:t>
-      </w:r>
-      <w:r>
-        <w:t xml:space="preserve">”</w:t>
-      </w:r>
-      <w:r>
-        <w:t xml:space="preserve">으로 표시. [완료]</w:t>
+        <w:t xml:space="preserve">3개 AI(Claude+Codex+Gemini) 병렬 점검으로 프론트/디자인/보안/백엔드/모바일/PC/마케팅/블로그 전 영역 검사.</w:t>
+      </w:r>
+      <w:r>
+        <w:t xml:space="preserve"> </w:t>
+      </w:r>
+      <w:r>
+        <w:t xml:space="preserve">발견된 문제 전부 수정 완료 — 리뷰 사진 업로드(시술 후 사진만, 의료법 준수), 플래너 Apple 디자인 재작성, 검색 캐시, SEO 신뢰 문구 등. [완료]</w:t>
       </w:r>
     </w:p>
     <w:p>
@@ -93,7 +57,74 @@
       </w:r>
     </w:p>
     <w:bookmarkEnd w:id="20"/>
-    <w:bookmarkStart w:id="21" w:name="ai-브리핑-블로그-주제-자동-조정-연동"/>
+    <w:bookmarkStart w:id="21" w:name="reddit-quora-통합-커뮤니티-모니터링"/>
+    <w:p>
+      <w:pPr>
+        <w:pStyle w:val="Heading3"/>
+      </w:pPr>
+      <w:r>
+        <w:t xml:space="preserve">[2026-05-16 07:00] Reddit + Quora 통합 커뮤니티 모니터링</w:t>
+      </w:r>
+    </w:p>
+    <w:p>
+      <w:pPr>
+        <w:pStyle w:val="FirstParagraph"/>
+      </w:pPr>
+      <w:r>
+        <w:t xml:space="preserve">Reddit 5개 제한 제거 → 전체 표시 (최대 20개 AI 초안). Quora 토픽 RSS 모니터링 추가.</w:t>
+      </w:r>
+      <w:r>
+        <w:t xml:space="preserve"> </w:t>
+      </w:r>
+      <w:r>
+        <w:t xml:space="preserve">이메일 제목:</w:t>
+      </w:r>
+      <w:r>
+        <w:t xml:space="preserve"> </w:t>
+      </w:r>
+      <w:r>
+        <w:t xml:space="preserve">“</w:t>
+      </w:r>
+      <w:r>
+        <w:t xml:space="preserve">[KBBG] Reddit N개 + Quora N개 발견</w:t>
+      </w:r>
+      <w:r>
+        <w:t xml:space="preserve">”</w:t>
+      </w:r>
+      <w:r>
+        <w:t xml:space="preserve">, Reddit/Quora 섹션 분리 표시.</w:t>
+      </w:r>
+      <w:r>
+        <w:t xml:space="preserve"> </w:t>
+      </w:r>
+      <w:r>
+        <w:t xml:space="preserve">Quora RSS 응답 없는 날은</w:t>
+      </w:r>
+      <w:r>
+        <w:t xml:space="preserve"> </w:t>
+      </w:r>
+      <w:r>
+        <w:t xml:space="preserve">“</w:t>
+      </w:r>
+      <w:r>
+        <w:t xml:space="preserve">오늘 새 질문 없음</w:t>
+      </w:r>
+      <w:r>
+        <w:t xml:space="preserve">”</w:t>
+      </w:r>
+      <w:r>
+        <w:t xml:space="preserve">으로 표시. [완료]</w:t>
+      </w:r>
+    </w:p>
+    <w:p>
+      <w:r>
+        <w:pict>
+          <v:rect style="width:0;height:1.5pt" o:hralign="center" o:hrstd="t" o:hr="t"/>
+        </w:pict>
+      </w:r>
+    </w:p>
+    <w:bookmarkEnd w:id="21"/>
+    <w:bookmarkStart w:id="22" w:name="ai-브리핑-블로그-주제-자동-조정-연동"/>
     <w:p>
       <w:pPr>
         <w:pStyle w:val="Heading3"/>
@@ -153,8 +184,8 @@
         </w:pict>
       </w:r>
     </w:p>
-    <w:bookmarkEnd w:id="21"/>
-    <w:bookmarkStart w:id="22" w:name="ai-마케팅-브리핑-자동화-새벽-5시-kst"/>
+    <w:bookmarkEnd w:id="22"/>
+    <w:bookmarkStart w:id="23" w:name="ai-마케팅-브리핑-자동화-새벽-5시-kst"/>
     <w:p>
       <w:pPr>
         <w:pStyle w:val="Heading3"/>
@@ -202,8 +233,8 @@
         </w:pict>
       </w:r>
     </w:p>
-    <w:bookmarkEnd w:id="22"/>
-    <w:bookmarkStart w:id="23" w:name="ga4-일일-리포트-gsc-제거-ga4-전용-v4"/>
+    <w:bookmarkEnd w:id="23"/>
+    <w:bookmarkStart w:id="24" w:name="ga4-일일-리포트-gsc-제거-ga4-전용-v4"/>
     <w:p>
       <w:pPr>
         <w:pStyle w:val="Heading3"/>
@@ -254,8 +285,8 @@
         </w:pict>
       </w:r>
     </w:p>
-    <w:bookmarkEnd w:id="23"/>
-    <w:bookmarkStart w:id="24" w:name="reddit-키워드-모니터링-자동화"/>
+    <w:bookmarkEnd w:id="24"/>
+    <w:bookmarkStart w:id="25" w:name="reddit-키워드-모니터링-자동화"/>
     <w:p>
       <w:pPr>
         <w:pStyle w:val="Heading3"/>
@@ -291,8 +322,8 @@
         </w:pict>
       </w:r>
     </w:p>
-    <w:bookmarkEnd w:id="24"/>
-    <w:bookmarkStart w:id="25" w:name="프로그래매틱-seo-지역별-클리닉-페이지-1512개-생성"/>
+    <w:bookmarkEnd w:id="25"/>
+    <w:bookmarkStart w:id="26" w:name="프로그래매틱-seo-지역별-클리닉-페이지-1512개-생성"/>
     <w:p>
       <w:pPr>
         <w:pStyle w:val="Heading3"/>
@@ -363,8 +394,8 @@
         </w:pict>
       </w:r>
     </w:p>
-    <w:bookmarkEnd w:id="25"/>
-    <w:bookmarkStart w:id="27" w:name="작업-보안안정성-3건-수정-텍스트-리뷰-시스템-추가"/>
+    <w:bookmarkEnd w:id="26"/>
+    <w:bookmarkStart w:id="28" w:name="작업-보안안정성-3건-수정-텍스트-리뷰-시스템-추가"/>
     <w:p>
       <w:pPr>
         <w:pStyle w:val="Heading3"/>
@@ -580,7 +611,7 @@
       <w:r>
         <w:t xml:space="preserve"> </w:t>
       </w:r>
-      <w:hyperlink r:id="rId26">
+      <w:hyperlink r:id="rId27">
         <w:r>
           <w:rPr>
             <w:rStyle w:val="Hyperlink"/>
@@ -599,8 +630,8 @@
         </w:pict>
       </w:r>
     </w:p>
-    <w:bookmarkEnd w:id="27"/>
-    <w:bookmarkStart w:id="28" w:name="커뮤니티-리뷰-별점-시스템-구현"/>
+    <w:bookmarkEnd w:id="28"/>
+    <w:bookmarkStart w:id="29" w:name="커뮤니티-리뷰-별점-시스템-구현"/>
     <w:p>
       <w:pPr>
         <w:pStyle w:val="Heading3"/>
@@ -663,8 +694,8 @@
         </w:pict>
       </w:r>
     </w:p>
-    <w:bookmarkEnd w:id="28"/>
-    <w:bookmarkStart w:id="29" w:name="블로그-소셜-공유-기능-추가"/>
+    <w:bookmarkEnd w:id="29"/>
+    <w:bookmarkStart w:id="30" w:name="블로그-소셜-공유-기능-추가"/>
     <w:p>
       <w:pPr>
         <w:pStyle w:val="Heading3"/>
@@ -706,8 +737,8 @@
         </w:pict>
       </w:r>
     </w:p>
-    <w:bookmarkEnd w:id="29"/>
-    <w:bookmarkStart w:id="30" w:name="google-자동-색인-알림-추가"/>
+    <w:bookmarkEnd w:id="30"/>
+    <w:bookmarkStart w:id="31" w:name="google-자동-색인-알림-추가"/>
     <w:p>
       <w:pPr>
         <w:pStyle w:val="Heading3"/>
@@ -778,8 +809,8 @@
         </w:pict>
       </w:r>
     </w:p>
-    <w:bookmarkEnd w:id="30"/>
-    <w:bookmarkStart w:id="31" w:name="youtube-shorts-자동화-완료"/>
+    <w:bookmarkEnd w:id="31"/>
+    <w:bookmarkStart w:id="32" w:name="youtube-shorts-자동화-완료"/>
     <w:p>
       <w:pPr>
         <w:pStyle w:val="Heading3"/>
@@ -844,8 +875,8 @@
         <w:t xml:space="preserve">- 상태: [완료]</w:t>
       </w:r>
     </w:p>
-    <w:bookmarkEnd w:id="31"/>
-    <w:bookmarkStart w:id="32" w:name="kbbg-웹사이트-관리자-모드-전수-점검"/>
+    <w:bookmarkEnd w:id="32"/>
+    <w:bookmarkStart w:id="33" w:name="kbbg-웹사이트-관리자-모드-전수-점검"/>
     <w:p>
       <w:pPr>
         <w:pStyle w:val="Heading3"/>
@@ -892,8 +923,8 @@
         <w:t xml:space="preserve">- 상태: [완료] (보류 4건 별도 진행)</w:t>
       </w:r>
     </w:p>
-    <w:bookmarkEnd w:id="32"/>
-    <w:bookmarkStart w:id="33" w:name="google-search-console-seo-점검"/>
+    <w:bookmarkEnd w:id="33"/>
+    <w:bookmarkStart w:id="34" w:name="google-search-console-seo-점검"/>
     <w:p>
       <w:pPr>
         <w:pStyle w:val="Heading3"/>
@@ -934,8 +965,8 @@
         <w:t xml:space="preserve">- 상태: [완료]</w:t>
       </w:r>
     </w:p>
-    <w:bookmarkEnd w:id="33"/>
-    <w:bookmarkStart w:id="34" w:name="개-블로그-시스템-딥서치-전수-수정"/>
+    <w:bookmarkEnd w:id="34"/>
+    <w:bookmarkStart w:id="35" w:name="개-블로그-시스템-딥서치-전수-수정"/>
     <w:p>
       <w:pPr>
         <w:pStyle w:val="Heading3"/>
@@ -988,8 +1019,8 @@
         <w:t xml:space="preserve">- 상태: [완료]</w:t>
       </w:r>
     </w:p>
-    <w:bookmarkEnd w:id="34"/>
-    <w:bookmarkStart w:id="35" w:name="kbbg-내부-블로그-다국어-번역-활성화"/>
+    <w:bookmarkEnd w:id="35"/>
+    <w:bookmarkStart w:id="36" w:name="kbbg-내부-블로그-다국어-번역-활성화"/>
     <w:p>
       <w:pPr>
         <w:pStyle w:val="Heading3"/>
@@ -1024,8 +1055,8 @@
         <w:t xml:space="preserve">- 상태: [완료]</w:t>
       </w:r>
     </w:p>
-    <w:bookmarkEnd w:id="35"/>
-    <w:bookmarkStart w:id="36" w:name="외부-블로그-3개-도메인-dns-설정"/>
+    <w:bookmarkEnd w:id="36"/>
+    <w:bookmarkStart w:id="37" w:name="외부-블로그-3개-도메인-dns-설정"/>
     <w:p>
       <w:pPr>
         <w:pStyle w:val="Heading3"/>
@@ -1079,8 +1110,8 @@
         </w:pict>
       </w:r>
     </w:p>
-    <w:bookmarkEnd w:id="36"/>
-    <w:bookmarkStart w:id="37" w:name="미완료-작업-일괄-점검-마케팅-콘텐츠-생성"/>
+    <w:bookmarkEnd w:id="37"/>
+    <w:bookmarkStart w:id="38" w:name="미완료-작업-일괄-점검-마케팅-콘텐츠-생성"/>
     <w:p>
       <w:pPr>
         <w:pStyle w:val="Heading3"/>
@@ -1209,8 +1240,8 @@
         </w:pict>
       </w:r>
     </w:p>
-    <w:bookmarkEnd w:id="37"/>
-    <w:bookmarkStart w:id="38" w:name="내부-블로그-시스템-자동-포스팅-구현"/>
+    <w:bookmarkEnd w:id="38"/>
+    <w:bookmarkStart w:id="39" w:name="내부-블로그-시스템-자동-포스팅-구현"/>
     <w:p>
       <w:pPr>
         <w:pStyle w:val="Heading3"/>
@@ -1312,8 +1343,8 @@
         </w:pict>
       </w:r>
     </w:p>
-    <w:bookmarkEnd w:id="38"/>
-    <w:bookmarkStart w:id="39" w:name="프로그래매틱-seo-페이지-229개-자동-생성"/>
+    <w:bookmarkEnd w:id="39"/>
+    <w:bookmarkStart w:id="40" w:name="프로그래매틱-seo-페이지-229개-자동-생성"/>
     <w:p>
       <w:pPr>
         <w:pStyle w:val="Heading3"/>
@@ -1400,8 +1431,8 @@
         </w:pict>
       </w:r>
     </w:p>
-    <w:bookmarkEnd w:id="39"/>
-    <w:bookmarkStart w:id="40" w:name="ai-추천-결과-공유-기능-추가"/>
+    <w:bookmarkEnd w:id="40"/>
+    <w:bookmarkStart w:id="41" w:name="ai-추천-결과-공유-기능-추가"/>
     <w:p>
       <w:pPr>
         <w:pStyle w:val="Heading3"/>
@@ -1449,8 +1480,8 @@
         </w:pict>
       </w:r>
     </w:p>
-    <w:bookmarkEnd w:id="40"/>
-    <w:bookmarkStart w:id="41" w:name="보안-강화-및-코드-품질-개선"/>
+    <w:bookmarkEnd w:id="41"/>
+    <w:bookmarkStart w:id="42" w:name="보안-강화-및-코드-품질-개선"/>
     <w:p>
       <w:pPr>
         <w:pStyle w:val="Heading3"/>
@@ -1522,8 +1553,8 @@
         </w:pict>
       </w:r>
     </w:p>
-    <w:bookmarkEnd w:id="41"/>
-    <w:bookmarkStart w:id="42" w:name="ai-재점검-하드코딩-잔여-7건-수정"/>
+    <w:bookmarkEnd w:id="42"/>
+    <w:bookmarkStart w:id="43" w:name="ai-재점검-하드코딩-잔여-7건-수정"/>
     <w:p>
       <w:pPr>
         <w:pStyle w:val="Heading3"/>
@@ -1582,8 +1613,8 @@
         <w:t xml:space="preserve">- 상태: [완료]</w:t>
       </w:r>
     </w:p>
-    <w:bookmarkEnd w:id="42"/>
-    <w:bookmarkStart w:id="43" w:name="ai-딥서치-보안seo아키텍처-전면-점검-및-수정"/>
+    <w:bookmarkEnd w:id="43"/>
+    <w:bookmarkStart w:id="44" w:name="ai-딥서치-보안seo아키텍처-전면-점검-및-수정"/>
     <w:p>
       <w:pPr>
         <w:pStyle w:val="Heading3"/>
@@ -1655,8 +1686,8 @@
         </w:pict>
       </w:r>
     </w:p>
-    <w:bookmarkEnd w:id="43"/>
-    <w:bookmarkStart w:id="44" w:name="외국인-유저-추가-이슈-일괄-수정-ccg-점검-2차"/>
+    <w:bookmarkEnd w:id="44"/>
+    <w:bookmarkStart w:id="45" w:name="외국인-유저-추가-이슈-일괄-수정-ccg-점검-2차"/>
     <w:p>
       <w:pPr>
         <w:pStyle w:val="Heading3"/>
@@ -1722,8 +1753,8 @@
         </w:pict>
       </w:r>
     </w:p>
-    <w:bookmarkEnd w:id="44"/>
-    <w:bookmarkStart w:id="45" w:name="외국인-유저-글쓰기-다국어-완전-점검-및-수정"/>
+    <w:bookmarkEnd w:id="45"/>
+    <w:bookmarkStart w:id="46" w:name="외국인-유저-글쓰기-다국어-완전-점검-및-수정"/>
     <w:p>
       <w:pPr>
         <w:pStyle w:val="Heading3"/>
@@ -1789,8 +1820,8 @@
         </w:pict>
       </w:r>
     </w:p>
-    <w:bookmarkEnd w:id="45"/>
-    <w:bookmarkStart w:id="46" w:name="검색-연결-버그-수정-사이트-점검-기능-관리자-구글-로그인"/>
+    <w:bookmarkEnd w:id="46"/>
+    <w:bookmarkStart w:id="47" w:name="검색-연결-버그-수정-사이트-점검-기능-관리자-구글-로그인"/>
     <w:p>
       <w:pPr>
         <w:pStyle w:val="Heading3"/>
@@ -1960,8 +1991,8 @@
         </w:pict>
       </w:r>
     </w:p>
-    <w:bookmarkEnd w:id="46"/>
-    <w:bookmarkStart w:id="47" w:name="데이터-동기화-수정-ai-검색-최소-10건-보장"/>
+    <w:bookmarkEnd w:id="47"/>
+    <w:bookmarkStart w:id="48" w:name="데이터-동기화-수정-ai-검색-최소-10건-보장"/>
     <w:p>
       <w:pPr>
         <w:pStyle w:val="Heading3"/>
@@ -2083,8 +2114,8 @@
         </w:pict>
       </w:r>
     </w:p>
-    <w:bookmarkEnd w:id="47"/>
-    <w:bookmarkStart w:id="48" w:name="관리자-패널-전면-개편-13단계-ai-검색-최적화"/>
+    <w:bookmarkEnd w:id="48"/>
+    <w:bookmarkStart w:id="49" w:name="관리자-패널-전면-개편-13단계-ai-검색-최적화"/>
     <w:p>
       <w:pPr>
         <w:pStyle w:val="Heading3"/>
@@ -2254,8 +2285,8 @@
         </w:pict>
       </w:r>
     </w:p>
-    <w:bookmarkEnd w:id="48"/>
-    <w:bookmarkStart w:id="49" w:name="화장품-순위-자동-수집-cron-구축"/>
+    <w:bookmarkEnd w:id="49"/>
+    <w:bookmarkStart w:id="50" w:name="화장품-순위-자동-수집-cron-구축"/>
     <w:p>
       <w:pPr>
         <w:pStyle w:val="Heading3"/>
@@ -2335,8 +2366,8 @@
         </w:pict>
       </w:r>
     </w:p>
-    <w:bookmarkEnd w:id="49"/>
-    <w:bookmarkStart w:id="50" w:name="highmedium-이슈-22건-일괄-수정"/>
+    <w:bookmarkEnd w:id="50"/>
+    <w:bookmarkStart w:id="51" w:name="highmedium-이슈-22건-일괄-수정"/>
     <w:p>
       <w:pPr>
         <w:pStyle w:val="Heading3"/>
@@ -2425,8 +2456,8 @@
         </w:pict>
       </w:r>
     </w:p>
-    <w:bookmarkEnd w:id="50"/>
-    <w:bookmarkStart w:id="51" w:name="ccg-3-ai-전체-기능-점검-critical-이슈-6건-수정"/>
+    <w:bookmarkEnd w:id="51"/>
+    <w:bookmarkStart w:id="52" w:name="ccg-3-ai-전체-기능-점검-critical-이슈-6건-수정"/>
     <w:p>
       <w:pPr>
         <w:pStyle w:val="Heading3"/>
@@ -4599,8 +4630,8 @@
         <w:t xml:space="preserve">- README.md 8개국 언어, 프로젝트 구조 현행화</w:t>
       </w:r>
     </w:p>
-    <w:bookmarkEnd w:id="51"/>
     <w:bookmarkEnd w:id="52"/>
+    <w:bookmarkEnd w:id="53"/>
     <w:sectPr/>
   </w:body>
 </w:document>

</xml_diff>